<commit_message>
Fix NIW posterior degrees of freedom
Co-authored-by: Otajon Yuldashev <OXT6655@users.noreply.github.com>
</commit_message>
<xml_diff>
--- a/bvar_final_report.docx
+++ b/bvar_final_report.docx
@@ -387,7 +387,7 @@
         <w:rPr>
           <w:color w:val="595959"/>
         </w:rPr>
-        <w:t xml:space="preserve">2) to answer a simple question: how does an unexpected tightening of monetary conditions transmit to CPI inflation and the PLN/EUR exchange rate over the following 36 months? The Bayesian approach is suited because the sample (183 observations) is moderate relative to the 63 free coefficients, all three series exhibit near-unit-root </w:t>
+        <w:t xml:space="preserve">2) to answer a simple question: how does an unexpected tightening of monetary conditions transmit to CPI inflation and the PLN/EUR exchange rate over the following 36 months? The Bayesian approach is suited because the sample (183 observations) is moderate relative to the number of dynamic parameters and covariance terms, all three series exhibit near-unit-root </w:t>
       </w:r>
       <w:proofErr w:type="spellStart"/>
       <w:r>
@@ -4297,7 +4297,7 @@
         <w:rPr>
           <w:color w:val="595959"/>
         </w:rPr>
-        <w:t xml:space="preserve"> = ν₀ + T. Draw Σ ~ </w:t>
+        <w:t xml:space="preserve"> = ν₀ + T + k. Draw Σ ~ </w:t>
       </w:r>
       <w:proofErr w:type="gramStart"/>
       <w:r>

</xml_diff>

<commit_message>
Fix BVAR NIW degrees of freedom
Co-authored-by: Otajon Yuldashev <OXT6655@users.noreply.github.com>
</commit_message>
<xml_diff>
--- a/bvar_final_report.docx
+++ b/bvar_final_report.docx
@@ -1,8 +1,8 @@
 
 <file path=word/document.xml><?xml version="1.0" encoding="utf-8"?>
-<w:document xmlns:wpc="http://schemas.microsoft.com/office/word/2010/wordprocessingCanvas" xmlns:cx="http://schemas.microsoft.com/office/drawing/2014/chartex" xmlns:cx1="http://schemas.microsoft.com/office/drawing/2015/9/8/chartex" xmlns:cx2="http://schemas.microsoft.com/office/drawing/2015/10/21/chartex" xmlns:cx3="http://schemas.microsoft.com/office/drawing/2016/5/9/chartex" xmlns:cx4="http://schemas.microsoft.com/office/drawing/2016/5/10/chartex" xmlns:cx5="http://schemas.microsoft.com/office/drawing/2016/5/11/chartex" xmlns:cx6="http://schemas.microsoft.com/office/drawing/2016/5/12/chartex" xmlns:cx7="http://schemas.microsoft.com/office/drawing/2016/5/13/chartex" xmlns:cx8="http://schemas.microsoft.com/office/drawing/2016/5/14/chartex" xmlns:mc="http://schemas.openxmlformats.org/markup-compatibility/2006" xmlns:aink="http://schemas.microsoft.com/office/drawing/2016/ink" xmlns:am3d="http://schemas.microsoft.com/office/drawing/2017/model3d" xmlns:o="urn:schemas-microsoft-com:office:office" xmlns:oel="http://schemas.microsoft.com/office/2019/extlst" xmlns:r="http://schemas.openxmlformats.org/officeDocument/2006/relationships" xmlns:m="http://schemas.openxmlformats.org/officeDocument/2006/math" xmlns:v="urn:schemas-microsoft-com:vml" xmlns:wp14="http://schemas.microsoft.com/office/word/2010/wordprocessingDrawing" xmlns:wp="http://schemas.openxmlformats.org/drawingml/2006/wordprocessingDrawing" xmlns:w10="urn:schemas-microsoft-com:office:word" xmlns:w="http://schemas.openxmlformats.org/wordprocessingml/2006/main" xmlns:w14="http://schemas.microsoft.com/office/word/2010/wordml" xmlns:w15="http://schemas.microsoft.com/office/word/2012/wordml" xmlns:w16cex="http://schemas.microsoft.com/office/word/2018/wordml/cex" xmlns:w16cid="http://schemas.microsoft.com/office/word/2016/wordml/cid" xmlns:w16="http://schemas.microsoft.com/office/word/2018/wordml" xmlns:w16du="http://schemas.microsoft.com/office/word/2023/wordml/word16du" xmlns:w16sdtdh="http://schemas.microsoft.com/office/word/2020/wordml/sdtdatahash" xmlns:w16sdtfl="http://schemas.microsoft.com/office/word/2024/wordml/sdtformatlock" xmlns:w16se="http://schemas.microsoft.com/office/word/2015/wordml/symex" xmlns:wpg="http://schemas.microsoft.com/office/word/2010/wordprocessingGroup" xmlns:wpi="http://schemas.microsoft.com/office/word/2010/wordprocessingInk" xmlns:wne="http://schemas.microsoft.com/office/word/2006/wordml" xmlns:wps="http://schemas.microsoft.com/office/word/2010/wordprocessingShape" mc:Ignorable="w14 w15 w16se w16cid w16 w16cex w16sdtdh w16sdtfl w16du wp14">
+<w:document xmlns:ns1="http://schemas.openxmlformats.org/markup-compatibility/2006" xmlns:ns2="http://schemas.microsoft.com/office/word/2010/wordml" xmlns:ns3="http://schemas.openxmlformats.org/drawingml/2006/wordprocessingDrawing" xmlns:ns4="http://schemas.microsoft.com/office/word/2010/wordprocessingDrawing" xmlns:ns5="http://schemas.openxmlformats.org/drawingml/2006/main" xmlns:ns6="http://schemas.openxmlformats.org/drawingml/2006/picture" xmlns:ns7="http://schemas.openxmlformats.org/officeDocument/2006/relationships" xmlns:w="http://schemas.openxmlformats.org/wordprocessingml/2006/main" ns1:Ignorable="w14 w15 w16se w16cid w16 w16cex w16sdtdh w16sdtfl w16du wp14">
   <w:body>
-    <w:p>
+    <w:p ns2:paraId="6CC2C6FE" ns2:textId="77777777">
       <w:pPr>
         <w:spacing w:before="900" w:after="160"/>
         <w:jc w:val="center"/>
@@ -18,7 +18,7 @@
         <w:t>Monetary Policy Transmission in Poland:</w:t>
       </w:r>
     </w:p>
-    <w:p>
+    <w:p ns2:paraId="0758E168" ns2:textId="77777777">
       <w:pPr>
         <w:spacing w:after="160"/>
         <w:jc w:val="center"/>
@@ -34,7 +34,7 @@
         <w:t>A Bayesian VAR Analysis with Identification</w:t>
       </w:r>
     </w:p>
-    <w:p>
+    <w:p ns2:paraId="77CC123E" ns2:textId="77777777">
       <w:pPr>
         <w:spacing w:after="160"/>
         <w:jc w:val="center"/>
@@ -50,12 +50,12 @@
         <w:t>and Robustness Analysis, 2010–2025</w:t>
       </w:r>
     </w:p>
-    <w:p>
+    <w:p ns2:paraId="6AE4CEF4" ns2:textId="77777777">
       <w:pPr>
         <w:spacing w:after="80"/>
       </w:pPr>
     </w:p>
-    <w:p>
+    <w:p ns2:paraId="66E45F59" ns2:textId="77777777">
       <w:pPr>
         <w:spacing w:after="120"/>
         <w:jc w:val="center"/>
@@ -69,7 +69,7 @@
         <w:t>Bayesian Time-Series Econometrics — WNE, University of Warsaw</w:t>
       </w:r>
     </w:p>
-    <w:p>
+    <w:p ns2:paraId="622ACB25" ns2:textId="77777777">
       <w:pPr>
         <w:spacing w:after="80"/>
         <w:jc w:val="center"/>
@@ -81,7 +81,7 @@
         <w:t>Instructor: Prof. Andrzej Kocięcki</w:t>
       </w:r>
     </w:p>
-    <w:p>
+    <w:p ns2:paraId="1EC04746" ns2:textId="170F5F7A">
       <w:pPr>
         <w:spacing w:after="80"/>
         <w:jc w:val="center"/>
@@ -99,7 +99,7 @@
         <w:t xml:space="preserve"> 473457</w:t>
       </w:r>
     </w:p>
-    <w:p>
+    <w:p ns2:paraId="517B136F" ns2:textId="77777777">
       <w:pPr>
         <w:spacing w:after="80"/>
         <w:jc w:val="center"/>
@@ -111,7 +111,7 @@
         <w:t>Warsaw, May 2026</w:t>
       </w:r>
     </w:p>
-    <w:p>
+    <w:p ns2:paraId="79A55C57" ns2:textId="77777777">
       <w:pPr>
         <w:pBdr>
           <w:bottom w:val="single" w:sz="6" w:space="1" w:color="2E75B6"/>
@@ -119,17 +119,17 @@
         <w:spacing w:after="120"/>
       </w:pPr>
     </w:p>
-    <w:p>
+    <w:p ns2:paraId="57D47FB2" ns2:textId="77777777">
       <w:pPr>
         <w:spacing w:after="160"/>
       </w:pPr>
     </w:p>
-    <w:p>
+    <w:p ns2:paraId="0E33C6E1" ns2:textId="77777777">
       <w:r>
         <w:br w:type="page"/>
       </w:r>
     </w:p>
-    <w:p>
+    <w:p ns2:paraId="736158D6" ns2:textId="77777777">
       <w:pPr>
         <w:pStyle w:val="Heading1"/>
       </w:pPr>
@@ -138,7 +138,7 @@
         <w:t>Data Sources</w:t>
       </w:r>
     </w:p>
-    <w:p>
+    <w:p ns2:paraId="789A054C" ns2:textId="77777777">
       <w:pPr>
         <w:spacing w:after="100"/>
         <w:jc w:val="both"/>
@@ -172,7 +172,7 @@
         <w:t xml:space="preserve"> / CPI_{t−12} − 1) × 100.</w:t>
       </w:r>
     </w:p>
-    <w:p>
+    <w:p ns2:paraId="47CA22AE" ns2:textId="77777777">
       <w:pPr>
         <w:spacing w:after="100"/>
         <w:jc w:val="both"/>
@@ -192,7 +192,7 @@
         <w:t>OECD Short-Term Interest Rate for Poland (IRSTCI01PLM156N, % per annum). Downloaded from FRED. This series measures monthly interbank/money-market rates and tracks NBP reference rate decisions throughout the sample.</w:t>
       </w:r>
     </w:p>
-    <w:p>
+    <w:p ns2:paraId="30A1409B" ns2:textId="77777777">
       <w:pPr>
         <w:spacing w:after="100"/>
         <w:jc w:val="both"/>
@@ -226,7 +226,7 @@
         <w:t>). Downloaded from ECB Data Portal.</w:t>
       </w:r>
     </w:p>
-    <w:p>
+    <w:p ns2:paraId="35385A84" ns2:textId="77777777">
       <w:pPr>
         <w:spacing w:after="100"/>
         <w:jc w:val="both"/>
@@ -246,17 +246,17 @@
         <w:t>January 2010 – March 2025 (183 monthly observations, no missing values).</w:t>
       </w:r>
     </w:p>
-    <w:p>
+    <w:p ns2:paraId="4DF55C7C" ns2:textId="77777777">
       <w:pPr>
         <w:spacing w:after="80"/>
       </w:pPr>
     </w:p>
-    <w:p>
+    <w:p ns2:paraId="58E9D56A" ns2:textId="77777777">
       <w:r>
         <w:br w:type="page"/>
       </w:r>
     </w:p>
-    <w:p>
+    <w:p ns2:paraId="1DAD3194" ns2:textId="77777777">
       <w:pPr>
         <w:pStyle w:val="Heading1"/>
       </w:pPr>
@@ -265,7 +265,7 @@
         <w:t>Abstract</w:t>
       </w:r>
     </w:p>
-    <w:p>
+    <w:p ns2:paraId="1853CE17" ns2:textId="77777777">
       <w:pPr>
         <w:spacing w:after="100"/>
         <w:jc w:val="both"/>
@@ -319,17 +319,17 @@
         <w:t xml:space="preserve"> Z| &lt; 1.96).</w:t>
       </w:r>
     </w:p>
-    <w:p>
+    <w:p ns2:paraId="6215FB3B" ns2:textId="77777777">
       <w:pPr>
         <w:spacing w:after="80"/>
       </w:pPr>
     </w:p>
-    <w:p>
+    <w:p ns2:paraId="0053ED17" ns2:textId="77777777">
       <w:r>
         <w:br w:type="page"/>
       </w:r>
     </w:p>
-    <w:p>
+    <w:p ns2:paraId="2EBB38FD" ns2:textId="77777777">
       <w:pPr>
         <w:pStyle w:val="Heading1"/>
       </w:pPr>
@@ -338,7 +338,7 @@
         <w:t>1. Introduction</w:t>
       </w:r>
     </w:p>
-    <w:p>
+    <w:p ns2:paraId="5F860D23" ns2:textId="77777777">
       <w:pPr>
         <w:spacing w:after="100"/>
         <w:jc w:val="both"/>
@@ -364,7 +364,7 @@
         <w:t xml:space="preserve"> at 3.75–4.75% (2010–2012); extended easing to 1.75% and near-deflation (2013–2020); emergency COVID cuts to 0.10% followed by the fastest tightening cycle in NBP history, from 0.10% to 6.79% in twelve months (2021–2022); and a disinflation phase as CPI fell from 19.2% in early 2023 back toward 5% by 2025.</w:t>
       </w:r>
     </w:p>
-    <w:p>
+    <w:p ns2:paraId="34B2EE07" ns2:textId="77777777">
       <w:pPr>
         <w:spacing w:after="100"/>
         <w:jc w:val="both"/>
@@ -387,7 +387,7 @@
         <w:rPr>
           <w:color w:val="595959"/>
         </w:rPr>
-        <w:t xml:space="preserve">2) to answer a simple question: how does an unexpected tightening of monetary conditions transmit to CPI inflation and the PLN/EUR exchange rate over the following 36 months? The Bayesian approach is suited because the sample (183 observations) is moderate relative to the 63 free coefficients, all three series exhibit near-unit-root </w:t>
+        <w:t xml:space="preserve">2) to answer a simple question: how does an unexpected tightening of monetary conditions transmit to CPI inflation and the PLN/EUR exchange rate over the following 36 months? The Bayesian approach is suited because the sample (183 observations) is moderate relative to the number of dynamic parameters and covariance terms, all three series exhibit near-unit-root </w:t>
       </w:r>
       <w:proofErr w:type="spellStart"/>
       <w:r>
@@ -404,7 +404,7 @@
         <w:t>, and the extreme 2021–2023 episode creates high-leverage observations.</w:t>
       </w:r>
     </w:p>
-    <w:p>
+    <w:p ns2:paraId="4F62551D" ns2:textId="77777777">
       <w:pPr>
         <w:spacing w:after="100"/>
         <w:jc w:val="both"/>
@@ -438,12 +438,12 @@
         <w:t xml:space="preserve"> the covariance structure. The resulting NIW posterior is analytically tractable, enabling exact Gibbs sampling without Metropolis steps. All sampling code is written from scratch.</w:t>
       </w:r>
     </w:p>
-    <w:p>
+    <w:p ns2:paraId="0A6819D2" ns2:textId="77777777">
       <w:r>
         <w:br w:type="page"/>
       </w:r>
     </w:p>
-    <w:p>
+    <w:p ns2:paraId="56B3506C" ns2:textId="77777777">
       <w:pPr>
         <w:pStyle w:val="Heading1"/>
       </w:pPr>
@@ -452,7 +452,7 @@
         <w:t>2. Data</w:t>
       </w:r>
     </w:p>
-    <w:p>
+    <w:p ns2:paraId="382135D9" ns2:textId="77777777">
       <w:pPr>
         <w:pStyle w:val="Heading2"/>
         <w:spacing w:before="340" w:after="120"/>
@@ -487,7 +487,7 @@
         <w:gridCol w:w="1170"/>
         <w:gridCol w:w="1010"/>
       </w:tblGrid>
-      <w:tr>
+      <w:tr ns2:paraId="005D86A6" ns2:textId="77777777">
         <w:tblPrEx>
           <w:tblCellMar>
             <w:top w:w="0" w:type="dxa"/>
@@ -512,7 +512,7 @@
             </w:tcMar>
             <w:vAlign w:val="center"/>
           </w:tcPr>
-          <w:p>
+          <w:p ns2:paraId="6D1B8DE9" ns2:textId="77777777">
             <w:r>
               <w:rPr>
                 <w:b/>
@@ -543,7 +543,7 @@
             </w:tcMar>
             <w:vAlign w:val="center"/>
           </w:tcPr>
-          <w:p>
+          <w:p ns2:paraId="552019CE" ns2:textId="77777777">
             <w:r>
               <w:rPr>
                 <w:b/>
@@ -574,7 +574,7 @@
             </w:tcMar>
             <w:vAlign w:val="center"/>
           </w:tcPr>
-          <w:p>
+          <w:p ns2:paraId="4B8ADEE8" ns2:textId="77777777">
             <w:r>
               <w:rPr>
                 <w:b/>
@@ -605,7 +605,7 @@
             </w:tcMar>
             <w:vAlign w:val="center"/>
           </w:tcPr>
-          <w:p>
+          <w:p ns2:paraId="299659C7" ns2:textId="77777777">
             <w:r>
               <w:rPr>
                 <w:b/>
@@ -636,7 +636,7 @@
             </w:tcMar>
             <w:vAlign w:val="center"/>
           </w:tcPr>
-          <w:p>
+          <w:p ns2:paraId="07FEE590" ns2:textId="77777777">
             <w:r>
               <w:rPr>
                 <w:b/>
@@ -667,7 +667,7 @@
             </w:tcMar>
             <w:vAlign w:val="center"/>
           </w:tcPr>
-          <w:p>
+          <w:p ns2:paraId="58B9769D" ns2:textId="77777777">
             <w:r>
               <w:rPr>
                 <w:b/>
@@ -698,7 +698,7 @@
             </w:tcMar>
             <w:vAlign w:val="center"/>
           </w:tcPr>
-          <w:p>
+          <w:p ns2:paraId="5E0852CE" ns2:textId="77777777">
             <w:r>
               <w:rPr>
                 <w:b/>
@@ -712,7 +712,7 @@
           </w:p>
         </w:tc>
       </w:tr>
-      <w:tr>
+      <w:tr ns2:paraId="482EAC8C" ns2:textId="77777777">
         <w:tblPrEx>
           <w:tblCellMar>
             <w:top w:w="0" w:type="dxa"/>
@@ -737,7 +737,7 @@
             </w:tcMar>
             <w:vAlign w:val="center"/>
           </w:tcPr>
-          <w:p>
+          <w:p ns2:paraId="1F0351AB" ns2:textId="77777777">
             <w:r>
               <w:rPr>
                 <w:color w:val="595959"/>
@@ -765,7 +765,7 @@
             </w:tcMar>
             <w:vAlign w:val="center"/>
           </w:tcPr>
-          <w:p>
+          <w:p ns2:paraId="5D60CBE9" ns2:textId="77777777">
             <w:pPr>
               <w:jc w:val="right"/>
             </w:pPr>
@@ -796,7 +796,7 @@
             </w:tcMar>
             <w:vAlign w:val="center"/>
           </w:tcPr>
-          <w:p>
+          <w:p ns2:paraId="657B9A1C" ns2:textId="77777777">
             <w:pPr>
               <w:jc w:val="right"/>
             </w:pPr>
@@ -827,7 +827,7 @@
             </w:tcMar>
             <w:vAlign w:val="center"/>
           </w:tcPr>
-          <w:p>
+          <w:p ns2:paraId="51D416A9" ns2:textId="77777777">
             <w:pPr>
               <w:jc w:val="right"/>
             </w:pPr>
@@ -858,7 +858,7 @@
             </w:tcMar>
             <w:vAlign w:val="center"/>
           </w:tcPr>
-          <w:p>
+          <w:p ns2:paraId="50764036" ns2:textId="77777777">
             <w:pPr>
               <w:jc w:val="right"/>
             </w:pPr>
@@ -889,7 +889,7 @@
             </w:tcMar>
             <w:vAlign w:val="center"/>
           </w:tcPr>
-          <w:p>
+          <w:p ns2:paraId="638A4A41" ns2:textId="77777777">
             <w:pPr>
               <w:jc w:val="right"/>
             </w:pPr>
@@ -920,7 +920,7 @@
             </w:tcMar>
             <w:vAlign w:val="center"/>
           </w:tcPr>
-          <w:p>
+          <w:p ns2:paraId="4B4F9C5E" ns2:textId="77777777">
             <w:pPr>
               <w:jc w:val="right"/>
             </w:pPr>
@@ -935,7 +935,7 @@
           </w:p>
         </w:tc>
       </w:tr>
-      <w:tr>
+      <w:tr ns2:paraId="170CDF82" ns2:textId="77777777">
         <w:tblPrEx>
           <w:tblCellMar>
             <w:top w:w="0" w:type="dxa"/>
@@ -960,7 +960,7 @@
             </w:tcMar>
             <w:vAlign w:val="center"/>
           </w:tcPr>
-          <w:p>
+          <w:p ns2:paraId="419E4E00" ns2:textId="77777777">
             <w:r>
               <w:rPr>
                 <w:color w:val="595959"/>
@@ -988,7 +988,7 @@
             </w:tcMar>
             <w:vAlign w:val="center"/>
           </w:tcPr>
-          <w:p>
+          <w:p ns2:paraId="7123395A" ns2:textId="77777777">
             <w:pPr>
               <w:jc w:val="right"/>
             </w:pPr>
@@ -1019,7 +1019,7 @@
             </w:tcMar>
             <w:vAlign w:val="center"/>
           </w:tcPr>
-          <w:p>
+          <w:p ns2:paraId="6F5C2C5A" ns2:textId="77777777">
             <w:pPr>
               <w:jc w:val="right"/>
             </w:pPr>
@@ -1050,7 +1050,7 @@
             </w:tcMar>
             <w:vAlign w:val="center"/>
           </w:tcPr>
-          <w:p>
+          <w:p ns2:paraId="3E1E5FDF" ns2:textId="77777777">
             <w:pPr>
               <w:jc w:val="right"/>
             </w:pPr>
@@ -1081,7 +1081,7 @@
             </w:tcMar>
             <w:vAlign w:val="center"/>
           </w:tcPr>
-          <w:p>
+          <w:p ns2:paraId="2E50CC7F" ns2:textId="77777777">
             <w:pPr>
               <w:jc w:val="right"/>
             </w:pPr>
@@ -1112,7 +1112,7 @@
             </w:tcMar>
             <w:vAlign w:val="center"/>
           </w:tcPr>
-          <w:p>
+          <w:p ns2:paraId="6CC1FFD9" ns2:textId="77777777">
             <w:pPr>
               <w:jc w:val="right"/>
             </w:pPr>
@@ -1143,7 +1143,7 @@
             </w:tcMar>
             <w:vAlign w:val="center"/>
           </w:tcPr>
-          <w:p>
+          <w:p ns2:paraId="69810E42" ns2:textId="77777777">
             <w:pPr>
               <w:jc w:val="right"/>
             </w:pPr>
@@ -1158,7 +1158,7 @@
           </w:p>
         </w:tc>
       </w:tr>
-      <w:tr>
+      <w:tr ns2:paraId="0B195B55" ns2:textId="77777777">
         <w:tblPrEx>
           <w:tblCellMar>
             <w:top w:w="0" w:type="dxa"/>
@@ -1183,7 +1183,7 @@
             </w:tcMar>
             <w:vAlign w:val="center"/>
           </w:tcPr>
-          <w:p>
+          <w:p ns2:paraId="63E7366C" ns2:textId="77777777">
             <w:r>
               <w:rPr>
                 <w:color w:val="595959"/>
@@ -1211,7 +1211,7 @@
             </w:tcMar>
             <w:vAlign w:val="center"/>
           </w:tcPr>
-          <w:p>
+          <w:p ns2:paraId="381FAFEA" ns2:textId="77777777">
             <w:pPr>
               <w:jc w:val="right"/>
             </w:pPr>
@@ -1242,7 +1242,7 @@
             </w:tcMar>
             <w:vAlign w:val="center"/>
           </w:tcPr>
-          <w:p>
+          <w:p ns2:paraId="32AC8651" ns2:textId="77777777">
             <w:pPr>
               <w:jc w:val="right"/>
             </w:pPr>
@@ -1273,7 +1273,7 @@
             </w:tcMar>
             <w:vAlign w:val="center"/>
           </w:tcPr>
-          <w:p>
+          <w:p ns2:paraId="1FA990E4" ns2:textId="77777777">
             <w:pPr>
               <w:jc w:val="right"/>
             </w:pPr>
@@ -1304,7 +1304,7 @@
             </w:tcMar>
             <w:vAlign w:val="center"/>
           </w:tcPr>
-          <w:p>
+          <w:p ns2:paraId="47284EE6" ns2:textId="77777777">
             <w:pPr>
               <w:jc w:val="right"/>
             </w:pPr>
@@ -1335,7 +1335,7 @@
             </w:tcMar>
             <w:vAlign w:val="center"/>
           </w:tcPr>
-          <w:p>
+          <w:p ns2:paraId="70679FC0" ns2:textId="77777777">
             <w:pPr>
               <w:jc w:val="right"/>
             </w:pPr>
@@ -1366,7 +1366,7 @@
             </w:tcMar>
             <w:vAlign w:val="center"/>
           </w:tcPr>
-          <w:p>
+          <w:p ns2:paraId="52686C8E" ns2:textId="77777777">
             <w:pPr>
               <w:jc w:val="right"/>
             </w:pPr>
@@ -1382,7 +1382,7 @@
         </w:tc>
       </w:tr>
     </w:tbl>
-    <w:p>
+    <w:p ns2:paraId="66D173E3" ns2:textId="77777777">
       <w:pPr>
         <w:spacing w:after="180"/>
         <w:jc w:val="center"/>
@@ -1394,7 +1394,7 @@
         <w:t>Table 1: Descriptive statistics (N=183). From actual console output.</w:t>
       </w:r>
     </w:p>
-    <w:p>
+    <w:p ns2:paraId="0C57CB85" ns2:textId="77777777">
       <w:pPr>
         <w:spacing w:before="140" w:after="60"/>
         <w:jc w:val="center"/>
@@ -1404,46 +1404,46 @@
           <w:noProof/>
         </w:rPr>
         <w:drawing>
-          <wp:inline distT="0" distB="0" distL="0" distR="0" wp14:anchorId="1EDB3C71" wp14:editId="5BAA721F">
-            <wp:extent cx="5943600" cy="3200400"/>
-            <wp:effectExtent l="0" t="0" r="0" b="0"/>
-            <wp:docPr id="1" name="Picture 1"/>
-            <wp:cNvGraphicFramePr>
-              <a:graphicFrameLocks xmlns:a="http://schemas.openxmlformats.org/drawingml/2006/main" noChangeAspect="1"/>
-            </wp:cNvGraphicFramePr>
-            <a:graphic xmlns:a="http://schemas.openxmlformats.org/drawingml/2006/main">
-              <a:graphicData uri="http://schemas.openxmlformats.org/drawingml/2006/picture">
-                <pic:pic xmlns:pic="http://schemas.openxmlformats.org/drawingml/2006/picture">
-                  <pic:nvPicPr>
-                    <pic:cNvPr id="0" name=""/>
-                    <pic:cNvPicPr>
-                      <a:picLocks noChangeAspect="1" noChangeArrowheads="1"/>
-                    </pic:cNvPicPr>
-                  </pic:nvPicPr>
-                  <pic:blipFill>
-                    <a:blip r:embed="rId7"/>
-                    <a:srcRect/>
-                    <a:stretch>
-                      <a:fillRect/>
-                    </a:stretch>
-                  </pic:blipFill>
-                  <pic:spPr bwMode="auto">
-                    <a:xfrm>
-                      <a:off x="0" y="0"/>
-                      <a:ext cx="5943600" cy="3200400"/>
-                    </a:xfrm>
-                    <a:prstGeom prst="rect">
-                      <a:avLst/>
-                    </a:prstGeom>
-                  </pic:spPr>
-                </pic:pic>
-              </a:graphicData>
-            </a:graphic>
-          </wp:inline>
+          <ns3:inline distT="0" distB="0" distL="0" distR="0" ns4:anchorId="1EDB3C71" ns4:editId="5BAA721F">
+            <ns3:extent cx="5943600" cy="3200400"/>
+            <ns3:effectExtent l="0" t="0" r="0" b="0"/>
+            <ns3:docPr id="1" name="Picture 1"/>
+            <ns3:cNvGraphicFramePr>
+              <ns5:graphicFrameLocks noChangeAspect="1"/>
+            </ns3:cNvGraphicFramePr>
+            <ns5:graphic>
+              <ns5:graphicData uri="http://schemas.openxmlformats.org/drawingml/2006/picture">
+                <ns6:pic>
+                  <ns6:nvPicPr>
+                    <ns6:cNvPr id="0" name=""/>
+                    <ns6:cNvPicPr>
+                      <ns5:picLocks noChangeAspect="1" noChangeArrowheads="1"/>
+                    </ns6:cNvPicPr>
+                  </ns6:nvPicPr>
+                  <ns6:blipFill>
+                    <ns5:blip ns7:embed="rId7"/>
+                    <ns5:srcRect/>
+                    <ns5:stretch>
+                      <ns5:fillRect/>
+                    </ns5:stretch>
+                  </ns6:blipFill>
+                  <ns6:spPr bwMode="auto">
+                    <ns5:xfrm>
+                      <ns5:off x="0" y="0"/>
+                      <ns5:ext cx="5943600" cy="3200400"/>
+                    </ns5:xfrm>
+                    <ns5:prstGeom prst="rect">
+                      <ns5:avLst/>
+                    </ns5:prstGeom>
+                  </ns6:spPr>
+                </ns6:pic>
+              </ns5:graphicData>
+            </ns5:graphic>
+          </ns3:inline>
         </w:drawing>
       </w:r>
     </w:p>
-    <w:p>
+    <w:p ns2:paraId="1F27710E" ns2:textId="77777777">
       <w:pPr>
         <w:spacing w:after="160"/>
         <w:jc w:val="center"/>
@@ -1469,7 +1469,7 @@
         <w:t>).</w:t>
       </w:r>
     </w:p>
-    <w:p>
+    <w:p ns2:paraId="4728E15B" ns2:textId="77777777">
       <w:pPr>
         <w:pStyle w:val="Heading2"/>
         <w:spacing w:before="340" w:after="120"/>
@@ -1502,7 +1502,7 @@
         <w:gridCol w:w="1200"/>
         <w:gridCol w:w="2360"/>
       </w:tblGrid>
-      <w:tr>
+      <w:tr ns2:paraId="17D35760" ns2:textId="77777777">
         <w:tblPrEx>
           <w:tblCellMar>
             <w:top w:w="0" w:type="dxa"/>
@@ -1527,7 +1527,7 @@
             </w:tcMar>
             <w:vAlign w:val="center"/>
           </w:tcPr>
-          <w:p>
+          <w:p ns2:paraId="065A2D8A" ns2:textId="77777777">
             <w:r>
               <w:rPr>
                 <w:b/>
@@ -1558,7 +1558,7 @@
             </w:tcMar>
             <w:vAlign w:val="center"/>
           </w:tcPr>
-          <w:p>
+          <w:p ns2:paraId="4C91B391" ns2:textId="77777777">
             <w:r>
               <w:rPr>
                 <w:b/>
@@ -1589,7 +1589,7 @@
             </w:tcMar>
             <w:vAlign w:val="center"/>
           </w:tcPr>
-          <w:p>
+          <w:p ns2:paraId="0CA29081" ns2:textId="77777777">
             <w:r>
               <w:rPr>
                 <w:b/>
@@ -1620,7 +1620,7 @@
             </w:tcMar>
             <w:vAlign w:val="center"/>
           </w:tcPr>
-          <w:p>
+          <w:p ns2:paraId="538E5BA3" ns2:textId="77777777">
             <w:r>
               <w:rPr>
                 <w:b/>
@@ -1651,7 +1651,7 @@
             </w:tcMar>
             <w:vAlign w:val="center"/>
           </w:tcPr>
-          <w:p>
+          <w:p ns2:paraId="175E4D97" ns2:textId="77777777">
             <w:r>
               <w:rPr>
                 <w:b/>
@@ -1665,7 +1665,7 @@
           </w:p>
         </w:tc>
       </w:tr>
-      <w:tr>
+      <w:tr ns2:paraId="04503A3F" ns2:textId="77777777">
         <w:tblPrEx>
           <w:tblCellMar>
             <w:top w:w="0" w:type="dxa"/>
@@ -1690,7 +1690,7 @@
             </w:tcMar>
             <w:vAlign w:val="center"/>
           </w:tcPr>
-          <w:p>
+          <w:p ns2:paraId="21CBB639" ns2:textId="77777777">
             <w:r>
               <w:rPr>
                 <w:color w:val="595959"/>
@@ -1718,7 +1718,7 @@
             </w:tcMar>
             <w:vAlign w:val="center"/>
           </w:tcPr>
-          <w:p>
+          <w:p ns2:paraId="1F1A72F7" ns2:textId="77777777">
             <w:pPr>
               <w:jc w:val="right"/>
             </w:pPr>
@@ -1767,7 +1767,7 @@
             </w:tcMar>
             <w:vAlign w:val="center"/>
           </w:tcPr>
-          <w:p>
+          <w:p ns2:paraId="54B9216E" ns2:textId="77777777">
             <w:pPr>
               <w:jc w:val="right"/>
             </w:pPr>
@@ -1798,7 +1798,7 @@
             </w:tcMar>
             <w:vAlign w:val="center"/>
           </w:tcPr>
-          <w:p>
+          <w:p ns2:paraId="5D445F89" ns2:textId="77777777">
             <w:pPr>
               <w:jc w:val="right"/>
             </w:pPr>
@@ -1829,7 +1829,7 @@
             </w:tcMar>
             <w:vAlign w:val="center"/>
           </w:tcPr>
-          <w:p>
+          <w:p ns2:paraId="2311FE29" ns2:textId="77777777">
             <w:pPr>
               <w:jc w:val="right"/>
             </w:pPr>
@@ -1844,7 +1844,7 @@
           </w:p>
         </w:tc>
       </w:tr>
-      <w:tr>
+      <w:tr ns2:paraId="05D568FC" ns2:textId="77777777">
         <w:tblPrEx>
           <w:tblCellMar>
             <w:top w:w="0" w:type="dxa"/>
@@ -1869,7 +1869,7 @@
             </w:tcMar>
             <w:vAlign w:val="center"/>
           </w:tcPr>
-          <w:p/>
+          <w:p ns2:paraId="14D74414" ns2:textId="77777777"/>
         </w:tc>
         <w:tc>
           <w:tcPr>
@@ -1888,7 +1888,7 @@
             </w:tcMar>
             <w:vAlign w:val="center"/>
           </w:tcPr>
-          <w:p>
+          <w:p ns2:paraId="215B67CB" ns2:textId="77777777">
             <w:pPr>
               <w:jc w:val="right"/>
             </w:pPr>
@@ -1919,7 +1919,7 @@
             </w:tcMar>
             <w:vAlign w:val="center"/>
           </w:tcPr>
-          <w:p>
+          <w:p ns2:paraId="4AA996E2" ns2:textId="77777777">
             <w:pPr>
               <w:jc w:val="right"/>
             </w:pPr>
@@ -1950,7 +1950,7 @@
             </w:tcMar>
             <w:vAlign w:val="center"/>
           </w:tcPr>
-          <w:p>
+          <w:p ns2:paraId="670E4885" ns2:textId="77777777">
             <w:pPr>
               <w:jc w:val="right"/>
             </w:pPr>
@@ -1981,7 +1981,7 @@
             </w:tcMar>
             <w:vAlign w:val="center"/>
           </w:tcPr>
-          <w:p>
+          <w:p ns2:paraId="2A011027" ns2:textId="77777777">
             <w:pPr>
               <w:jc w:val="right"/>
             </w:pPr>
@@ -1996,7 +1996,7 @@
           </w:p>
         </w:tc>
       </w:tr>
-      <w:tr>
+      <w:tr ns2:paraId="4545A6DA" ns2:textId="77777777">
         <w:tblPrEx>
           <w:tblCellMar>
             <w:top w:w="0" w:type="dxa"/>
@@ -2021,7 +2021,7 @@
             </w:tcMar>
             <w:vAlign w:val="center"/>
           </w:tcPr>
-          <w:p>
+          <w:p ns2:paraId="67294397" ns2:textId="77777777">
             <w:r>
               <w:rPr>
                 <w:color w:val="595959"/>
@@ -2049,7 +2049,7 @@
             </w:tcMar>
             <w:vAlign w:val="center"/>
           </w:tcPr>
-          <w:p>
+          <w:p ns2:paraId="3512F2F7" ns2:textId="77777777">
             <w:pPr>
               <w:jc w:val="right"/>
             </w:pPr>
@@ -2098,7 +2098,7 @@
             </w:tcMar>
             <w:vAlign w:val="center"/>
           </w:tcPr>
-          <w:p>
+          <w:p ns2:paraId="32FFB1EB" ns2:textId="77777777">
             <w:pPr>
               <w:jc w:val="right"/>
             </w:pPr>
@@ -2129,7 +2129,7 @@
             </w:tcMar>
             <w:vAlign w:val="center"/>
           </w:tcPr>
-          <w:p>
+          <w:p ns2:paraId="16594317" ns2:textId="77777777">
             <w:pPr>
               <w:jc w:val="right"/>
             </w:pPr>
@@ -2160,7 +2160,7 @@
             </w:tcMar>
             <w:vAlign w:val="center"/>
           </w:tcPr>
-          <w:p>
+          <w:p ns2:paraId="796F7E1A" ns2:textId="77777777">
             <w:pPr>
               <w:jc w:val="right"/>
             </w:pPr>
@@ -2175,7 +2175,7 @@
           </w:p>
         </w:tc>
       </w:tr>
-      <w:tr>
+      <w:tr ns2:paraId="038BE47B" ns2:textId="77777777">
         <w:tblPrEx>
           <w:tblCellMar>
             <w:top w:w="0" w:type="dxa"/>
@@ -2200,7 +2200,7 @@
             </w:tcMar>
             <w:vAlign w:val="center"/>
           </w:tcPr>
-          <w:p/>
+          <w:p ns2:paraId="1C1ED955" ns2:textId="77777777"/>
         </w:tc>
         <w:tc>
           <w:tcPr>
@@ -2219,7 +2219,7 @@
             </w:tcMar>
             <w:vAlign w:val="center"/>
           </w:tcPr>
-          <w:p>
+          <w:p ns2:paraId="66844713" ns2:textId="77777777">
             <w:pPr>
               <w:jc w:val="right"/>
             </w:pPr>
@@ -2250,7 +2250,7 @@
             </w:tcMar>
             <w:vAlign w:val="center"/>
           </w:tcPr>
-          <w:p>
+          <w:p ns2:paraId="7BA7A2C1" ns2:textId="77777777">
             <w:pPr>
               <w:jc w:val="right"/>
             </w:pPr>
@@ -2281,7 +2281,7 @@
             </w:tcMar>
             <w:vAlign w:val="center"/>
           </w:tcPr>
-          <w:p>
+          <w:p ns2:paraId="691BB3CE" ns2:textId="77777777">
             <w:pPr>
               <w:jc w:val="right"/>
             </w:pPr>
@@ -2312,7 +2312,7 @@
             </w:tcMar>
             <w:vAlign w:val="center"/>
           </w:tcPr>
-          <w:p>
+          <w:p ns2:paraId="66CDE30A" ns2:textId="77777777">
             <w:pPr>
               <w:jc w:val="right"/>
             </w:pPr>
@@ -2327,7 +2327,7 @@
           </w:p>
         </w:tc>
       </w:tr>
-      <w:tr>
+      <w:tr ns2:paraId="375E1D4E" ns2:textId="77777777">
         <w:tblPrEx>
           <w:tblCellMar>
             <w:top w:w="0" w:type="dxa"/>
@@ -2352,7 +2352,7 @@
             </w:tcMar>
             <w:vAlign w:val="center"/>
           </w:tcPr>
-          <w:p>
+          <w:p ns2:paraId="28C9011A" ns2:textId="77777777">
             <w:r>
               <w:rPr>
                 <w:color w:val="595959"/>
@@ -2380,7 +2380,7 @@
             </w:tcMar>
             <w:vAlign w:val="center"/>
           </w:tcPr>
-          <w:p>
+          <w:p ns2:paraId="423C01AF" ns2:textId="77777777">
             <w:pPr>
               <w:jc w:val="right"/>
             </w:pPr>
@@ -2429,7 +2429,7 @@
             </w:tcMar>
             <w:vAlign w:val="center"/>
           </w:tcPr>
-          <w:p>
+          <w:p ns2:paraId="13197C1B" ns2:textId="77777777">
             <w:pPr>
               <w:jc w:val="right"/>
             </w:pPr>
@@ -2460,7 +2460,7 @@
             </w:tcMar>
             <w:vAlign w:val="center"/>
           </w:tcPr>
-          <w:p>
+          <w:p ns2:paraId="53BAD001" ns2:textId="77777777">
             <w:pPr>
               <w:jc w:val="right"/>
             </w:pPr>
@@ -2491,7 +2491,7 @@
             </w:tcMar>
             <w:vAlign w:val="center"/>
           </w:tcPr>
-          <w:p>
+          <w:p ns2:paraId="40CA990B" ns2:textId="77777777">
             <w:pPr>
               <w:jc w:val="right"/>
             </w:pPr>
@@ -2506,7 +2506,7 @@
           </w:p>
         </w:tc>
       </w:tr>
-      <w:tr>
+      <w:tr ns2:paraId="3447C299" ns2:textId="77777777">
         <w:tblPrEx>
           <w:tblCellMar>
             <w:top w:w="0" w:type="dxa"/>
@@ -2531,7 +2531,7 @@
             </w:tcMar>
             <w:vAlign w:val="center"/>
           </w:tcPr>
-          <w:p/>
+          <w:p ns2:paraId="3096F8CD" ns2:textId="77777777"/>
         </w:tc>
         <w:tc>
           <w:tcPr>
@@ -2550,7 +2550,7 @@
             </w:tcMar>
             <w:vAlign w:val="center"/>
           </w:tcPr>
-          <w:p>
+          <w:p ns2:paraId="2AD3A48B" ns2:textId="77777777">
             <w:pPr>
               <w:jc w:val="right"/>
             </w:pPr>
@@ -2581,7 +2581,7 @@
             </w:tcMar>
             <w:vAlign w:val="center"/>
           </w:tcPr>
-          <w:p>
+          <w:p ns2:paraId="145C3AB2" ns2:textId="77777777">
             <w:pPr>
               <w:jc w:val="right"/>
             </w:pPr>
@@ -2612,7 +2612,7 @@
             </w:tcMar>
             <w:vAlign w:val="center"/>
           </w:tcPr>
-          <w:p>
+          <w:p ns2:paraId="31447C1B" ns2:textId="77777777">
             <w:pPr>
               <w:jc w:val="right"/>
             </w:pPr>
@@ -2643,7 +2643,7 @@
             </w:tcMar>
             <w:vAlign w:val="center"/>
           </w:tcPr>
-          <w:p>
+          <w:p ns2:paraId="2B59EF8D" ns2:textId="77777777">
             <w:pPr>
               <w:jc w:val="right"/>
             </w:pPr>
@@ -2659,7 +2659,7 @@
         </w:tc>
       </w:tr>
     </w:tbl>
-    <w:p>
+    <w:p ns2:paraId="40014146" ns2:textId="77777777">
       <w:pPr>
         <w:spacing w:after="180"/>
         <w:jc w:val="center"/>
@@ -2671,7 +2671,7 @@
         <w:t>Table 2: ADF tests (AIC lag selection, max 12). From actual output.</w:t>
       </w:r>
     </w:p>
-    <w:p>
+    <w:p ns2:paraId="0B31DE2B" ns2:textId="77777777">
       <w:pPr>
         <w:spacing w:after="100"/>
         <w:jc w:val="both"/>
@@ -2712,7 +2712,7 @@
         <w:t xml:space="preserve"> levels following Sims, Stock and Watson (1990), with a first-difference robustness check in Section 5.3.</w:t>
       </w:r>
     </w:p>
-    <w:p>
+    <w:p ns2:paraId="1324D2E4" ns2:textId="77777777">
       <w:pPr>
         <w:pStyle w:val="Heading2"/>
         <w:spacing w:before="340" w:after="120"/>
@@ -2746,7 +2746,7 @@
         <w:gridCol w:w="1680"/>
         <w:gridCol w:w="1860"/>
       </w:tblGrid>
-      <w:tr>
+      <w:tr ns2:paraId="527FCD75" ns2:textId="77777777">
         <w:tblPrEx>
           <w:tblCellMar>
             <w:top w:w="0" w:type="dxa"/>
@@ -2771,7 +2771,7 @@
             </w:tcMar>
             <w:vAlign w:val="center"/>
           </w:tcPr>
-          <w:p>
+          <w:p ns2:paraId="06BB424F" ns2:textId="77777777">
             <w:r>
               <w:rPr>
                 <w:b/>
@@ -2802,7 +2802,7 @@
             </w:tcMar>
             <w:vAlign w:val="center"/>
           </w:tcPr>
-          <w:p>
+          <w:p ns2:paraId="58EB7D21" ns2:textId="77777777">
             <w:r>
               <w:rPr>
                 <w:b/>
@@ -2833,7 +2833,7 @@
             </w:tcMar>
             <w:vAlign w:val="center"/>
           </w:tcPr>
-          <w:p>
+          <w:p ns2:paraId="5D2C502D" ns2:textId="77777777">
             <w:r>
               <w:rPr>
                 <w:b/>
@@ -2864,7 +2864,7 @@
             </w:tcMar>
             <w:vAlign w:val="center"/>
           </w:tcPr>
-          <w:p>
+          <w:p ns2:paraId="080CAB7D" ns2:textId="77777777">
             <w:r>
               <w:rPr>
                 <w:b/>
@@ -2895,7 +2895,7 @@
             </w:tcMar>
             <w:vAlign w:val="center"/>
           </w:tcPr>
-          <w:p>
+          <w:p ns2:paraId="691B856B" ns2:textId="77777777">
             <w:r>
               <w:rPr>
                 <w:b/>
@@ -2926,7 +2926,7 @@
             </w:tcMar>
             <w:vAlign w:val="center"/>
           </w:tcPr>
-          <w:p>
+          <w:p ns2:paraId="5FDA3DC0" ns2:textId="77777777">
             <w:r>
               <w:rPr>
                 <w:b/>
@@ -2940,7 +2940,7 @@
           </w:p>
         </w:tc>
       </w:tr>
-      <w:tr>
+      <w:tr ns2:paraId="16CD22CC" ns2:textId="77777777">
         <w:tblPrEx>
           <w:tblCellMar>
             <w:top w:w="0" w:type="dxa"/>
@@ -2965,7 +2965,7 @@
             </w:tcMar>
             <w:vAlign w:val="center"/>
           </w:tcPr>
-          <w:p>
+          <w:p ns2:paraId="0BF9F220" ns2:textId="77777777">
             <w:r>
               <w:rPr>
                 <w:color w:val="595959"/>
@@ -2993,7 +2993,7 @@
             </w:tcMar>
             <w:vAlign w:val="center"/>
           </w:tcPr>
-          <w:p>
+          <w:p ns2:paraId="0ECA6954" ns2:textId="77777777">
             <w:pPr>
               <w:jc w:val="right"/>
             </w:pPr>
@@ -3024,7 +3024,7 @@
             </w:tcMar>
             <w:vAlign w:val="center"/>
           </w:tcPr>
-          <w:p>
+          <w:p ns2:paraId="06377BBC" ns2:textId="77777777">
             <w:pPr>
               <w:jc w:val="right"/>
             </w:pPr>
@@ -3055,7 +3055,7 @@
             </w:tcMar>
             <w:vAlign w:val="center"/>
           </w:tcPr>
-          <w:p>
+          <w:p ns2:paraId="199281F6" ns2:textId="77777777">
             <w:pPr>
               <w:jc w:val="right"/>
             </w:pPr>
@@ -3086,7 +3086,7 @@
             </w:tcMar>
             <w:vAlign w:val="center"/>
           </w:tcPr>
-          <w:p>
+          <w:p ns2:paraId="249089B8" ns2:textId="77777777">
             <w:pPr>
               <w:jc w:val="right"/>
             </w:pPr>
@@ -3117,14 +3117,14 @@
             </w:tcMar>
             <w:vAlign w:val="center"/>
           </w:tcPr>
-          <w:p>
+          <w:p ns2:paraId="58001908" ns2:textId="77777777">
             <w:pPr>
               <w:jc w:val="right"/>
             </w:pPr>
           </w:p>
         </w:tc>
       </w:tr>
-      <w:tr>
+      <w:tr ns2:paraId="05CFC1E5" ns2:textId="77777777">
         <w:tblPrEx>
           <w:tblCellMar>
             <w:top w:w="0" w:type="dxa"/>
@@ -3149,7 +3149,7 @@
             </w:tcMar>
             <w:vAlign w:val="center"/>
           </w:tcPr>
-          <w:p>
+          <w:p ns2:paraId="56BCAC3F" ns2:textId="77777777">
             <w:r>
               <w:rPr>
                 <w:color w:val="595959"/>
@@ -3177,7 +3177,7 @@
             </w:tcMar>
             <w:vAlign w:val="center"/>
           </w:tcPr>
-          <w:p>
+          <w:p ns2:paraId="1F28D94F" ns2:textId="77777777">
             <w:pPr>
               <w:jc w:val="right"/>
             </w:pPr>
@@ -3208,7 +3208,7 @@
             </w:tcMar>
             <w:vAlign w:val="center"/>
           </w:tcPr>
-          <w:p>
+          <w:p ns2:paraId="7D257F2A" ns2:textId="77777777">
             <w:pPr>
               <w:jc w:val="right"/>
             </w:pPr>
@@ -3239,7 +3239,7 @@
             </w:tcMar>
             <w:vAlign w:val="center"/>
           </w:tcPr>
-          <w:p>
+          <w:p ns2:paraId="228C7BCD" ns2:textId="77777777">
             <w:pPr>
               <w:jc w:val="right"/>
             </w:pPr>
@@ -3270,7 +3270,7 @@
             </w:tcMar>
             <w:vAlign w:val="center"/>
           </w:tcPr>
-          <w:p>
+          <w:p ns2:paraId="02761F99" ns2:textId="77777777">
             <w:pPr>
               <w:jc w:val="right"/>
             </w:pPr>
@@ -3301,7 +3301,7 @@
             </w:tcMar>
             <w:vAlign w:val="center"/>
           </w:tcPr>
-          <w:p>
+          <w:p ns2:paraId="08A6E5EF" ns2:textId="77777777">
             <w:pPr>
               <w:jc w:val="right"/>
             </w:pPr>
@@ -3316,7 +3316,7 @@
           </w:p>
         </w:tc>
       </w:tr>
-      <w:tr>
+      <w:tr ns2:paraId="560A3D1F" ns2:textId="77777777">
         <w:tblPrEx>
           <w:tblCellMar>
             <w:top w:w="0" w:type="dxa"/>
@@ -3341,7 +3341,7 @@
             </w:tcMar>
             <w:vAlign w:val="center"/>
           </w:tcPr>
-          <w:p>
+          <w:p ns2:paraId="0E4E1DEA" ns2:textId="77777777">
             <w:r>
               <w:rPr>
                 <w:color w:val="595959"/>
@@ -3369,7 +3369,7 @@
             </w:tcMar>
             <w:vAlign w:val="center"/>
           </w:tcPr>
-          <w:p>
+          <w:p ns2:paraId="65DE5946" ns2:textId="77777777">
             <w:pPr>
               <w:jc w:val="right"/>
             </w:pPr>
@@ -3400,7 +3400,7 @@
             </w:tcMar>
             <w:vAlign w:val="center"/>
           </w:tcPr>
-          <w:p>
+          <w:p ns2:paraId="1E13BF61" ns2:textId="77777777">
             <w:pPr>
               <w:jc w:val="right"/>
             </w:pPr>
@@ -3431,7 +3431,7 @@
             </w:tcMar>
             <w:vAlign w:val="center"/>
           </w:tcPr>
-          <w:p>
+          <w:p ns2:paraId="76A1A3C2" ns2:textId="77777777">
             <w:pPr>
               <w:jc w:val="right"/>
             </w:pPr>
@@ -3462,7 +3462,7 @@
             </w:tcMar>
             <w:vAlign w:val="center"/>
           </w:tcPr>
-          <w:p>
+          <w:p ns2:paraId="32143A2B" ns2:textId="77777777">
             <w:pPr>
               <w:jc w:val="right"/>
             </w:pPr>
@@ -3493,7 +3493,7 @@
             </w:tcMar>
             <w:vAlign w:val="center"/>
           </w:tcPr>
-          <w:p>
+          <w:p ns2:paraId="4D0864A7" ns2:textId="77777777">
             <w:pPr>
               <w:jc w:val="right"/>
             </w:pPr>
@@ -3508,7 +3508,7 @@
           </w:p>
         </w:tc>
       </w:tr>
-      <w:tr>
+      <w:tr ns2:paraId="5A082819" ns2:textId="77777777">
         <w:tblPrEx>
           <w:tblCellMar>
             <w:top w:w="0" w:type="dxa"/>
@@ -3533,7 +3533,7 @@
             </w:tcMar>
             <w:vAlign w:val="center"/>
           </w:tcPr>
-          <w:p>
+          <w:p ns2:paraId="61D7C206" ns2:textId="77777777">
             <w:r>
               <w:rPr>
                 <w:color w:val="595959"/>
@@ -3561,7 +3561,7 @@
             </w:tcMar>
             <w:vAlign w:val="center"/>
           </w:tcPr>
-          <w:p>
+          <w:p ns2:paraId="2D3B525F" ns2:textId="77777777">
             <w:pPr>
               <w:jc w:val="right"/>
             </w:pPr>
@@ -3592,7 +3592,7 @@
             </w:tcMar>
             <w:vAlign w:val="center"/>
           </w:tcPr>
-          <w:p>
+          <w:p ns2:paraId="57D3D975" ns2:textId="77777777">
             <w:pPr>
               <w:jc w:val="right"/>
             </w:pPr>
@@ -3623,7 +3623,7 @@
             </w:tcMar>
             <w:vAlign w:val="center"/>
           </w:tcPr>
-          <w:p>
+          <w:p ns2:paraId="754A3A43" ns2:textId="77777777">
             <w:pPr>
               <w:jc w:val="right"/>
             </w:pPr>
@@ -3654,7 +3654,7 @@
             </w:tcMar>
             <w:vAlign w:val="center"/>
           </w:tcPr>
-          <w:p>
+          <w:p ns2:paraId="3BAA1799" ns2:textId="77777777">
             <w:pPr>
               <w:jc w:val="right"/>
             </w:pPr>
@@ -3685,7 +3685,7 @@
             </w:tcMar>
             <w:vAlign w:val="center"/>
           </w:tcPr>
-          <w:p>
+          <w:p ns2:paraId="07581AC8" ns2:textId="77777777">
             <w:pPr>
               <w:jc w:val="right"/>
             </w:pPr>
@@ -3693,7 +3693,7 @@
         </w:tc>
       </w:tr>
     </w:tbl>
-    <w:p>
+    <w:p ns2:paraId="05F71ED4" ns2:textId="77777777">
       <w:pPr>
         <w:spacing w:after="180"/>
         <w:jc w:val="center"/>
@@ -3705,7 +3705,7 @@
         <w:t>Table 3: Lag order selection. From actual output.</w:t>
       </w:r>
     </w:p>
-    <w:p>
+    <w:p ns2:paraId="74665306" ns2:textId="77777777">
       <w:pPr>
         <w:spacing w:after="100"/>
         <w:jc w:val="both"/>
@@ -3717,12 +3717,12 @@
         <w:t>BIC selects p=2; AIC selects p=3. We adopt p=2 (BIC) as baseline. FPE is identical for p=2,3,4.</w:t>
       </w:r>
     </w:p>
-    <w:p>
+    <w:p ns2:paraId="148C0D3C" ns2:textId="77777777">
       <w:r>
         <w:br w:type="page"/>
       </w:r>
     </w:p>
-    <w:p>
+    <w:p ns2:paraId="5BE47A9B" ns2:textId="77777777">
       <w:pPr>
         <w:pStyle w:val="Heading1"/>
       </w:pPr>
@@ -3731,7 +3731,7 @@
         <w:t>3. Methodology</w:t>
       </w:r>
     </w:p>
-    <w:p>
+    <w:p ns2:paraId="674074E8" ns2:textId="77777777">
       <w:pPr>
         <w:pStyle w:val="Heading2"/>
         <w:spacing w:before="340" w:after="120"/>
@@ -3748,7 +3748,7 @@
         <w:t>2) Model</w:t>
       </w:r>
     </w:p>
-    <w:p>
+    <w:p ns2:paraId="2ED1D800" ns2:textId="77777777">
       <w:pPr>
         <w:spacing w:before="100" w:after="100"/>
         <w:jc w:val="center"/>
@@ -3803,7 +3803,7 @@
         <w:t>0, I_T, Σ)</w:t>
       </w:r>
     </w:p>
-    <w:p>
+    <w:p ns2:paraId="43584B2C" ns2:textId="77777777">
       <w:pPr>
         <w:spacing w:after="100"/>
         <w:jc w:val="both"/>
@@ -3857,7 +3857,7 @@
         <w:t>.</w:t>
       </w:r>
     </w:p>
-    <w:p>
+    <w:p ns2:paraId="2D48A24A" ns2:textId="77777777">
       <w:pPr>
         <w:pStyle w:val="Heading2"/>
         <w:spacing w:before="340" w:after="120"/>
@@ -3866,7 +3866,7 @@
         <w:t>3.2 Minnesota / NIW Prior</w:t>
       </w:r>
     </w:p>
-    <w:p>
+    <w:p ns2:paraId="5686B96A" ns2:textId="77777777">
       <w:pPr>
         <w:spacing w:before="80" w:after="100"/>
         <w:jc w:val="center"/>
@@ -3941,7 +3941,7 @@
         <w:t>S₀, ν₀)</w:t>
       </w:r>
     </w:p>
-    <w:p>
+    <w:p ns2:paraId="0983EAC2" ns2:textId="77777777">
       <w:pPr>
         <w:spacing w:after="100"/>
         <w:jc w:val="both"/>
@@ -4037,7 +4037,7 @@
         <w:t>[0.43622, 0.04251, 0.00365].</w:t>
       </w:r>
     </w:p>
-    <w:p>
+    <w:p ns2:paraId="24D1C063" ns2:textId="77777777">
       <w:pPr>
         <w:pStyle w:val="Heading2"/>
         <w:spacing w:before="340" w:after="120"/>
@@ -4046,7 +4046,7 @@
         <w:t>3.3 Gibbs Sampler (from scratch)</w:t>
       </w:r>
     </w:p>
-    <w:p>
+    <w:p ns2:paraId="1DCE5A60" ns2:textId="77777777">
       <w:pPr>
         <w:spacing w:after="100"/>
         <w:jc w:val="both"/>
@@ -4240,7 +4240,7 @@
         <w:t>(Σ)′.</w:t>
       </w:r>
     </w:p>
-    <w:p>
+    <w:p ns2:paraId="106DE880" ns2:textId="77777777">
       <w:pPr>
         <w:spacing w:after="100"/>
         <w:jc w:val="both"/>
@@ -4297,7 +4297,7 @@
         <w:rPr>
           <w:color w:val="595959"/>
         </w:rPr>
-        <w:t xml:space="preserve"> = ν₀ + T. Draw Σ ~ </w:t>
+        <w:t xml:space="preserve"> = ν₀ + T + k. Draw Σ ~ </w:t>
       </w:r>
       <w:proofErr w:type="gramStart"/>
       <w:r>
@@ -4336,7 +4336,7 @@
         <w:t>) via Bartlett decomposition.</w:t>
       </w:r>
     </w:p>
-    <w:p>
+    <w:p ns2:paraId="637D1EE2" ns2:textId="77777777">
       <w:pPr>
         <w:spacing w:after="100"/>
         <w:jc w:val="both"/>
@@ -4376,7 +4376,7 @@
         <w:t>.</w:t>
       </w:r>
     </w:p>
-    <w:p>
+    <w:p ns2:paraId="5216C0A2" ns2:textId="77777777">
       <w:pPr>
         <w:pStyle w:val="Heading2"/>
         <w:spacing w:before="340" w:after="120"/>
@@ -4385,7 +4385,7 @@
         <w:t>3.4 Structural Identification</w:t>
       </w:r>
     </w:p>
-    <w:p>
+    <w:p ns2:paraId="4DE8DC58" ns2:textId="77777777">
       <w:pPr>
         <w:spacing w:after="100"/>
         <w:jc w:val="both"/>
@@ -4397,12 +4397,12 @@
         <w:t>Cholesky decomposition with baseline ordering [CPI, Rate, PLN/EUR]. CPI is predetermined (monthly price stickiness); Rate responds to CPI within month (Taylor rule); PLN/EUR reacts contemporaneously to everything (asset price).</w:t>
       </w:r>
     </w:p>
-    <w:p>
+    <w:p ns2:paraId="7959FF78" ns2:textId="77777777">
       <w:r>
         <w:br w:type="page"/>
       </w:r>
     </w:p>
-    <w:p>
+    <w:p ns2:paraId="0CAAA731" ns2:textId="77777777">
       <w:pPr>
         <w:pStyle w:val="Heading1"/>
       </w:pPr>
@@ -4411,7 +4411,7 @@
         <w:t>4. Estimation Results</w:t>
       </w:r>
     </w:p>
-    <w:p>
+    <w:p ns2:paraId="09DCBB60" ns2:textId="77777777">
       <w:pPr>
         <w:pStyle w:val="Heading2"/>
         <w:spacing w:before="340" w:after="120"/>
@@ -4446,7 +4446,7 @@
         <w:gridCol w:w="800"/>
         <w:gridCol w:w="1260"/>
       </w:tblGrid>
-      <w:tr>
+      <w:tr ns2:paraId="14679C50" ns2:textId="77777777">
         <w:tblPrEx>
           <w:tblCellMar>
             <w:top w:w="0" w:type="dxa"/>
@@ -4471,7 +4471,7 @@
             </w:tcMar>
             <w:vAlign w:val="center"/>
           </w:tcPr>
-          <w:p>
+          <w:p ns2:paraId="740D0AAB" ns2:textId="77777777">
             <w:r>
               <w:rPr>
                 <w:b/>
@@ -4502,7 +4502,7 @@
             </w:tcMar>
             <w:vAlign w:val="center"/>
           </w:tcPr>
-          <w:p>
+          <w:p ns2:paraId="335F3630" ns2:textId="77777777">
             <w:r>
               <w:rPr>
                 <w:b/>
@@ -4533,7 +4533,7 @@
             </w:tcMar>
             <w:vAlign w:val="center"/>
           </w:tcPr>
-          <w:p>
+          <w:p ns2:paraId="66AE90D9" ns2:textId="77777777">
             <w:r>
               <w:rPr>
                 <w:b/>
@@ -4564,7 +4564,7 @@
             </w:tcMar>
             <w:vAlign w:val="center"/>
           </w:tcPr>
-          <w:p>
+          <w:p ns2:paraId="51F7C4A0" ns2:textId="77777777">
             <w:r>
               <w:rPr>
                 <w:b/>
@@ -4595,7 +4595,7 @@
             </w:tcMar>
             <w:vAlign w:val="center"/>
           </w:tcPr>
-          <w:p>
+          <w:p ns2:paraId="293F0844" ns2:textId="77777777">
             <w:r>
               <w:rPr>
                 <w:b/>
@@ -4626,7 +4626,7 @@
             </w:tcMar>
             <w:vAlign w:val="center"/>
           </w:tcPr>
-          <w:p>
+          <w:p ns2:paraId="722CDFE2" ns2:textId="77777777">
             <w:r>
               <w:rPr>
                 <w:b/>
@@ -4657,7 +4657,7 @@
             </w:tcMar>
             <w:vAlign w:val="center"/>
           </w:tcPr>
-          <w:p>
+          <w:p ns2:paraId="3E95D05F" ns2:textId="77777777">
             <w:proofErr w:type="spellStart"/>
             <w:r>
               <w:rPr>
@@ -4673,7 +4673,7 @@
           </w:p>
         </w:tc>
       </w:tr>
-      <w:tr>
+      <w:tr ns2:paraId="32400A1E" ns2:textId="77777777">
         <w:tblPrEx>
           <w:tblCellMar>
             <w:top w:w="0" w:type="dxa"/>
@@ -4698,7 +4698,7 @@
             </w:tcMar>
             <w:vAlign w:val="center"/>
           </w:tcPr>
-          <w:p>
+          <w:p ns2:paraId="65E46DB2" ns2:textId="77777777">
             <w:r>
               <w:rPr>
                 <w:color w:val="595959"/>
@@ -4726,7 +4726,7 @@
             </w:tcMar>
             <w:vAlign w:val="center"/>
           </w:tcPr>
-          <w:p>
+          <w:p ns2:paraId="07512E31" ns2:textId="77777777">
             <w:pPr>
               <w:jc w:val="right"/>
             </w:pPr>
@@ -4757,7 +4757,7 @@
             </w:tcMar>
             <w:vAlign w:val="center"/>
           </w:tcPr>
-          <w:p>
+          <w:p ns2:paraId="5065D030" ns2:textId="77777777">
             <w:pPr>
               <w:jc w:val="right"/>
             </w:pPr>
@@ -4788,7 +4788,7 @@
             </w:tcMar>
             <w:vAlign w:val="center"/>
           </w:tcPr>
-          <w:p>
+          <w:p ns2:paraId="6CF098BA" ns2:textId="77777777">
             <w:pPr>
               <w:jc w:val="right"/>
             </w:pPr>
@@ -4819,7 +4819,7 @@
             </w:tcMar>
             <w:vAlign w:val="center"/>
           </w:tcPr>
-          <w:p>
+          <w:p ns2:paraId="652008DC" ns2:textId="77777777">
             <w:pPr>
               <w:jc w:val="right"/>
             </w:pPr>
@@ -4850,7 +4850,7 @@
             </w:tcMar>
             <w:vAlign w:val="center"/>
           </w:tcPr>
-          <w:p>
+          <w:p ns2:paraId="1900D257" ns2:textId="77777777">
             <w:pPr>
               <w:jc w:val="right"/>
             </w:pPr>
@@ -4881,7 +4881,7 @@
             </w:tcMar>
             <w:vAlign w:val="center"/>
           </w:tcPr>
-          <w:p>
+          <w:p ns2:paraId="4F921518" ns2:textId="77777777">
             <w:pPr>
               <w:jc w:val="right"/>
             </w:pPr>
@@ -4896,7 +4896,7 @@
           </w:p>
         </w:tc>
       </w:tr>
-      <w:tr>
+      <w:tr ns2:paraId="38D59ED5" ns2:textId="77777777">
         <w:tblPrEx>
           <w:tblCellMar>
             <w:top w:w="0" w:type="dxa"/>
@@ -4921,7 +4921,7 @@
             </w:tcMar>
             <w:vAlign w:val="center"/>
           </w:tcPr>
-          <w:p>
+          <w:p ns2:paraId="5DD0F6EA" ns2:textId="77777777">
             <w:r>
               <w:rPr>
                 <w:color w:val="595959"/>
@@ -4949,7 +4949,7 @@
             </w:tcMar>
             <w:vAlign w:val="center"/>
           </w:tcPr>
-          <w:p>
+          <w:p ns2:paraId="349D5CEE" ns2:textId="77777777">
             <w:pPr>
               <w:jc w:val="right"/>
             </w:pPr>
@@ -4980,7 +4980,7 @@
             </w:tcMar>
             <w:vAlign w:val="center"/>
           </w:tcPr>
-          <w:p>
+          <w:p ns2:paraId="1402DBD9" ns2:textId="77777777">
             <w:pPr>
               <w:jc w:val="right"/>
             </w:pPr>
@@ -5011,7 +5011,7 @@
             </w:tcMar>
             <w:vAlign w:val="center"/>
           </w:tcPr>
-          <w:p>
+          <w:p ns2:paraId="4CB8CEF3" ns2:textId="77777777">
             <w:pPr>
               <w:jc w:val="right"/>
             </w:pPr>
@@ -5042,7 +5042,7 @@
             </w:tcMar>
             <w:vAlign w:val="center"/>
           </w:tcPr>
-          <w:p>
+          <w:p ns2:paraId="68E8262D" ns2:textId="77777777">
             <w:pPr>
               <w:jc w:val="right"/>
             </w:pPr>
@@ -5073,7 +5073,7 @@
             </w:tcMar>
             <w:vAlign w:val="center"/>
           </w:tcPr>
-          <w:p>
+          <w:p ns2:paraId="2D0D8DC0" ns2:textId="77777777">
             <w:pPr>
               <w:jc w:val="right"/>
             </w:pPr>
@@ -5104,7 +5104,7 @@
             </w:tcMar>
             <w:vAlign w:val="center"/>
           </w:tcPr>
-          <w:p>
+          <w:p ns2:paraId="7C03CCD2" ns2:textId="77777777">
             <w:pPr>
               <w:jc w:val="right"/>
             </w:pPr>
@@ -5119,7 +5119,7 @@
           </w:p>
         </w:tc>
       </w:tr>
-      <w:tr>
+      <w:tr ns2:paraId="309904C4" ns2:textId="77777777">
         <w:tblPrEx>
           <w:tblCellMar>
             <w:top w:w="0" w:type="dxa"/>
@@ -5144,7 +5144,7 @@
             </w:tcMar>
             <w:vAlign w:val="center"/>
           </w:tcPr>
-          <w:p>
+          <w:p ns2:paraId="763B25AC" ns2:textId="77777777">
             <w:r>
               <w:rPr>
                 <w:color w:val="595959"/>
@@ -5172,7 +5172,7 @@
             </w:tcMar>
             <w:vAlign w:val="center"/>
           </w:tcPr>
-          <w:p>
+          <w:p ns2:paraId="56211E96" ns2:textId="77777777">
             <w:pPr>
               <w:jc w:val="right"/>
             </w:pPr>
@@ -5203,7 +5203,7 @@
             </w:tcMar>
             <w:vAlign w:val="center"/>
           </w:tcPr>
-          <w:p>
+          <w:p ns2:paraId="4F9F37EF" ns2:textId="77777777">
             <w:pPr>
               <w:jc w:val="right"/>
             </w:pPr>
@@ -5234,7 +5234,7 @@
             </w:tcMar>
             <w:vAlign w:val="center"/>
           </w:tcPr>
-          <w:p>
+          <w:p ns2:paraId="2A31A4B1" ns2:textId="77777777">
             <w:pPr>
               <w:jc w:val="right"/>
             </w:pPr>
@@ -5265,7 +5265,7 @@
             </w:tcMar>
             <w:vAlign w:val="center"/>
           </w:tcPr>
-          <w:p>
+          <w:p ns2:paraId="4D87DE1C" ns2:textId="77777777">
             <w:pPr>
               <w:jc w:val="right"/>
             </w:pPr>
@@ -5296,7 +5296,7 @@
             </w:tcMar>
             <w:vAlign w:val="center"/>
           </w:tcPr>
-          <w:p>
+          <w:p ns2:paraId="7060C0C5" ns2:textId="77777777">
             <w:pPr>
               <w:jc w:val="right"/>
             </w:pPr>
@@ -5327,7 +5327,7 @@
             </w:tcMar>
             <w:vAlign w:val="center"/>
           </w:tcPr>
-          <w:p>
+          <w:p ns2:paraId="4AD03549" ns2:textId="77777777">
             <w:pPr>
               <w:jc w:val="right"/>
             </w:pPr>
@@ -5343,7 +5343,7 @@
         </w:tc>
       </w:tr>
     </w:tbl>
-    <w:p>
+    <w:p ns2:paraId="7958A579" ns2:textId="77777777">
       <w:pPr>
         <w:spacing w:after="180"/>
         <w:jc w:val="center"/>
@@ -5369,7 +5369,7 @@
         <w:t xml:space="preserve"> Z| &lt; 1.96. Numbers from actual output.</w:t>
       </w:r>
     </w:p>
-    <w:p>
+    <w:p ns2:paraId="58D0FDBB" ns2:textId="77777777">
       <w:pPr>
         <w:spacing w:after="100"/>
         <w:jc w:val="both"/>
@@ -5409,7 +5409,7 @@
         <w:t xml:space="preserve"> 90% CI includes 1.0, consistent with near-unit-root status from ADF tests.</w:t>
       </w:r>
     </w:p>
-    <w:p>
+    <w:p ns2:paraId="64A2C2A0" ns2:textId="77777777">
       <w:pPr>
         <w:spacing w:after="100"/>
         <w:jc w:val="both"/>
@@ -5421,12 +5421,12 @@
         <w:t>Posterior mean Σ: [[0.394, 0.045, 0.003], [0.045, 0.033, −0.001], [0.003, −0.001, 0.004]]. The CPI-rate correlation is positive (0.247 from classical VAR), reflecting co-movement during the inflation surge. The rate-FX correlation is negative (−0.165), consistent with rate hikes attracting capital and strengthening PLN.</w:t>
       </w:r>
     </w:p>
-    <w:p>
+    <w:p ns2:paraId="53117035" ns2:textId="77777777">
       <w:pPr>
         <w:spacing w:after="80"/>
       </w:pPr>
     </w:p>
-    <w:p>
+    <w:p ns2:paraId="5F0A734C" ns2:textId="77777777">
       <w:pPr>
         <w:spacing w:before="140" w:after="60"/>
         <w:jc w:val="center"/>
@@ -5436,46 +5436,46 @@
           <w:noProof/>
         </w:rPr>
         <w:drawing>
-          <wp:inline distT="0" distB="0" distL="0" distR="0" wp14:anchorId="34E8FC82" wp14:editId="692BDA9F">
-            <wp:extent cx="5762625" cy="3200400"/>
-            <wp:effectExtent l="0" t="0" r="0" b="0"/>
-            <wp:docPr id="1966190455" name="Picture 1966190455"/>
-            <wp:cNvGraphicFramePr>
-              <a:graphicFrameLocks xmlns:a="http://schemas.openxmlformats.org/drawingml/2006/main" noChangeAspect="1"/>
-            </wp:cNvGraphicFramePr>
-            <a:graphic xmlns:a="http://schemas.openxmlformats.org/drawingml/2006/main">
-              <a:graphicData uri="http://schemas.openxmlformats.org/drawingml/2006/picture">
-                <pic:pic xmlns:pic="http://schemas.openxmlformats.org/drawingml/2006/picture">
-                  <pic:nvPicPr>
-                    <pic:cNvPr id="0" name=""/>
-                    <pic:cNvPicPr>
-                      <a:picLocks noChangeAspect="1" noChangeArrowheads="1"/>
-                    </pic:cNvPicPr>
-                  </pic:nvPicPr>
-                  <pic:blipFill>
-                    <a:blip r:embed="rId8"/>
-                    <a:srcRect/>
-                    <a:stretch>
-                      <a:fillRect/>
-                    </a:stretch>
-                  </pic:blipFill>
-                  <pic:spPr bwMode="auto">
-                    <a:xfrm>
-                      <a:off x="0" y="0"/>
-                      <a:ext cx="5762625" cy="3200400"/>
-                    </a:xfrm>
-                    <a:prstGeom prst="rect">
-                      <a:avLst/>
-                    </a:prstGeom>
-                  </pic:spPr>
-                </pic:pic>
-              </a:graphicData>
-            </a:graphic>
-          </wp:inline>
+          <ns3:inline distT="0" distB="0" distL="0" distR="0" ns4:anchorId="34E8FC82" ns4:editId="692BDA9F">
+            <ns3:extent cx="5762625" cy="3200400"/>
+            <ns3:effectExtent l="0" t="0" r="0" b="0"/>
+            <ns3:docPr id="1966190455" name="Picture 1966190455"/>
+            <ns3:cNvGraphicFramePr>
+              <ns5:graphicFrameLocks noChangeAspect="1"/>
+            </ns3:cNvGraphicFramePr>
+            <ns5:graphic>
+              <ns5:graphicData uri="http://schemas.openxmlformats.org/drawingml/2006/picture">
+                <ns6:pic>
+                  <ns6:nvPicPr>
+                    <ns6:cNvPr id="0" name=""/>
+                    <ns6:cNvPicPr>
+                      <ns5:picLocks noChangeAspect="1" noChangeArrowheads="1"/>
+                    </ns6:cNvPicPr>
+                  </ns6:nvPicPr>
+                  <ns6:blipFill>
+                    <ns5:blip ns7:embed="rId8"/>
+                    <ns5:srcRect/>
+                    <ns5:stretch>
+                      <ns5:fillRect/>
+                    </ns5:stretch>
+                  </ns6:blipFill>
+                  <ns6:spPr bwMode="auto">
+                    <ns5:xfrm>
+                      <ns5:off x="0" y="0"/>
+                      <ns5:ext cx="5762625" cy="3200400"/>
+                    </ns5:xfrm>
+                    <ns5:prstGeom prst="rect">
+                      <ns5:avLst/>
+                    </ns5:prstGeom>
+                  </ns6:spPr>
+                </ns6:pic>
+              </ns5:graphicData>
+            </ns5:graphic>
+          </ns3:inline>
         </w:drawing>
       </w:r>
     </w:p>
-    <w:p>
+    <w:p ns2:paraId="2EF626D8" ns2:textId="77777777">
       <w:pPr>
         <w:spacing w:after="160"/>
         <w:jc w:val="center"/>
@@ -5487,7 +5487,7 @@
         <w:t>Figure 2: In-sample fit. Solid: actual data. Dashed: posterior mean fitted values.</w:t>
       </w:r>
     </w:p>
-    <w:p>
+    <w:p ns2:paraId="343CE617" ns2:textId="77777777">
       <w:pPr>
         <w:spacing w:before="140" w:after="60"/>
         <w:jc w:val="center"/>
@@ -5498,46 +5498,46 @@
         </w:rPr>
         <w:lastRenderedPageBreak/>
         <w:drawing>
-          <wp:inline distT="0" distB="0" distL="0" distR="0" wp14:anchorId="526EE5F8" wp14:editId="03793DA1">
-            <wp:extent cx="5943600" cy="3933825"/>
-            <wp:effectExtent l="0" t="0" r="0" b="0"/>
-            <wp:docPr id="1157431679" name="Picture 1157431679"/>
-            <wp:cNvGraphicFramePr>
-              <a:graphicFrameLocks xmlns:a="http://schemas.openxmlformats.org/drawingml/2006/main" noChangeAspect="1"/>
-            </wp:cNvGraphicFramePr>
-            <a:graphic xmlns:a="http://schemas.openxmlformats.org/drawingml/2006/main">
-              <a:graphicData uri="http://schemas.openxmlformats.org/drawingml/2006/picture">
-                <pic:pic xmlns:pic="http://schemas.openxmlformats.org/drawingml/2006/picture">
-                  <pic:nvPicPr>
-                    <pic:cNvPr id="0" name=""/>
-                    <pic:cNvPicPr>
-                      <a:picLocks noChangeAspect="1" noChangeArrowheads="1"/>
-                    </pic:cNvPicPr>
-                  </pic:nvPicPr>
-                  <pic:blipFill>
-                    <a:blip r:embed="rId9"/>
-                    <a:srcRect/>
-                    <a:stretch>
-                      <a:fillRect/>
-                    </a:stretch>
-                  </pic:blipFill>
-                  <pic:spPr bwMode="auto">
-                    <a:xfrm>
-                      <a:off x="0" y="0"/>
-                      <a:ext cx="5943600" cy="3933825"/>
-                    </a:xfrm>
-                    <a:prstGeom prst="rect">
-                      <a:avLst/>
-                    </a:prstGeom>
-                  </pic:spPr>
-                </pic:pic>
-              </a:graphicData>
-            </a:graphic>
-          </wp:inline>
+          <ns3:inline distT="0" distB="0" distL="0" distR="0" ns4:anchorId="526EE5F8" ns4:editId="03793DA1">
+            <ns3:extent cx="5943600" cy="3933825"/>
+            <ns3:effectExtent l="0" t="0" r="0" b="0"/>
+            <ns3:docPr id="1157431679" name="Picture 1157431679"/>
+            <ns3:cNvGraphicFramePr>
+              <ns5:graphicFrameLocks noChangeAspect="1"/>
+            </ns3:cNvGraphicFramePr>
+            <ns5:graphic>
+              <ns5:graphicData uri="http://schemas.openxmlformats.org/drawingml/2006/picture">
+                <ns6:pic>
+                  <ns6:nvPicPr>
+                    <ns6:cNvPr id="0" name=""/>
+                    <ns6:cNvPicPr>
+                      <ns5:picLocks noChangeAspect="1" noChangeArrowheads="1"/>
+                    </ns6:cNvPicPr>
+                  </ns6:nvPicPr>
+                  <ns6:blipFill>
+                    <ns5:blip ns7:embed="rId9"/>
+                    <ns5:srcRect/>
+                    <ns5:stretch>
+                      <ns5:fillRect/>
+                    </ns5:stretch>
+                  </ns6:blipFill>
+                  <ns6:spPr bwMode="auto">
+                    <ns5:xfrm>
+                      <ns5:off x="0" y="0"/>
+                      <ns5:ext cx="5943600" cy="3933825"/>
+                    </ns5:xfrm>
+                    <ns5:prstGeom prst="rect">
+                      <ns5:avLst/>
+                    </ns5:prstGeom>
+                  </ns6:spPr>
+                </ns6:pic>
+              </ns5:graphicData>
+            </ns5:graphic>
+          </ns3:inline>
         </w:drawing>
       </w:r>
     </w:p>
-    <w:p>
+    <w:p ns2:paraId="1F53CDFC" ns2:textId="77777777">
       <w:pPr>
         <w:spacing w:after="160"/>
         <w:jc w:val="center"/>
@@ -5549,7 +5549,7 @@
         <w:t>Figure 3: Marginal posteriors. Own lag-1 (top), residual variance (middle), constants (bottom). Values from actual posterior output: CPI mean=0.394, Rate mean=0.033, FX mean=0.004.</w:t>
       </w:r>
     </w:p>
-    <w:p>
+    <w:p ns2:paraId="6D11F6EA" ns2:textId="77777777">
       <w:pPr>
         <w:pStyle w:val="Heading2"/>
         <w:spacing w:before="340" w:after="120"/>
@@ -5581,7 +5581,7 @@
         <w:gridCol w:w="1920"/>
         <w:gridCol w:w="1920"/>
       </w:tblGrid>
-      <w:tr>
+      <w:tr ns2:paraId="38A83E5C" ns2:textId="77777777">
         <w:tblPrEx>
           <w:tblCellMar>
             <w:top w:w="0" w:type="dxa"/>
@@ -5606,7 +5606,7 @@
             </w:tcMar>
             <w:vAlign w:val="center"/>
           </w:tcPr>
-          <w:p>
+          <w:p ns2:paraId="653A5BF4" ns2:textId="77777777">
             <w:r>
               <w:rPr>
                 <w:b/>
@@ -5637,7 +5637,7 @@
             </w:tcMar>
             <w:vAlign w:val="center"/>
           </w:tcPr>
-          <w:p>
+          <w:p ns2:paraId="0AE67DAE" ns2:textId="77777777">
             <w:r>
               <w:rPr>
                 <w:b/>
@@ -5668,7 +5668,7 @@
             </w:tcMar>
             <w:vAlign w:val="center"/>
           </w:tcPr>
-          <w:p>
+          <w:p ns2:paraId="47702E1D" ns2:textId="77777777">
             <w:proofErr w:type="spellStart"/>
             <w:r>
               <w:rPr>
@@ -5711,7 +5711,7 @@
             </w:tcMar>
             <w:vAlign w:val="center"/>
           </w:tcPr>
-          <w:p>
+          <w:p ns2:paraId="35A5E753" ns2:textId="77777777">
             <w:r>
               <w:rPr>
                 <w:b/>
@@ -5725,7 +5725,7 @@
           </w:p>
         </w:tc>
       </w:tr>
-      <w:tr>
+      <w:tr ns2:paraId="34923776" ns2:textId="77777777">
         <w:tblPrEx>
           <w:tblCellMar>
             <w:top w:w="0" w:type="dxa"/>
@@ -5750,7 +5750,7 @@
             </w:tcMar>
             <w:vAlign w:val="center"/>
           </w:tcPr>
-          <w:p>
+          <w:p ns2:paraId="296D15C8" ns2:textId="77777777">
             <w:r>
               <w:rPr>
                 <w:color w:val="595959"/>
@@ -5778,7 +5778,7 @@
             </w:tcMar>
             <w:vAlign w:val="center"/>
           </w:tcPr>
-          <w:p>
+          <w:p ns2:paraId="58E962A3" ns2:textId="77777777">
             <w:pPr>
               <w:jc w:val="right"/>
             </w:pPr>
@@ -5809,7 +5809,7 @@
             </w:tcMar>
             <w:vAlign w:val="center"/>
           </w:tcPr>
-          <w:p>
+          <w:p ns2:paraId="0C79DDE9" ns2:textId="77777777">
             <w:pPr>
               <w:jc w:val="right"/>
             </w:pPr>
@@ -5840,7 +5840,7 @@
             </w:tcMar>
             <w:vAlign w:val="center"/>
           </w:tcPr>
-          <w:p>
+          <w:p ns2:paraId="3A42ED31" ns2:textId="77777777">
             <w:pPr>
               <w:jc w:val="right"/>
             </w:pPr>
@@ -5855,7 +5855,7 @@
           </w:p>
         </w:tc>
       </w:tr>
-      <w:tr>
+      <w:tr ns2:paraId="70D096C8" ns2:textId="77777777">
         <w:tblPrEx>
           <w:tblCellMar>
             <w:top w:w="0" w:type="dxa"/>
@@ -5880,7 +5880,7 @@
             </w:tcMar>
             <w:vAlign w:val="center"/>
           </w:tcPr>
-          <w:p>
+          <w:p ns2:paraId="6866685B" ns2:textId="77777777">
             <w:r>
               <w:rPr>
                 <w:color w:val="595959"/>
@@ -5908,7 +5908,7 @@
             </w:tcMar>
             <w:vAlign w:val="center"/>
           </w:tcPr>
-          <w:p>
+          <w:p ns2:paraId="3BBE57A1" ns2:textId="77777777">
             <w:pPr>
               <w:jc w:val="right"/>
             </w:pPr>
@@ -5939,7 +5939,7 @@
             </w:tcMar>
             <w:vAlign w:val="center"/>
           </w:tcPr>
-          <w:p>
+          <w:p ns2:paraId="10349CE6" ns2:textId="77777777">
             <w:pPr>
               <w:jc w:val="right"/>
             </w:pPr>
@@ -5970,7 +5970,7 @@
             </w:tcMar>
             <w:vAlign w:val="center"/>
           </w:tcPr>
-          <w:p>
+          <w:p ns2:paraId="4D73DC20" ns2:textId="77777777">
             <w:pPr>
               <w:jc w:val="right"/>
             </w:pPr>
@@ -5985,7 +5985,7 @@
           </w:p>
         </w:tc>
       </w:tr>
-      <w:tr>
+      <w:tr ns2:paraId="26D0E2BC" ns2:textId="77777777">
         <w:tblPrEx>
           <w:tblCellMar>
             <w:top w:w="0" w:type="dxa"/>
@@ -6010,7 +6010,7 @@
             </w:tcMar>
             <w:vAlign w:val="center"/>
           </w:tcPr>
-          <w:p>
+          <w:p ns2:paraId="0D356AB9" ns2:textId="77777777">
             <w:r>
               <w:rPr>
                 <w:color w:val="595959"/>
@@ -6038,7 +6038,7 @@
             </w:tcMar>
             <w:vAlign w:val="center"/>
           </w:tcPr>
-          <w:p>
+          <w:p ns2:paraId="554BFC9E" ns2:textId="77777777">
             <w:pPr>
               <w:jc w:val="right"/>
             </w:pPr>
@@ -6069,7 +6069,7 @@
             </w:tcMar>
             <w:vAlign w:val="center"/>
           </w:tcPr>
-          <w:p>
+          <w:p ns2:paraId="5F272931" ns2:textId="77777777">
             <w:pPr>
               <w:jc w:val="right"/>
             </w:pPr>
@@ -6100,7 +6100,7 @@
             </w:tcMar>
             <w:vAlign w:val="center"/>
           </w:tcPr>
-          <w:p>
+          <w:p ns2:paraId="7C6416F0" ns2:textId="77777777">
             <w:pPr>
               <w:jc w:val="right"/>
             </w:pPr>
@@ -6115,7 +6115,7 @@
           </w:p>
         </w:tc>
       </w:tr>
-      <w:tr>
+      <w:tr ns2:paraId="10C72D9F" ns2:textId="77777777">
         <w:tblPrEx>
           <w:tblCellMar>
             <w:top w:w="0" w:type="dxa"/>
@@ -6140,7 +6140,7 @@
             </w:tcMar>
             <w:vAlign w:val="center"/>
           </w:tcPr>
-          <w:p>
+          <w:p ns2:paraId="36970F5A" ns2:textId="77777777">
             <w:r>
               <w:rPr>
                 <w:color w:val="595959"/>
@@ -6168,7 +6168,7 @@
             </w:tcMar>
             <w:vAlign w:val="center"/>
           </w:tcPr>
-          <w:p>
+          <w:p ns2:paraId="5C34CD5B" ns2:textId="77777777">
             <w:pPr>
               <w:jc w:val="right"/>
             </w:pPr>
@@ -6199,7 +6199,7 @@
             </w:tcMar>
             <w:vAlign w:val="center"/>
           </w:tcPr>
-          <w:p>
+          <w:p ns2:paraId="70B6F7D8" ns2:textId="77777777">
             <w:pPr>
               <w:jc w:val="right"/>
             </w:pPr>
@@ -6230,7 +6230,7 @@
             </w:tcMar>
             <w:vAlign w:val="center"/>
           </w:tcPr>
-          <w:p>
+          <w:p ns2:paraId="364F06DD" ns2:textId="77777777">
             <w:pPr>
               <w:jc w:val="right"/>
             </w:pPr>
@@ -6245,7 +6245,7 @@
           </w:p>
         </w:tc>
       </w:tr>
-      <w:tr>
+      <w:tr ns2:paraId="776BE358" ns2:textId="77777777">
         <w:tblPrEx>
           <w:tblCellMar>
             <w:top w:w="0" w:type="dxa"/>
@@ -6270,7 +6270,7 @@
             </w:tcMar>
             <w:vAlign w:val="center"/>
           </w:tcPr>
-          <w:p>
+          <w:p ns2:paraId="442DDE5D" ns2:textId="77777777">
             <w:r>
               <w:rPr>
                 <w:color w:val="595959"/>
@@ -6298,7 +6298,7 @@
             </w:tcMar>
             <w:vAlign w:val="center"/>
           </w:tcPr>
-          <w:p>
+          <w:p ns2:paraId="2EB87911" ns2:textId="77777777">
             <w:pPr>
               <w:jc w:val="right"/>
             </w:pPr>
@@ -6329,7 +6329,7 @@
             </w:tcMar>
             <w:vAlign w:val="center"/>
           </w:tcPr>
-          <w:p>
+          <w:p ns2:paraId="76094E80" ns2:textId="77777777">
             <w:pPr>
               <w:jc w:val="right"/>
             </w:pPr>
@@ -6360,7 +6360,7 @@
             </w:tcMar>
             <w:vAlign w:val="center"/>
           </w:tcPr>
-          <w:p>
+          <w:p ns2:paraId="5E156FB9" ns2:textId="77777777">
             <w:pPr>
               <w:jc w:val="right"/>
             </w:pPr>
@@ -6375,7 +6375,7 @@
           </w:p>
         </w:tc>
       </w:tr>
-      <w:tr>
+      <w:tr ns2:paraId="6B493209" ns2:textId="77777777">
         <w:tblPrEx>
           <w:tblCellMar>
             <w:top w:w="0" w:type="dxa"/>
@@ -6400,7 +6400,7 @@
             </w:tcMar>
             <w:vAlign w:val="center"/>
           </w:tcPr>
-          <w:p>
+          <w:p ns2:paraId="00FDB0B1" ns2:textId="77777777">
             <w:r>
               <w:rPr>
                 <w:color w:val="595959"/>
@@ -6428,7 +6428,7 @@
             </w:tcMar>
             <w:vAlign w:val="center"/>
           </w:tcPr>
-          <w:p>
+          <w:p ns2:paraId="1F702462" ns2:textId="77777777">
             <w:pPr>
               <w:jc w:val="right"/>
             </w:pPr>
@@ -6459,7 +6459,7 @@
             </w:tcMar>
             <w:vAlign w:val="center"/>
           </w:tcPr>
-          <w:p>
+          <w:p ns2:paraId="2C309247" ns2:textId="77777777">
             <w:pPr>
               <w:jc w:val="right"/>
             </w:pPr>
@@ -6490,7 +6490,7 @@
             </w:tcMar>
             <w:vAlign w:val="center"/>
           </w:tcPr>
-          <w:p>
+          <w:p ns2:paraId="5E68887E" ns2:textId="77777777">
             <w:pPr>
               <w:jc w:val="right"/>
             </w:pPr>
@@ -6505,7 +6505,7 @@
           </w:p>
         </w:tc>
       </w:tr>
-      <w:tr>
+      <w:tr ns2:paraId="53CA870C" ns2:textId="77777777">
         <w:tblPrEx>
           <w:tblCellMar>
             <w:top w:w="0" w:type="dxa"/>
@@ -6530,7 +6530,7 @@
             </w:tcMar>
             <w:vAlign w:val="center"/>
           </w:tcPr>
-          <w:p>
+          <w:p ns2:paraId="721166C6" ns2:textId="77777777">
             <w:proofErr w:type="gramStart"/>
             <w:r>
               <w:rPr>
@@ -6568,7 +6568,7 @@
             </w:tcMar>
             <w:vAlign w:val="center"/>
           </w:tcPr>
-          <w:p>
+          <w:p ns2:paraId="20A09C2A" ns2:textId="77777777">
             <w:pPr>
               <w:jc w:val="right"/>
             </w:pPr>
@@ -6599,7 +6599,7 @@
             </w:tcMar>
             <w:vAlign w:val="center"/>
           </w:tcPr>
-          <w:p>
+          <w:p ns2:paraId="4C93AFD4" ns2:textId="77777777">
             <w:pPr>
               <w:jc w:val="right"/>
             </w:pPr>
@@ -6630,7 +6630,7 @@
             </w:tcMar>
             <w:vAlign w:val="center"/>
           </w:tcPr>
-          <w:p>
+          <w:p ns2:paraId="58CD372C" ns2:textId="77777777">
             <w:pPr>
               <w:jc w:val="right"/>
             </w:pPr>
@@ -6645,7 +6645,7 @@
           </w:p>
         </w:tc>
       </w:tr>
-      <w:tr>
+      <w:tr ns2:paraId="1DE7219A" ns2:textId="77777777">
         <w:tblPrEx>
           <w:tblCellMar>
             <w:top w:w="0" w:type="dxa"/>
@@ -6670,7 +6670,7 @@
             </w:tcMar>
             <w:vAlign w:val="center"/>
           </w:tcPr>
-          <w:p>
+          <w:p ns2:paraId="1BABBF10" ns2:textId="77777777">
             <w:proofErr w:type="gramStart"/>
             <w:r>
               <w:rPr>
@@ -6708,7 +6708,7 @@
             </w:tcMar>
             <w:vAlign w:val="center"/>
           </w:tcPr>
-          <w:p>
+          <w:p ns2:paraId="26CD8B47" ns2:textId="77777777">
             <w:pPr>
               <w:jc w:val="right"/>
             </w:pPr>
@@ -6739,7 +6739,7 @@
             </w:tcMar>
             <w:vAlign w:val="center"/>
           </w:tcPr>
-          <w:p>
+          <w:p ns2:paraId="3664DAB1" ns2:textId="77777777">
             <w:pPr>
               <w:jc w:val="right"/>
             </w:pPr>
@@ -6770,7 +6770,7 @@
             </w:tcMar>
             <w:vAlign w:val="center"/>
           </w:tcPr>
-          <w:p>
+          <w:p ns2:paraId="56267F1B" ns2:textId="77777777">
             <w:pPr>
               <w:jc w:val="right"/>
             </w:pPr>
@@ -6785,7 +6785,7 @@
           </w:p>
         </w:tc>
       </w:tr>
-      <w:tr>
+      <w:tr ns2:paraId="6A71E687" ns2:textId="77777777">
         <w:tblPrEx>
           <w:tblCellMar>
             <w:top w:w="0" w:type="dxa"/>
@@ -6810,7 +6810,7 @@
             </w:tcMar>
             <w:vAlign w:val="center"/>
           </w:tcPr>
-          <w:p>
+          <w:p ns2:paraId="4700CEE9" ns2:textId="77777777">
             <w:proofErr w:type="gramStart"/>
             <w:r>
               <w:rPr>
@@ -6848,7 +6848,7 @@
             </w:tcMar>
             <w:vAlign w:val="center"/>
           </w:tcPr>
-          <w:p>
+          <w:p ns2:paraId="050EA2CE" ns2:textId="77777777">
             <w:pPr>
               <w:jc w:val="right"/>
             </w:pPr>
@@ -6879,7 +6879,7 @@
             </w:tcMar>
             <w:vAlign w:val="center"/>
           </w:tcPr>
-          <w:p>
+          <w:p ns2:paraId="1D886A5E" ns2:textId="77777777">
             <w:pPr>
               <w:jc w:val="right"/>
             </w:pPr>
@@ -6910,7 +6910,7 @@
             </w:tcMar>
             <w:vAlign w:val="center"/>
           </w:tcPr>
-          <w:p>
+          <w:p ns2:paraId="15654E1A" ns2:textId="77777777">
             <w:pPr>
               <w:jc w:val="right"/>
             </w:pPr>
@@ -6926,7 +6926,7 @@
         </w:tc>
       </w:tr>
     </w:tbl>
-    <w:p>
+    <w:p ns2:paraId="2EA5B3E4" ns2:textId="77777777">
       <w:pPr>
         <w:spacing w:after="180"/>
         <w:jc w:val="center"/>
@@ -6938,7 +6938,7 @@
         <w:t>Table 5: Convergence diagnostics. All values from actual output.</w:t>
       </w:r>
     </w:p>
-    <w:p>
+    <w:p ns2:paraId="25F30C6B" ns2:textId="77777777">
       <w:pPr>
         <w:spacing w:after="100"/>
         <w:jc w:val="both"/>
@@ -6964,12 +6964,12 @@
         <w:t>2,2]) reflects slightly higher posterior autocorrelation in the exchange rate variance, consistent with the near-unit-root PLN/EUR dynamics.</w:t>
       </w:r>
     </w:p>
-    <w:p>
+    <w:p ns2:paraId="78302F7F" ns2:textId="77777777">
       <w:pPr>
         <w:spacing w:after="80"/>
       </w:pPr>
     </w:p>
-    <w:p>
+    <w:p ns2:paraId="6B9B180A" ns2:textId="77777777">
       <w:pPr>
         <w:spacing w:before="140" w:after="60"/>
         <w:jc w:val="center"/>
@@ -6979,46 +6979,46 @@
           <w:noProof/>
         </w:rPr>
         <w:drawing>
-          <wp:inline distT="0" distB="0" distL="0" distR="0" wp14:anchorId="5D3DF77E" wp14:editId="2D4C8AD8">
-            <wp:extent cx="5943600" cy="4572000"/>
-            <wp:effectExtent l="0" t="0" r="0" b="0"/>
-            <wp:docPr id="261973125" name="Picture 261973125"/>
-            <wp:cNvGraphicFramePr>
-              <a:graphicFrameLocks xmlns:a="http://schemas.openxmlformats.org/drawingml/2006/main" noChangeAspect="1"/>
-            </wp:cNvGraphicFramePr>
-            <a:graphic xmlns:a="http://schemas.openxmlformats.org/drawingml/2006/main">
-              <a:graphicData uri="http://schemas.openxmlformats.org/drawingml/2006/picture">
-                <pic:pic xmlns:pic="http://schemas.openxmlformats.org/drawingml/2006/picture">
-                  <pic:nvPicPr>
-                    <pic:cNvPr id="0" name=""/>
-                    <pic:cNvPicPr>
-                      <a:picLocks noChangeAspect="1" noChangeArrowheads="1"/>
-                    </pic:cNvPicPr>
-                  </pic:nvPicPr>
-                  <pic:blipFill>
-                    <a:blip r:embed="rId10"/>
-                    <a:srcRect/>
-                    <a:stretch>
-                      <a:fillRect/>
-                    </a:stretch>
-                  </pic:blipFill>
-                  <pic:spPr bwMode="auto">
-                    <a:xfrm>
-                      <a:off x="0" y="0"/>
-                      <a:ext cx="5943600" cy="4572000"/>
-                    </a:xfrm>
-                    <a:prstGeom prst="rect">
-                      <a:avLst/>
-                    </a:prstGeom>
-                  </pic:spPr>
-                </pic:pic>
-              </a:graphicData>
-            </a:graphic>
-          </wp:inline>
+          <ns3:inline distT="0" distB="0" distL="0" distR="0" ns4:anchorId="5D3DF77E" ns4:editId="2D4C8AD8">
+            <ns3:extent cx="5943600" cy="4572000"/>
+            <ns3:effectExtent l="0" t="0" r="0" b="0"/>
+            <ns3:docPr id="261973125" name="Picture 261973125"/>
+            <ns3:cNvGraphicFramePr>
+              <ns5:graphicFrameLocks noChangeAspect="1"/>
+            </ns3:cNvGraphicFramePr>
+            <ns5:graphic>
+              <ns5:graphicData uri="http://schemas.openxmlformats.org/drawingml/2006/picture">
+                <ns6:pic>
+                  <ns6:nvPicPr>
+                    <ns6:cNvPr id="0" name=""/>
+                    <ns6:cNvPicPr>
+                      <ns5:picLocks noChangeAspect="1" noChangeArrowheads="1"/>
+                    </ns6:cNvPicPr>
+                  </ns6:nvPicPr>
+                  <ns6:blipFill>
+                    <ns5:blip ns7:embed="rId10"/>
+                    <ns5:srcRect/>
+                    <ns5:stretch>
+                      <ns5:fillRect/>
+                    </ns5:stretch>
+                  </ns6:blipFill>
+                  <ns6:spPr bwMode="auto">
+                    <ns5:xfrm>
+                      <ns5:off x="0" y="0"/>
+                      <ns5:ext cx="5943600" cy="4572000"/>
+                    </ns5:xfrm>
+                    <ns5:prstGeom prst="rect">
+                      <ns5:avLst/>
+                    </ns5:prstGeom>
+                  </ns6:spPr>
+                </ns6:pic>
+              </ns5:graphicData>
+            </ns5:graphic>
+          </ns3:inline>
         </w:drawing>
       </w:r>
     </w:p>
-    <w:p>
+    <w:p ns2:paraId="37F6300B" ns2:textId="77777777">
       <w:pPr>
         <w:spacing w:after="160"/>
         <w:jc w:val="center"/>
@@ -7030,7 +7030,7 @@
         <w:t>Figure 4: Trace plots and ACF. ACF drops to near-zero at lag 1 for all chains.</w:t>
       </w:r>
     </w:p>
-    <w:p>
+    <w:p ns2:paraId="7A9DEBF0" ns2:textId="77777777">
       <w:pPr>
         <w:spacing w:before="140" w:after="60"/>
         <w:jc w:val="center"/>
@@ -7040,46 +7040,46 @@
           <w:noProof/>
         </w:rPr>
         <w:drawing>
-          <wp:inline distT="0" distB="0" distL="0" distR="0" wp14:anchorId="6C7753C9" wp14:editId="38D645A0">
-            <wp:extent cx="5762625" cy="2009775"/>
-            <wp:effectExtent l="0" t="0" r="0" b="0"/>
-            <wp:docPr id="1161988109" name="Picture 1161988109"/>
-            <wp:cNvGraphicFramePr>
-              <a:graphicFrameLocks xmlns:a="http://schemas.openxmlformats.org/drawingml/2006/main" noChangeAspect="1"/>
-            </wp:cNvGraphicFramePr>
-            <a:graphic xmlns:a="http://schemas.openxmlformats.org/drawingml/2006/main">
-              <a:graphicData uri="http://schemas.openxmlformats.org/drawingml/2006/picture">
-                <pic:pic xmlns:pic="http://schemas.openxmlformats.org/drawingml/2006/picture">
-                  <pic:nvPicPr>
-                    <pic:cNvPr id="0" name=""/>
-                    <pic:cNvPicPr>
-                      <a:picLocks noChangeAspect="1" noChangeArrowheads="1"/>
-                    </pic:cNvPicPr>
-                  </pic:nvPicPr>
-                  <pic:blipFill>
-                    <a:blip r:embed="rId11"/>
-                    <a:srcRect/>
-                    <a:stretch>
-                      <a:fillRect/>
-                    </a:stretch>
-                  </pic:blipFill>
-                  <pic:spPr bwMode="auto">
-                    <a:xfrm>
-                      <a:off x="0" y="0"/>
-                      <a:ext cx="5762625" cy="2009775"/>
-                    </a:xfrm>
-                    <a:prstGeom prst="rect">
-                      <a:avLst/>
-                    </a:prstGeom>
-                  </pic:spPr>
-                </pic:pic>
-              </a:graphicData>
-            </a:graphic>
-          </wp:inline>
+          <ns3:inline distT="0" distB="0" distL="0" distR="0" ns4:anchorId="6C7753C9" ns4:editId="38D645A0">
+            <ns3:extent cx="5762625" cy="2009775"/>
+            <ns3:effectExtent l="0" t="0" r="0" b="0"/>
+            <ns3:docPr id="1161988109" name="Picture 1161988109"/>
+            <ns3:cNvGraphicFramePr>
+              <ns5:graphicFrameLocks noChangeAspect="1"/>
+            </ns3:cNvGraphicFramePr>
+            <ns5:graphic>
+              <ns5:graphicData uri="http://schemas.openxmlformats.org/drawingml/2006/picture">
+                <ns6:pic>
+                  <ns6:nvPicPr>
+                    <ns6:cNvPr id="0" name=""/>
+                    <ns6:cNvPicPr>
+                      <ns5:picLocks noChangeAspect="1" noChangeArrowheads="1"/>
+                    </ns6:cNvPicPr>
+                  </ns6:nvPicPr>
+                  <ns6:blipFill>
+                    <ns5:blip ns7:embed="rId11"/>
+                    <ns5:srcRect/>
+                    <ns5:stretch>
+                      <ns5:fillRect/>
+                    </ns5:stretch>
+                  </ns6:blipFill>
+                  <ns6:spPr bwMode="auto">
+                    <ns5:xfrm>
+                      <ns5:off x="0" y="0"/>
+                      <ns5:ext cx="5762625" cy="2009775"/>
+                    </ns5:xfrm>
+                    <ns5:prstGeom prst="rect">
+                      <ns5:avLst/>
+                    </ns5:prstGeom>
+                  </ns6:spPr>
+                </ns6:pic>
+              </ns5:graphicData>
+            </ns5:graphic>
+          </ns3:inline>
         </w:drawing>
       </w:r>
     </w:p>
-    <w:p>
+    <w:p ns2:paraId="17713D24" ns2:textId="77777777">
       <w:pPr>
         <w:spacing w:after="160"/>
         <w:jc w:val="center"/>
@@ -7105,12 +7105,12 @@
         <w:t xml:space="preserve"> within first ~500 draws confirms 4,000 burn-in is conservative.</w:t>
       </w:r>
     </w:p>
-    <w:p>
+    <w:p ns2:paraId="6E4357BB" ns2:textId="77777777">
       <w:r>
         <w:br w:type="page"/>
       </w:r>
     </w:p>
-    <w:p>
+    <w:p ns2:paraId="28898FFB" ns2:textId="77777777">
       <w:pPr>
         <w:pStyle w:val="Heading2"/>
         <w:spacing w:before="340" w:after="120"/>
@@ -7120,7 +7120,7 @@
         <w:t>4.3 Structural Impulse Response Functions</w:t>
       </w:r>
     </w:p>
-    <w:p>
+    <w:p ns2:paraId="40654B27" ns2:textId="77777777">
       <w:pPr>
         <w:spacing w:after="100"/>
         <w:jc w:val="both"/>
@@ -7140,12 +7140,12 @@
         <w:t>The central result. CPI shows a mild positive blip of about +0.05 pp in months 0–3, then turns clearly negative, reaching approximately −0.3 pp by month 24 and −0.45 pp by month 36. The 68% credible band excludes zero from around month 8 onward. This is the standard contractionary transmission: a rate increase eventually reduces inflation. The initial positive blip is very mild and resolves within 5 months — it does not constitute a persistent price puzzle. The policy rate rises ~0.18 pp on impact and decays over 15 months. PLN/EUR drops on impact (PLN appreciation, ~−0.005), consistent with uncovered interest parity.</w:t>
       </w:r>
     </w:p>
-    <w:p>
+    <w:p ns2:paraId="0900EF23" ns2:textId="77777777">
       <w:pPr>
         <w:spacing w:after="80"/>
       </w:pPr>
     </w:p>
-    <w:p>
+    <w:p ns2:paraId="03E2CEA3" ns2:textId="77777777">
       <w:pPr>
         <w:spacing w:before="140" w:after="60"/>
         <w:jc w:val="center"/>
@@ -7155,46 +7155,46 @@
           <w:noProof/>
         </w:rPr>
         <w:drawing>
-          <wp:inline distT="0" distB="0" distL="0" distR="0" wp14:anchorId="0F39CB7E" wp14:editId="37405560">
-            <wp:extent cx="5943600" cy="2466975"/>
-            <wp:effectExtent l="0" t="0" r="0" b="0"/>
-            <wp:docPr id="2075919551" name="Picture 2075919551"/>
-            <wp:cNvGraphicFramePr>
-              <a:graphicFrameLocks xmlns:a="http://schemas.openxmlformats.org/drawingml/2006/main" noChangeAspect="1"/>
-            </wp:cNvGraphicFramePr>
-            <a:graphic xmlns:a="http://schemas.openxmlformats.org/drawingml/2006/main">
-              <a:graphicData uri="http://schemas.openxmlformats.org/drawingml/2006/picture">
-                <pic:pic xmlns:pic="http://schemas.openxmlformats.org/drawingml/2006/picture">
-                  <pic:nvPicPr>
-                    <pic:cNvPr id="0" name=""/>
-                    <pic:cNvPicPr>
-                      <a:picLocks noChangeAspect="1" noChangeArrowheads="1"/>
-                    </pic:cNvPicPr>
-                  </pic:nvPicPr>
-                  <pic:blipFill>
-                    <a:blip r:embed="rId12"/>
-                    <a:srcRect/>
-                    <a:stretch>
-                      <a:fillRect/>
-                    </a:stretch>
-                  </pic:blipFill>
-                  <pic:spPr bwMode="auto">
-                    <a:xfrm>
-                      <a:off x="0" y="0"/>
-                      <a:ext cx="5943600" cy="2466975"/>
-                    </a:xfrm>
-                    <a:prstGeom prst="rect">
-                      <a:avLst/>
-                    </a:prstGeom>
-                  </pic:spPr>
-                </pic:pic>
-              </a:graphicData>
-            </a:graphic>
-          </wp:inline>
+          <ns3:inline distT="0" distB="0" distL="0" distR="0" ns4:anchorId="0F39CB7E" ns4:editId="37405560">
+            <ns3:extent cx="5943600" cy="2466975"/>
+            <ns3:effectExtent l="0" t="0" r="0" b="0"/>
+            <ns3:docPr id="2075919551" name="Picture 2075919551"/>
+            <ns3:cNvGraphicFramePr>
+              <ns5:graphicFrameLocks noChangeAspect="1"/>
+            </ns3:cNvGraphicFramePr>
+            <ns5:graphic>
+              <ns5:graphicData uri="http://schemas.openxmlformats.org/drawingml/2006/picture">
+                <ns6:pic>
+                  <ns6:nvPicPr>
+                    <ns6:cNvPr id="0" name=""/>
+                    <ns6:cNvPicPr>
+                      <ns5:picLocks noChangeAspect="1" noChangeArrowheads="1"/>
+                    </ns6:cNvPicPr>
+                  </ns6:nvPicPr>
+                  <ns6:blipFill>
+                    <ns5:blip ns7:embed="rId12"/>
+                    <ns5:srcRect/>
+                    <ns5:stretch>
+                      <ns5:fillRect/>
+                    </ns5:stretch>
+                  </ns6:blipFill>
+                  <ns6:spPr bwMode="auto">
+                    <ns5:xfrm>
+                      <ns5:off x="0" y="0"/>
+                      <ns5:ext cx="5943600" cy="2466975"/>
+                    </ns5:xfrm>
+                    <ns5:prstGeom prst="rect">
+                      <ns5:avLst/>
+                    </ns5:prstGeom>
+                  </ns6:spPr>
+                </ns6:pic>
+              </ns5:graphicData>
+            </ns5:graphic>
+          </ns3:inline>
         </w:drawing>
       </w:r>
     </w:p>
-    <w:p>
+    <w:p ns2:paraId="2F1DEA2E" ns2:textId="77777777">
       <w:pPr>
         <w:spacing w:after="160"/>
         <w:jc w:val="center"/>
@@ -7206,7 +7206,7 @@
         <w:t>Figure 6: Structural IRF to a one-S.D. positive rate shock. CPI turns negative after month 3 — standard contractionary transmission. Dark: 68% CI. Light: 90% CI.</w:t>
       </w:r>
     </w:p>
-    <w:p>
+    <w:p ns2:paraId="29ADAB92" ns2:textId="77777777">
       <w:pPr>
         <w:spacing w:after="100"/>
         <w:jc w:val="both"/>
@@ -7226,12 +7226,12 @@
         <w:t>A positive CPI shock has a persistent own effect (0.7 pp on impact, decaying over 36 months). The rate responds with a lag of 1–2 months, reaching +0.25 pp by month 20 — a clear Taylor rule reaction. PLN/EUR shows modest depreciation (+0.015 by month 8), consistent with higher inflation weakening the currency.</w:t>
       </w:r>
     </w:p>
-    <w:p>
+    <w:p ns2:paraId="069BD71C" ns2:textId="77777777">
       <w:pPr>
         <w:spacing w:after="80"/>
       </w:pPr>
     </w:p>
-    <w:p>
+    <w:p ns2:paraId="23980332" ns2:textId="77777777">
       <w:pPr>
         <w:spacing w:before="140" w:after="60"/>
         <w:jc w:val="center"/>
@@ -7241,46 +7241,46 @@
           <w:noProof/>
         </w:rPr>
         <w:drawing>
-          <wp:inline distT="0" distB="0" distL="0" distR="0" wp14:anchorId="3A180AFC" wp14:editId="476A277C">
-            <wp:extent cx="5943600" cy="2466975"/>
-            <wp:effectExtent l="0" t="0" r="0" b="0"/>
-            <wp:docPr id="466176833" name="Picture 466176833"/>
-            <wp:cNvGraphicFramePr>
-              <a:graphicFrameLocks xmlns:a="http://schemas.openxmlformats.org/drawingml/2006/main" noChangeAspect="1"/>
-            </wp:cNvGraphicFramePr>
-            <a:graphic xmlns:a="http://schemas.openxmlformats.org/drawingml/2006/main">
-              <a:graphicData uri="http://schemas.openxmlformats.org/drawingml/2006/picture">
-                <pic:pic xmlns:pic="http://schemas.openxmlformats.org/drawingml/2006/picture">
-                  <pic:nvPicPr>
-                    <pic:cNvPr id="0" name=""/>
-                    <pic:cNvPicPr>
-                      <a:picLocks noChangeAspect="1" noChangeArrowheads="1"/>
-                    </pic:cNvPicPr>
-                  </pic:nvPicPr>
-                  <pic:blipFill>
-                    <a:blip r:embed="rId13"/>
-                    <a:srcRect/>
-                    <a:stretch>
-                      <a:fillRect/>
-                    </a:stretch>
-                  </pic:blipFill>
-                  <pic:spPr bwMode="auto">
-                    <a:xfrm>
-                      <a:off x="0" y="0"/>
-                      <a:ext cx="5943600" cy="2466975"/>
-                    </a:xfrm>
-                    <a:prstGeom prst="rect">
-                      <a:avLst/>
-                    </a:prstGeom>
-                  </pic:spPr>
-                </pic:pic>
-              </a:graphicData>
-            </a:graphic>
-          </wp:inline>
+          <ns3:inline distT="0" distB="0" distL="0" distR="0" ns4:anchorId="3A180AFC" ns4:editId="476A277C">
+            <ns3:extent cx="5943600" cy="2466975"/>
+            <ns3:effectExtent l="0" t="0" r="0" b="0"/>
+            <ns3:docPr id="466176833" name="Picture 466176833"/>
+            <ns3:cNvGraphicFramePr>
+              <ns5:graphicFrameLocks noChangeAspect="1"/>
+            </ns3:cNvGraphicFramePr>
+            <ns5:graphic>
+              <ns5:graphicData uri="http://schemas.openxmlformats.org/drawingml/2006/picture">
+                <ns6:pic>
+                  <ns6:nvPicPr>
+                    <ns6:cNvPr id="0" name=""/>
+                    <ns6:cNvPicPr>
+                      <ns5:picLocks noChangeAspect="1" noChangeArrowheads="1"/>
+                    </ns6:cNvPicPr>
+                  </ns6:nvPicPr>
+                  <ns6:blipFill>
+                    <ns5:blip ns7:embed="rId13"/>
+                    <ns5:srcRect/>
+                    <ns5:stretch>
+                      <ns5:fillRect/>
+                    </ns5:stretch>
+                  </ns6:blipFill>
+                  <ns6:spPr bwMode="auto">
+                    <ns5:xfrm>
+                      <ns5:off x="0" y="0"/>
+                      <ns5:ext cx="5943600" cy="2466975"/>
+                    </ns5:xfrm>
+                    <ns5:prstGeom prst="rect">
+                      <ns5:avLst/>
+                    </ns5:prstGeom>
+                  </ns6:spPr>
+                </ns6:pic>
+              </ns5:graphicData>
+            </ns5:graphic>
+          </ns3:inline>
         </w:drawing>
       </w:r>
     </w:p>
-    <w:p>
+    <w:p ns2:paraId="19BF6D95" ns2:textId="77777777">
       <w:pPr>
         <w:spacing w:after="160"/>
         <w:jc w:val="center"/>
@@ -7307,7 +7307,7 @@
         <w:t xml:space="preserve"> lag (Taylor rule). PLN depreciates.</w:t>
       </w:r>
     </w:p>
-    <w:p>
+    <w:p ns2:paraId="5FDBAD7E" ns2:textId="77777777">
       <w:pPr>
         <w:spacing w:after="100"/>
         <w:jc w:val="both"/>
@@ -7327,12 +7327,12 @@
         <w:t>A PLN depreciation shock (+0.06 on impact) produces a moderate inflationary pass-through, with the median CPI response peaking at +0.10 pp around month 15. The rate response is uncertain: the 90% CI includes both positive and negative values throughout, reflecting that the NBP’s exchange rate response is ambiguous in the sample.</w:t>
       </w:r>
     </w:p>
-    <w:p>
+    <w:p ns2:paraId="099B95BD" ns2:textId="77777777">
       <w:pPr>
         <w:spacing w:after="80"/>
       </w:pPr>
     </w:p>
-    <w:p>
+    <w:p ns2:paraId="30CC3AC5" ns2:textId="77777777">
       <w:pPr>
         <w:spacing w:before="140" w:after="60"/>
         <w:jc w:val="center"/>
@@ -7342,46 +7342,46 @@
           <w:noProof/>
         </w:rPr>
         <w:drawing>
-          <wp:inline distT="0" distB="0" distL="0" distR="0" wp14:anchorId="4E7993E4" wp14:editId="292B757C">
-            <wp:extent cx="5943600" cy="2466975"/>
-            <wp:effectExtent l="0" t="0" r="0" b="0"/>
-            <wp:docPr id="176017322" name="Picture 176017322"/>
-            <wp:cNvGraphicFramePr>
-              <a:graphicFrameLocks xmlns:a="http://schemas.openxmlformats.org/drawingml/2006/main" noChangeAspect="1"/>
-            </wp:cNvGraphicFramePr>
-            <a:graphic xmlns:a="http://schemas.openxmlformats.org/drawingml/2006/main">
-              <a:graphicData uri="http://schemas.openxmlformats.org/drawingml/2006/picture">
-                <pic:pic xmlns:pic="http://schemas.openxmlformats.org/drawingml/2006/picture">
-                  <pic:nvPicPr>
-                    <pic:cNvPr id="0" name=""/>
-                    <pic:cNvPicPr>
-                      <a:picLocks noChangeAspect="1" noChangeArrowheads="1"/>
-                    </pic:cNvPicPr>
-                  </pic:nvPicPr>
-                  <pic:blipFill>
-                    <a:blip r:embed="rId14"/>
-                    <a:srcRect/>
-                    <a:stretch>
-                      <a:fillRect/>
-                    </a:stretch>
-                  </pic:blipFill>
-                  <pic:spPr bwMode="auto">
-                    <a:xfrm>
-                      <a:off x="0" y="0"/>
-                      <a:ext cx="5943600" cy="2466975"/>
-                    </a:xfrm>
-                    <a:prstGeom prst="rect">
-                      <a:avLst/>
-                    </a:prstGeom>
-                  </pic:spPr>
-                </pic:pic>
-              </a:graphicData>
-            </a:graphic>
-          </wp:inline>
+          <ns3:inline distT="0" distB="0" distL="0" distR="0" ns4:anchorId="4E7993E4" ns4:editId="292B757C">
+            <ns3:extent cx="5943600" cy="2466975"/>
+            <ns3:effectExtent l="0" t="0" r="0" b="0"/>
+            <ns3:docPr id="176017322" name="Picture 176017322"/>
+            <ns3:cNvGraphicFramePr>
+              <ns5:graphicFrameLocks noChangeAspect="1"/>
+            </ns3:cNvGraphicFramePr>
+            <ns5:graphic>
+              <ns5:graphicData uri="http://schemas.openxmlformats.org/drawingml/2006/picture">
+                <ns6:pic>
+                  <ns6:nvPicPr>
+                    <ns6:cNvPr id="0" name=""/>
+                    <ns6:cNvPicPr>
+                      <ns5:picLocks noChangeAspect="1" noChangeArrowheads="1"/>
+                    </ns6:cNvPicPr>
+                  </ns6:nvPicPr>
+                  <ns6:blipFill>
+                    <ns5:blip ns7:embed="rId14"/>
+                    <ns5:srcRect/>
+                    <ns5:stretch>
+                      <ns5:fillRect/>
+                    </ns5:stretch>
+                  </ns6:blipFill>
+                  <ns6:spPr bwMode="auto">
+                    <ns5:xfrm>
+                      <ns5:off x="0" y="0"/>
+                      <ns5:ext cx="5943600" cy="2466975"/>
+                    </ns5:xfrm>
+                    <ns5:prstGeom prst="rect">
+                      <ns5:avLst/>
+                    </ns5:prstGeom>
+                  </ns6:spPr>
+                </ns6:pic>
+              </ns5:graphicData>
+            </ns5:graphic>
+          </ns3:inline>
         </w:drawing>
       </w:r>
     </w:p>
-    <w:p>
+    <w:p ns2:paraId="25F75981" ns2:textId="77777777">
       <w:pPr>
         <w:spacing w:after="160"/>
         <w:jc w:val="center"/>
@@ -7393,7 +7393,7 @@
         <w:t>Figure 8: IRF to PLN/EUR depreciation shock. Modest inflationary pass-through; rate response uncertain.</w:t>
       </w:r>
     </w:p>
-    <w:p>
+    <w:p ns2:paraId="1D317DB6" ns2:textId="77777777">
       <w:pPr>
         <w:pStyle w:val="Heading2"/>
         <w:spacing w:before="340" w:after="120"/>
@@ -7402,7 +7402,7 @@
         <w:t>4.4 BVAR vs Classical VAR</w:t>
       </w:r>
     </w:p>
-    <w:p>
+    <w:p ns2:paraId="0EB06C69" ns2:textId="77777777">
       <w:pPr>
         <w:spacing w:before="140" w:after="60"/>
         <w:jc w:val="center"/>
@@ -7412,46 +7412,46 @@
           <w:noProof/>
         </w:rPr>
         <w:drawing>
-          <wp:inline distT="0" distB="0" distL="0" distR="0" wp14:anchorId="0346DFDB" wp14:editId="510684D0">
-            <wp:extent cx="5943600" cy="2466975"/>
-            <wp:effectExtent l="0" t="0" r="0" b="0"/>
-            <wp:docPr id="1154188748" name="Picture 1154188748"/>
-            <wp:cNvGraphicFramePr>
-              <a:graphicFrameLocks xmlns:a="http://schemas.openxmlformats.org/drawingml/2006/main" noChangeAspect="1"/>
-            </wp:cNvGraphicFramePr>
-            <a:graphic xmlns:a="http://schemas.openxmlformats.org/drawingml/2006/main">
-              <a:graphicData uri="http://schemas.openxmlformats.org/drawingml/2006/picture">
-                <pic:pic xmlns:pic="http://schemas.openxmlformats.org/drawingml/2006/picture">
-                  <pic:nvPicPr>
-                    <pic:cNvPr id="0" name=""/>
-                    <pic:cNvPicPr>
-                      <a:picLocks noChangeAspect="1" noChangeArrowheads="1"/>
-                    </pic:cNvPicPr>
-                  </pic:nvPicPr>
-                  <pic:blipFill>
-                    <a:blip r:embed="rId15"/>
-                    <a:srcRect/>
-                    <a:stretch>
-                      <a:fillRect/>
-                    </a:stretch>
-                  </pic:blipFill>
-                  <pic:spPr bwMode="auto">
-                    <a:xfrm>
-                      <a:off x="0" y="0"/>
-                      <a:ext cx="5943600" cy="2466975"/>
-                    </a:xfrm>
-                    <a:prstGeom prst="rect">
-                      <a:avLst/>
-                    </a:prstGeom>
-                  </pic:spPr>
-                </pic:pic>
-              </a:graphicData>
-            </a:graphic>
-          </wp:inline>
+          <ns3:inline distT="0" distB="0" distL="0" distR="0" ns4:anchorId="0346DFDB" ns4:editId="510684D0">
+            <ns3:extent cx="5943600" cy="2466975"/>
+            <ns3:effectExtent l="0" t="0" r="0" b="0"/>
+            <ns3:docPr id="1154188748" name="Picture 1154188748"/>
+            <ns3:cNvGraphicFramePr>
+              <ns5:graphicFrameLocks noChangeAspect="1"/>
+            </ns3:cNvGraphicFramePr>
+            <ns5:graphic>
+              <ns5:graphicData uri="http://schemas.openxmlformats.org/drawingml/2006/picture">
+                <ns6:pic>
+                  <ns6:nvPicPr>
+                    <ns6:cNvPr id="0" name=""/>
+                    <ns6:cNvPicPr>
+                      <ns5:picLocks noChangeAspect="1" noChangeArrowheads="1"/>
+                    </ns6:cNvPicPr>
+                  </ns6:nvPicPr>
+                  <ns6:blipFill>
+                    <ns5:blip ns7:embed="rId15"/>
+                    <ns5:srcRect/>
+                    <ns5:stretch>
+                      <ns5:fillRect/>
+                    </ns5:stretch>
+                  </ns6:blipFill>
+                  <ns6:spPr bwMode="auto">
+                    <ns5:xfrm>
+                      <ns5:off x="0" y="0"/>
+                      <ns5:ext cx="5943600" cy="2466975"/>
+                    </ns5:xfrm>
+                    <ns5:prstGeom prst="rect">
+                      <ns5:avLst/>
+                    </ns5:prstGeom>
+                  </ns6:spPr>
+                </ns6:pic>
+              </ns5:graphicData>
+            </ns5:graphic>
+          </ns3:inline>
         </w:drawing>
       </w:r>
     </w:p>
-    <w:p>
+    <w:p ns2:paraId="213BC1F3" ns2:textId="77777777">
       <w:pPr>
         <w:spacing w:after="160"/>
         <w:jc w:val="center"/>
@@ -7477,7 +7477,7 @@
         <w:t xml:space="preserve"> the same negative long-run response.</w:t>
       </w:r>
     </w:p>
-    <w:p>
+    <w:p ns2:paraId="0C8C5DE6" ns2:textId="77777777">
       <w:pPr>
         <w:spacing w:after="100"/>
         <w:jc w:val="both"/>
@@ -7524,7 +7524,7 @@
         <w:t>=211.35.</w:t>
       </w:r>
     </w:p>
-    <w:p>
+    <w:p ns2:paraId="7FFAF321" ns2:textId="77777777">
       <w:pPr>
         <w:pStyle w:val="Heading2"/>
         <w:spacing w:before="340" w:after="120"/>
@@ -7533,7 +7533,7 @@
         <w:t>4.5 Forecast</w:t>
       </w:r>
     </w:p>
-    <w:p>
+    <w:p ns2:paraId="594E2A21" ns2:textId="77777777">
       <w:pPr>
         <w:spacing w:before="140" w:after="60"/>
         <w:jc w:val="center"/>
@@ -7543,46 +7543,46 @@
           <w:noProof/>
         </w:rPr>
         <w:drawing>
-          <wp:inline distT="0" distB="0" distL="0" distR="0" wp14:anchorId="0221F882" wp14:editId="6C474EA4">
-            <wp:extent cx="5762625" cy="3476625"/>
-            <wp:effectExtent l="0" t="0" r="0" b="0"/>
-            <wp:docPr id="1862835444" name="Picture 1862835444"/>
-            <wp:cNvGraphicFramePr>
-              <a:graphicFrameLocks xmlns:a="http://schemas.openxmlformats.org/drawingml/2006/main" noChangeAspect="1"/>
-            </wp:cNvGraphicFramePr>
-            <a:graphic xmlns:a="http://schemas.openxmlformats.org/drawingml/2006/main">
-              <a:graphicData uri="http://schemas.openxmlformats.org/drawingml/2006/picture">
-                <pic:pic xmlns:pic="http://schemas.openxmlformats.org/drawingml/2006/picture">
-                  <pic:nvPicPr>
-                    <pic:cNvPr id="0" name=""/>
-                    <pic:cNvPicPr>
-                      <a:picLocks noChangeAspect="1" noChangeArrowheads="1"/>
-                    </pic:cNvPicPr>
-                  </pic:nvPicPr>
-                  <pic:blipFill>
-                    <a:blip r:embed="rId16"/>
-                    <a:srcRect/>
-                    <a:stretch>
-                      <a:fillRect/>
-                    </a:stretch>
-                  </pic:blipFill>
-                  <pic:spPr bwMode="auto">
-                    <a:xfrm>
-                      <a:off x="0" y="0"/>
-                      <a:ext cx="5762625" cy="3476625"/>
-                    </a:xfrm>
-                    <a:prstGeom prst="rect">
-                      <a:avLst/>
-                    </a:prstGeom>
-                  </pic:spPr>
-                </pic:pic>
-              </a:graphicData>
-            </a:graphic>
-          </wp:inline>
+          <ns3:inline distT="0" distB="0" distL="0" distR="0" ns4:anchorId="0221F882" ns4:editId="6C474EA4">
+            <ns3:extent cx="5762625" cy="3476625"/>
+            <ns3:effectExtent l="0" t="0" r="0" b="0"/>
+            <ns3:docPr id="1862835444" name="Picture 1862835444"/>
+            <ns3:cNvGraphicFramePr>
+              <ns5:graphicFrameLocks noChangeAspect="1"/>
+            </ns3:cNvGraphicFramePr>
+            <ns5:graphic>
+              <ns5:graphicData uri="http://schemas.openxmlformats.org/drawingml/2006/picture">
+                <ns6:pic>
+                  <ns6:nvPicPr>
+                    <ns6:cNvPr id="0" name=""/>
+                    <ns6:cNvPicPr>
+                      <ns5:picLocks noChangeAspect="1" noChangeArrowheads="1"/>
+                    </ns6:cNvPicPr>
+                  </ns6:nvPicPr>
+                  <ns6:blipFill>
+                    <ns5:blip ns7:embed="rId16"/>
+                    <ns5:srcRect/>
+                    <ns5:stretch>
+                      <ns5:fillRect/>
+                    </ns5:stretch>
+                  </ns6:blipFill>
+                  <ns6:spPr bwMode="auto">
+                    <ns5:xfrm>
+                      <ns5:off x="0" y="0"/>
+                      <ns5:ext cx="5762625" cy="3476625"/>
+                    </ns5:xfrm>
+                    <ns5:prstGeom prst="rect">
+                      <ns5:avLst/>
+                    </ns5:prstGeom>
+                  </ns6:spPr>
+                </ns6:pic>
+              </ns5:graphicData>
+            </ns5:graphic>
+          </ns3:inline>
         </w:drawing>
       </w:r>
     </w:p>
-    <w:p>
+    <w:p ns2:paraId="26B3189E" ns2:textId="77777777">
       <w:pPr>
         <w:spacing w:after="160"/>
         <w:jc w:val="center"/>
@@ -7594,7 +7594,7 @@
         <w:t>Figure 10: 12-month posterior predictive forecast from April 2025. Predictive bands widen correctly over the horizon.</w:t>
       </w:r>
     </w:p>
-    <w:p>
+    <w:p ns2:paraId="3FC43D11" ns2:textId="77777777">
       <w:pPr>
         <w:spacing w:after="100"/>
         <w:jc w:val="both"/>
@@ -7606,12 +7606,12 @@
         <w:t>CPI is forecast to decline from ~5.3% toward 3–4% by early 2026. The rate edges down from ~5.7%. PLN/EUR remains stable around 4.15–4.20. The 90% bands correctly widen as near-unit-root dynamics compound forecast uncertainty.</w:t>
       </w:r>
     </w:p>
-    <w:p>
+    <w:p ns2:paraId="66677C95" ns2:textId="77777777">
       <w:r>
         <w:br w:type="page"/>
       </w:r>
     </w:p>
-    <w:p>
+    <w:p ns2:paraId="2B233DF1" ns2:textId="77777777">
       <w:pPr>
         <w:pStyle w:val="Heading1"/>
       </w:pPr>
@@ -7620,7 +7620,7 @@
         <w:t>5. Robustness Analysis</w:t>
       </w:r>
     </w:p>
-    <w:p>
+    <w:p ns2:paraId="020C09EA" ns2:textId="77777777">
       <w:pPr>
         <w:pStyle w:val="Heading2"/>
         <w:spacing w:before="340" w:after="120"/>
@@ -7629,7 +7629,7 @@
         <w:t>5.1 Identification Sensitivity</w:t>
       </w:r>
     </w:p>
-    <w:p>
+    <w:p ns2:paraId="22E514CD" ns2:textId="77777777">
       <w:pPr>
         <w:spacing w:after="100"/>
         <w:jc w:val="both"/>
@@ -7641,7 +7641,7 @@
         <w:t>Three Cholesky orderings are tested. This is the most informative robustness check because the CPI response to a rate shock is qualitatively different across orderings:</w:t>
       </w:r>
     </w:p>
-    <w:p>
+    <w:p ns2:paraId="495BB831" ns2:textId="77777777">
       <w:pPr>
         <w:pStyle w:val="ListParagraph"/>
         <w:numPr>
@@ -7657,7 +7657,7 @@
         <w:t>[CPI, Rate, FX] (baseline): CPI turns negative after month 3. Standard contractionary transmission.</w:t>
       </w:r>
     </w:p>
-    <w:p>
+    <w:p ns2:paraId="5EB617BA" ns2:textId="77777777">
       <w:pPr>
         <w:pStyle w:val="ListParagraph"/>
         <w:numPr>
@@ -7687,7 +7687,7 @@
         <w:t xml:space="preserve"> before turning negative. This ordering attributes more of the 2021–2022 inflation-rate co-movement to the rate shock, producing a genuine price puzzle.</w:t>
       </w:r>
     </w:p>
-    <w:p>
+    <w:p ns2:paraId="0AB911F1" ns2:textId="77777777">
       <w:pPr>
         <w:pStyle w:val="ListParagraph"/>
         <w:numPr>
@@ -7717,12 +7717,12 @@
         <w:t xml:space="preserve"> above. CPI starts positive (~+0.25 pp), declines gradually.</w:t>
       </w:r>
     </w:p>
-    <w:p>
+    <w:p ns2:paraId="78F1F615" ns2:textId="77777777">
       <w:pPr>
         <w:spacing w:after="80"/>
       </w:pPr>
     </w:p>
-    <w:p>
+    <w:p ns2:paraId="757A71EC" ns2:textId="77777777">
       <w:pPr>
         <w:spacing w:after="100"/>
         <w:jc w:val="both"/>
@@ -7734,12 +7734,12 @@
         <w:t>The takeaway: the baseline ordering [CPI, Rate, FX] produces the most theoretically coherent result because it correctly treats inflation as the slow-moving variable that cannot respond to rate decisions within the same month. When the rate is ordered first, the model cannot distinguish the NBP’s reactive rate hikes from autonomous policy shocks, so the co-movement during 2021–2022 appears as a price puzzle.</w:t>
       </w:r>
     </w:p>
-    <w:p>
+    <w:p ns2:paraId="757152F5" ns2:textId="77777777">
       <w:pPr>
         <w:spacing w:after="80"/>
       </w:pPr>
     </w:p>
-    <w:p>
+    <w:p ns2:paraId="17887452" ns2:textId="77777777">
       <w:pPr>
         <w:spacing w:before="140" w:after="60"/>
         <w:jc w:val="center"/>
@@ -7749,46 +7749,46 @@
           <w:noProof/>
         </w:rPr>
         <w:drawing>
-          <wp:inline distT="0" distB="0" distL="0" distR="0" wp14:anchorId="06A0EB5C" wp14:editId="6671E3B0">
-            <wp:extent cx="5943600" cy="2286000"/>
-            <wp:effectExtent l="0" t="0" r="0" b="0"/>
-            <wp:docPr id="700786046" name="Picture 700786046"/>
-            <wp:cNvGraphicFramePr>
-              <a:graphicFrameLocks xmlns:a="http://schemas.openxmlformats.org/drawingml/2006/main" noChangeAspect="1"/>
-            </wp:cNvGraphicFramePr>
-            <a:graphic xmlns:a="http://schemas.openxmlformats.org/drawingml/2006/main">
-              <a:graphicData uri="http://schemas.openxmlformats.org/drawingml/2006/picture">
-                <pic:pic xmlns:pic="http://schemas.openxmlformats.org/drawingml/2006/picture">
-                  <pic:nvPicPr>
-                    <pic:cNvPr id="0" name=""/>
-                    <pic:cNvPicPr>
-                      <a:picLocks noChangeAspect="1" noChangeArrowheads="1"/>
-                    </pic:cNvPicPr>
-                  </pic:nvPicPr>
-                  <pic:blipFill>
-                    <a:blip r:embed="rId17"/>
-                    <a:srcRect/>
-                    <a:stretch>
-                      <a:fillRect/>
-                    </a:stretch>
-                  </pic:blipFill>
-                  <pic:spPr bwMode="auto">
-                    <a:xfrm>
-                      <a:off x="0" y="0"/>
-                      <a:ext cx="5943600" cy="2286000"/>
-                    </a:xfrm>
-                    <a:prstGeom prst="rect">
-                      <a:avLst/>
-                    </a:prstGeom>
-                  </pic:spPr>
-                </pic:pic>
-              </a:graphicData>
-            </a:graphic>
-          </wp:inline>
+          <ns3:inline distT="0" distB="0" distL="0" distR="0" ns4:anchorId="06A0EB5C" ns4:editId="6671E3B0">
+            <ns3:extent cx="5943600" cy="2286000"/>
+            <ns3:effectExtent l="0" t="0" r="0" b="0"/>
+            <ns3:docPr id="700786046" name="Picture 700786046"/>
+            <ns3:cNvGraphicFramePr>
+              <ns5:graphicFrameLocks noChangeAspect="1"/>
+            </ns3:cNvGraphicFramePr>
+            <ns5:graphic>
+              <ns5:graphicData uri="http://schemas.openxmlformats.org/drawingml/2006/picture">
+                <ns6:pic>
+                  <ns6:nvPicPr>
+                    <ns6:cNvPr id="0" name=""/>
+                    <ns6:cNvPicPr>
+                      <ns5:picLocks noChangeAspect="1" noChangeArrowheads="1"/>
+                    </ns6:cNvPicPr>
+                  </ns6:nvPicPr>
+                  <ns6:blipFill>
+                    <ns5:blip ns7:embed="rId17"/>
+                    <ns5:srcRect/>
+                    <ns5:stretch>
+                      <ns5:fillRect/>
+                    </ns5:stretch>
+                  </ns6:blipFill>
+                  <ns6:spPr bwMode="auto">
+                    <ns5:xfrm>
+                      <ns5:off x="0" y="0"/>
+                      <ns5:ext cx="5943600" cy="2286000"/>
+                    </ns5:xfrm>
+                    <ns5:prstGeom prst="rect">
+                      <ns5:avLst/>
+                    </ns5:prstGeom>
+                  </ns6:spPr>
+                </ns6:pic>
+              </ns5:graphicData>
+            </ns5:graphic>
+          </ns3:inline>
         </w:drawing>
       </w:r>
     </w:p>
-    <w:p>
+    <w:p ns2:paraId="68E3363E" ns2:textId="77777777">
       <w:pPr>
         <w:spacing w:after="160"/>
         <w:jc w:val="center"/>
@@ -7800,7 +7800,7 @@
         <w:t>Figure 11: CPI response to rate shock under three Cholesky orderings. The baseline [CPI, Rate, FX] produces a negative response; alternative orderings show a positive response that reverses at longer horizons.</w:t>
       </w:r>
     </w:p>
-    <w:p>
+    <w:p ns2:paraId="6FA4DB29" ns2:textId="77777777">
       <w:pPr>
         <w:pStyle w:val="Heading2"/>
         <w:spacing w:before="340" w:after="120"/>
@@ -7809,7 +7809,7 @@
         <w:t>5.2 Prior Sensitivity</w:t>
       </w:r>
     </w:p>
-    <w:p>
+    <w:p ns2:paraId="2278B0A7" ns2:textId="77777777">
       <w:pPr>
         <w:spacing w:after="100"/>
         <w:jc w:val="both"/>
@@ -7835,7 +7835,7 @@
         <w:t>0.10, 0.20, 0.50}:</w:t>
       </w:r>
     </w:p>
-    <w:p>
+    <w:p ns2:paraId="0B1DBAC8" ns2:textId="77777777">
       <w:pPr>
         <w:pStyle w:val="ListParagraph"/>
         <w:numPr>
@@ -7851,7 +7851,7 @@
         <w:t>λ₁=0.10 (tight): CPI goes negative immediately — no positive blip at all. The shrinkage fully suppresses the initial co-movement.</w:t>
       </w:r>
     </w:p>
-    <w:p>
+    <w:p ns2:paraId="0E934268" ns2:textId="77777777">
       <w:pPr>
         <w:pStyle w:val="ListParagraph"/>
         <w:numPr>
@@ -7881,7 +7881,7 @@
         <w:t xml:space="preserve"> without dominating the data.</w:t>
       </w:r>
     </w:p>
-    <w:p>
+    <w:p ns2:paraId="426748A7" ns2:textId="77777777">
       <w:pPr>
         <w:pStyle w:val="ListParagraph"/>
         <w:numPr>
@@ -7911,7 +7911,7 @@
         <w:t>, where the cross-variable dynamics are less constrained.</w:t>
       </w:r>
     </w:p>
-    <w:p>
+    <w:p ns2:paraId="0F5B0357" ns2:textId="77777777">
       <w:pPr>
         <w:spacing w:after="100"/>
         <w:jc w:val="both"/>
@@ -7923,12 +7923,12 @@
         <w:t>All three calibrations converge to the same contractionary long-run response, confirming this is a robust data feature, not a prior artefact.</w:t>
       </w:r>
     </w:p>
-    <w:p>
+    <w:p ns2:paraId="319BDDD3" ns2:textId="77777777">
       <w:pPr>
         <w:spacing w:after="80"/>
       </w:pPr>
     </w:p>
-    <w:p>
+    <w:p ns2:paraId="4399AA7D" ns2:textId="77777777">
       <w:pPr>
         <w:spacing w:before="140" w:after="60"/>
         <w:jc w:val="center"/>
@@ -7938,46 +7938,46 @@
           <w:noProof/>
         </w:rPr>
         <w:drawing>
-          <wp:inline distT="0" distB="0" distL="0" distR="0" wp14:anchorId="3A38CAC7" wp14:editId="2FC80717">
-            <wp:extent cx="5667375" cy="2743200"/>
-            <wp:effectExtent l="0" t="0" r="0" b="0"/>
-            <wp:docPr id="1890068702" name="Picture 1890068702"/>
-            <wp:cNvGraphicFramePr>
-              <a:graphicFrameLocks xmlns:a="http://schemas.openxmlformats.org/drawingml/2006/main" noChangeAspect="1"/>
-            </wp:cNvGraphicFramePr>
-            <a:graphic xmlns:a="http://schemas.openxmlformats.org/drawingml/2006/main">
-              <a:graphicData uri="http://schemas.openxmlformats.org/drawingml/2006/picture">
-                <pic:pic xmlns:pic="http://schemas.openxmlformats.org/drawingml/2006/picture">
-                  <pic:nvPicPr>
-                    <pic:cNvPr id="0" name=""/>
-                    <pic:cNvPicPr>
-                      <a:picLocks noChangeAspect="1" noChangeArrowheads="1"/>
-                    </pic:cNvPicPr>
-                  </pic:nvPicPr>
-                  <pic:blipFill>
-                    <a:blip r:embed="rId18"/>
-                    <a:srcRect/>
-                    <a:stretch>
-                      <a:fillRect/>
-                    </a:stretch>
-                  </pic:blipFill>
-                  <pic:spPr bwMode="auto">
-                    <a:xfrm>
-                      <a:off x="0" y="0"/>
-                      <a:ext cx="5667375" cy="2743200"/>
-                    </a:xfrm>
-                    <a:prstGeom prst="rect">
-                      <a:avLst/>
-                    </a:prstGeom>
-                  </pic:spPr>
-                </pic:pic>
-              </a:graphicData>
-            </a:graphic>
-          </wp:inline>
+          <ns3:inline distT="0" distB="0" distL="0" distR="0" ns4:anchorId="3A38CAC7" ns4:editId="2FC80717">
+            <ns3:extent cx="5667375" cy="2743200"/>
+            <ns3:effectExtent l="0" t="0" r="0" b="0"/>
+            <ns3:docPr id="1890068702" name="Picture 1890068702"/>
+            <ns3:cNvGraphicFramePr>
+              <ns5:graphicFrameLocks noChangeAspect="1"/>
+            </ns3:cNvGraphicFramePr>
+            <ns5:graphic>
+              <ns5:graphicData uri="http://schemas.openxmlformats.org/drawingml/2006/picture">
+                <ns6:pic>
+                  <ns6:nvPicPr>
+                    <ns6:cNvPr id="0" name=""/>
+                    <ns6:cNvPicPr>
+                      <ns5:picLocks noChangeAspect="1" noChangeArrowheads="1"/>
+                    </ns6:cNvPicPr>
+                  </ns6:nvPicPr>
+                  <ns6:blipFill>
+                    <ns5:blip ns7:embed="rId18"/>
+                    <ns5:srcRect/>
+                    <ns5:stretch>
+                      <ns5:fillRect/>
+                    </ns5:stretch>
+                  </ns6:blipFill>
+                  <ns6:spPr bwMode="auto">
+                    <ns5:xfrm>
+                      <ns5:off x="0" y="0"/>
+                      <ns5:ext cx="5667375" cy="2743200"/>
+                    </ns5:xfrm>
+                    <ns5:prstGeom prst="rect">
+                      <ns5:avLst/>
+                    </ns5:prstGeom>
+                  </ns6:spPr>
+                </ns6:pic>
+              </ns5:graphicData>
+            </ns5:graphic>
+          </ns3:inline>
         </w:drawing>
       </w:r>
     </w:p>
-    <w:p>
+    <w:p ns2:paraId="792E5825" ns2:textId="77777777">
       <w:pPr>
         <w:spacing w:after="160"/>
         <w:jc w:val="center"/>
@@ -7989,7 +7989,7 @@
         <w:t>Figure 12: CPI response to rate shock under three prior tightness values. Tighter prior (λ₁=0.10, grey) eliminates initial positive blip; looser (λ₁=0.50, dark) amplifies it. All converge to negative response.</w:t>
       </w:r>
     </w:p>
-    <w:p>
+    <w:p ns2:paraId="01F88260" ns2:textId="77777777">
       <w:pPr>
         <w:pStyle w:val="Heading2"/>
         <w:spacing w:before="340" w:after="120"/>
@@ -7998,7 +7998,7 @@
         <w:t>5.3 First-Difference Robustness</w:t>
       </w:r>
     </w:p>
-    <w:p>
+    <w:p ns2:paraId="35AE44F6" ns2:textId="77777777">
       <w:pPr>
         <w:spacing w:after="100"/>
         <w:jc w:val="both"/>
@@ -8038,7 +8038,7 @@
         <w:t>1) evidence:</w:t>
       </w:r>
     </w:p>
-    <w:p>
+    <w:p ns2:paraId="79987206" ns2:textId="77777777">
       <w:pPr>
         <w:pStyle w:val="ListParagraph"/>
         <w:numPr>
@@ -8054,7 +8054,7 @@
         <w:t>The levels-based IRF (baseline) shows a clear negative CPI response with wide 80% credible bands.</w:t>
       </w:r>
     </w:p>
-    <w:p>
+    <w:p ns2:paraId="685B4D28" ns2:textId="77777777">
       <w:pPr>
         <w:pStyle w:val="ListParagraph"/>
         <w:numPr>
@@ -8070,7 +8070,7 @@
         <w:t>The first-difference IRF shows a very small positive blip that essentially returns to zero — a much weaker but directionally consistent effect with narrow bands.</w:t>
       </w:r>
     </w:p>
-    <w:p>
+    <w:p ns2:paraId="11ABF6D6" ns2:textId="77777777">
       <w:pPr>
         <w:spacing w:after="100"/>
         <w:jc w:val="both"/>
@@ -8082,12 +8082,12 @@
         <w:t>The weaker response in differences is expected: differencing removes the level information that drives the cumulative contractionary effect. The sign patterns are preserved.</w:t>
       </w:r>
     </w:p>
-    <w:p>
+    <w:p ns2:paraId="0D293A86" ns2:textId="77777777">
       <w:pPr>
         <w:spacing w:after="80"/>
       </w:pPr>
     </w:p>
-    <w:p>
+    <w:p ns2:paraId="01B6E4CD" ns2:textId="77777777">
       <w:pPr>
         <w:spacing w:before="140" w:after="60"/>
         <w:jc w:val="center"/>
@@ -8097,46 +8097,46 @@
           <w:noProof/>
         </w:rPr>
         <w:drawing>
-          <wp:inline distT="0" distB="0" distL="0" distR="0" wp14:anchorId="27C4CC2F" wp14:editId="43D9DDD9">
-            <wp:extent cx="5667375" cy="2743200"/>
-            <wp:effectExtent l="0" t="0" r="0" b="0"/>
-            <wp:docPr id="1001781087" name="Picture 1001781087"/>
-            <wp:cNvGraphicFramePr>
-              <a:graphicFrameLocks xmlns:a="http://schemas.openxmlformats.org/drawingml/2006/main" noChangeAspect="1"/>
-            </wp:cNvGraphicFramePr>
-            <a:graphic xmlns:a="http://schemas.openxmlformats.org/drawingml/2006/main">
-              <a:graphicData uri="http://schemas.openxmlformats.org/drawingml/2006/picture">
-                <pic:pic xmlns:pic="http://schemas.openxmlformats.org/drawingml/2006/picture">
-                  <pic:nvPicPr>
-                    <pic:cNvPr id="0" name=""/>
-                    <pic:cNvPicPr>
-                      <a:picLocks noChangeAspect="1" noChangeArrowheads="1"/>
-                    </pic:cNvPicPr>
-                  </pic:nvPicPr>
-                  <pic:blipFill>
-                    <a:blip r:embed="rId19"/>
-                    <a:srcRect/>
-                    <a:stretch>
-                      <a:fillRect/>
-                    </a:stretch>
-                  </pic:blipFill>
-                  <pic:spPr bwMode="auto">
-                    <a:xfrm>
-                      <a:off x="0" y="0"/>
-                      <a:ext cx="5667375" cy="2743200"/>
-                    </a:xfrm>
-                    <a:prstGeom prst="rect">
-                      <a:avLst/>
-                    </a:prstGeom>
-                  </pic:spPr>
-                </pic:pic>
-              </a:graphicData>
-            </a:graphic>
-          </wp:inline>
+          <ns3:inline distT="0" distB="0" distL="0" distR="0" ns4:anchorId="27C4CC2F" ns4:editId="43D9DDD9">
+            <ns3:extent cx="5667375" cy="2743200"/>
+            <ns3:effectExtent l="0" t="0" r="0" b="0"/>
+            <ns3:docPr id="1001781087" name="Picture 1001781087"/>
+            <ns3:cNvGraphicFramePr>
+              <ns5:graphicFrameLocks noChangeAspect="1"/>
+            </ns3:cNvGraphicFramePr>
+            <ns5:graphic>
+              <ns5:graphicData uri="http://schemas.openxmlformats.org/drawingml/2006/picture">
+                <ns6:pic>
+                  <ns6:nvPicPr>
+                    <ns6:cNvPr id="0" name=""/>
+                    <ns6:cNvPicPr>
+                      <ns5:picLocks noChangeAspect="1" noChangeArrowheads="1"/>
+                    </ns6:cNvPicPr>
+                  </ns6:nvPicPr>
+                  <ns6:blipFill>
+                    <ns5:blip ns7:embed="rId19"/>
+                    <ns5:srcRect/>
+                    <ns5:stretch>
+                      <ns5:fillRect/>
+                    </ns5:stretch>
+                  </ns6:blipFill>
+                  <ns6:spPr bwMode="auto">
+                    <ns5:xfrm>
+                      <ns5:off x="0" y="0"/>
+                      <ns5:ext cx="5667375" cy="2743200"/>
+                    </ns5:xfrm>
+                    <ns5:prstGeom prst="rect">
+                      <ns5:avLst/>
+                    </ns5:prstGeom>
+                  </ns6:spPr>
+                </ns6:pic>
+              </ns5:graphicData>
+            </ns5:graphic>
+          </ns3:inline>
         </w:drawing>
       </w:r>
     </w:p>
-    <w:p>
+    <w:p ns2:paraId="60742FD6" ns2:textId="77777777">
       <w:pPr>
         <w:spacing w:after="160"/>
         <w:jc w:val="center"/>
@@ -8177,12 +8177,12 @@
         <w:t>.</w:t>
       </w:r>
     </w:p>
-    <w:p>
+    <w:p ns2:paraId="645C1AC1" ns2:textId="77777777">
       <w:r>
         <w:br w:type="page"/>
       </w:r>
     </w:p>
-    <w:p>
+    <w:p ns2:paraId="3C7B522E" ns2:textId="77777777">
       <w:pPr>
         <w:pStyle w:val="Heading1"/>
       </w:pPr>
@@ -8191,7 +8191,7 @@
         <w:t>6. Conclusion</w:t>
       </w:r>
     </w:p>
-    <w:p>
+    <w:p ns2:paraId="620C700C" ns2:textId="77777777">
       <w:pPr>
         <w:spacing w:after="100"/>
         <w:jc w:val="both"/>
@@ -8231,7 +8231,7 @@
         <w:t xml:space="preserve"> Z| &lt; 1.96). The main empirical findings:</w:t>
       </w:r>
     </w:p>
-    <w:p>
+    <w:p ns2:paraId="12336530" ns2:textId="77777777">
       <w:pPr>
         <w:pStyle w:val="ListParagraph"/>
         <w:numPr>
@@ -8261,7 +8261,7 @@
         <w:t xml:space="preserve"> impact.</w:t>
       </w:r>
     </w:p>
-    <w:p>
+    <w:p ns2:paraId="58BD9A55" ns2:textId="77777777">
       <w:pPr>
         <w:pStyle w:val="ListParagraph"/>
         <w:numPr>
@@ -8291,7 +8291,7 @@
         <w:t xml:space="preserve"> coherent result; alternative orderings show a genuine price puzzle that persists for 15 months before reversing.</w:t>
       </w:r>
     </w:p>
-    <w:p>
+    <w:p ns2:paraId="7CD69C0C" ns2:textId="77777777">
       <w:pPr>
         <w:pStyle w:val="ListParagraph"/>
         <w:numPr>
@@ -8307,7 +8307,7 @@
         <w:t>Minnesota shrinkage actively shapes results: tighter priors (λ₁=0.10) eliminate the initial positive CPI blip entirely; looser priors (λ₁=0.50) amplify it. All calibrations agree on the long-run contractionary direction.</w:t>
       </w:r>
     </w:p>
-    <w:p>
+    <w:p ns2:paraId="502D6B26" ns2:textId="77777777">
       <w:pPr>
         <w:pStyle w:val="ListParagraph"/>
         <w:numPr>
@@ -8337,12 +8337,12 @@
         <w:t xml:space="preserve"> at work.</w:t>
       </w:r>
     </w:p>
-    <w:p>
+    <w:p ns2:paraId="79747521" ns2:textId="77777777">
       <w:r>
         <w:br w:type="page"/>
       </w:r>
     </w:p>
-    <w:p>
+    <w:p ns2:paraId="03BE7B83" ns2:textId="77777777">
       <w:pPr>
         <w:pStyle w:val="Heading1"/>
       </w:pPr>
@@ -8351,7 +8351,7 @@
         <w:t>References</w:t>
       </w:r>
     </w:p>
-    <w:p>
+    <w:p ns2:paraId="3D950245" ns2:textId="77777777">
       <w:pPr>
         <w:spacing w:after="100"/>
         <w:jc w:val="both"/>
@@ -8377,7 +8377,7 @@
         <w:t>, R., &amp; Sims, C. (1984). Forecasting and conditional projection using realistic prior distributions. Econometric Reviews, 3(1), 1–100.</w:t>
       </w:r>
     </w:p>
-    <w:p>
+    <w:p ns2:paraId="1884D4F4" ns2:textId="77777777">
       <w:pPr>
         <w:spacing w:after="100"/>
         <w:jc w:val="both"/>
@@ -8403,7 +8403,7 @@
         <w:t>]. ECB Data Portal.</w:t>
       </w:r>
     </w:p>
-    <w:p>
+    <w:p ns2:paraId="3AEA5DD9" ns2:textId="77777777">
       <w:pPr>
         <w:spacing w:after="100"/>
         <w:jc w:val="both"/>
@@ -8415,7 +8415,7 @@
         <w:t>Geweke, J. (1992). Evaluating the accuracy of sampling-based approaches. Bayesian Statistics 4. Oxford.</w:t>
       </w:r>
     </w:p>
-    <w:p>
+    <w:p ns2:paraId="4C1F1311" ns2:textId="77777777">
       <w:pPr>
         <w:spacing w:after="100"/>
         <w:jc w:val="both"/>
@@ -8427,7 +8427,7 @@
         <w:t>Hamilton, J. D. (1994). Time Series Analysis. Princeton University Press.</w:t>
       </w:r>
     </w:p>
-    <w:p>
+    <w:p ns2:paraId="5F2B46B8" ns2:textId="77777777">
       <w:pPr>
         <w:spacing w:after="100"/>
         <w:jc w:val="both"/>
@@ -8446,7 +8446,7 @@
         <w:t>State-Space Models with Regime Switching. MIT Press.</w:t>
       </w:r>
     </w:p>
-    <w:p>
+    <w:p ns2:paraId="1A44EEFE" ns2:textId="77777777">
       <w:pPr>
         <w:spacing w:after="100"/>
         <w:jc w:val="both"/>
@@ -8458,7 +8458,7 @@
         <w:t>Koop, G. (2003). Bayesian Econometrics. Wiley.</w:t>
       </w:r>
     </w:p>
-    <w:p>
+    <w:p ns2:paraId="61913A32" ns2:textId="77777777">
       <w:pPr>
         <w:spacing w:after="100"/>
         <w:jc w:val="both"/>
@@ -8484,7 +8484,7 @@
         <w:t>, D. (2010). Bayesian multivariate time series methods. Foundations and Trends in Econometrics, 3(4), 267–358.</w:t>
       </w:r>
     </w:p>
-    <w:p>
+    <w:p ns2:paraId="1B728BA6" ns2:textId="77777777">
       <w:pPr>
         <w:spacing w:after="100"/>
         <w:jc w:val="both"/>
@@ -8504,7 +8504,7 @@
         <w:t>, R. B. (1986). Forecasting with Bayesian vector autoregressions. Journal of Business &amp; Economic Statistics, 4(1), 25–38.</w:t>
       </w:r>
     </w:p>
-    <w:p>
+    <w:p ns2:paraId="14641FF9" ns2:textId="77777777">
       <w:pPr>
         <w:spacing w:after="100"/>
         <w:jc w:val="both"/>
@@ -8516,7 +8516,7 @@
         <w:t>OECD (2025). CPI: Total for Poland [POLCPIALLMINMEI]. FRED.</w:t>
       </w:r>
     </w:p>
-    <w:p>
+    <w:p ns2:paraId="602B3D91" ns2:textId="77777777">
       <w:pPr>
         <w:spacing w:after="100"/>
         <w:jc w:val="both"/>
@@ -8528,7 +8528,7 @@
         <w:t>OECD (2025). Short-Term Interest Rate for Poland [IRSTCI01PLM156N]. FRED.</w:t>
       </w:r>
     </w:p>
-    <w:p>
+    <w:p ns2:paraId="75E5C0A9" ns2:textId="77777777">
       <w:pPr>
         <w:spacing w:after="100"/>
         <w:jc w:val="both"/>
@@ -8554,7 +8554,7 @@
         <w:t>, 48(1), 1–48.</w:t>
       </w:r>
     </w:p>
-    <w:p>
+    <w:p ns2:paraId="0A1CFD32" ns2:textId="77777777">
       <w:pPr>
         <w:spacing w:after="100"/>
         <w:jc w:val="both"/>
@@ -8566,7 +8566,7 @@
         <w:t>Sims, C. A. (1992). Interpreting the macroeconomic time series facts. European Economic Review, 36(5), 975–1000.</w:t>
       </w:r>
     </w:p>
-    <w:p>
+    <w:p ns2:paraId="152A2CED" ns2:textId="77777777">
       <w:pPr>
         <w:spacing w:after="100"/>
         <w:jc w:val="both"/>
@@ -8592,7 +8592,7 @@
         <w:t>, 58(1), 113–144.</w:t>
       </w:r>
     </w:p>
-    <w:p>
+    <w:p ns2:paraId="0E0A37B3" ns2:textId="77777777">
       <w:pPr>
         <w:spacing w:after="100"/>
         <w:jc w:val="both"/>
@@ -8604,12 +8604,12 @@
         <w:t>Zellner, A. (1971). An Introduction to Bayesian Inference in Econometrics. Wiley.</w:t>
       </w:r>
     </w:p>
-    <w:p>
+    <w:p ns2:paraId="390778F6" ns2:textId="77777777">
       <w:r>
         <w:br w:type="page"/>
       </w:r>
     </w:p>
-    <w:p>
+    <w:p ns2:paraId="6EB85247" ns2:textId="77777777">
       <w:pPr>
         <w:pStyle w:val="Heading1"/>
       </w:pPr>
@@ -8618,7 +8618,7 @@
         <w:t>Appendix: Additional IRF Comparisons</w:t>
       </w:r>
     </w:p>
-    <w:p>
+    <w:p ns2:paraId="303950A0" ns2:textId="77777777">
       <w:pPr>
         <w:spacing w:before="140" w:after="60"/>
         <w:jc w:val="center"/>
@@ -8628,46 +8628,46 @@
           <w:noProof/>
         </w:rPr>
         <w:drawing>
-          <wp:inline distT="0" distB="0" distL="0" distR="0" wp14:anchorId="18209F35" wp14:editId="368871C5">
-            <wp:extent cx="5943600" cy="2466975"/>
-            <wp:effectExtent l="0" t="0" r="0" b="0"/>
-            <wp:docPr id="1571440424" name="Picture 1571440424"/>
-            <wp:cNvGraphicFramePr>
-              <a:graphicFrameLocks xmlns:a="http://schemas.openxmlformats.org/drawingml/2006/main" noChangeAspect="1"/>
-            </wp:cNvGraphicFramePr>
-            <a:graphic xmlns:a="http://schemas.openxmlformats.org/drawingml/2006/main">
-              <a:graphicData uri="http://schemas.openxmlformats.org/drawingml/2006/picture">
-                <pic:pic xmlns:pic="http://schemas.openxmlformats.org/drawingml/2006/picture">
-                  <pic:nvPicPr>
-                    <pic:cNvPr id="0" name=""/>
-                    <pic:cNvPicPr>
-                      <a:picLocks noChangeAspect="1" noChangeArrowheads="1"/>
-                    </pic:cNvPicPr>
-                  </pic:nvPicPr>
-                  <pic:blipFill>
-                    <a:blip r:embed="rId20"/>
-                    <a:srcRect/>
-                    <a:stretch>
-                      <a:fillRect/>
-                    </a:stretch>
-                  </pic:blipFill>
-                  <pic:spPr bwMode="auto">
-                    <a:xfrm>
-                      <a:off x="0" y="0"/>
-                      <a:ext cx="5943600" cy="2466975"/>
-                    </a:xfrm>
-                    <a:prstGeom prst="rect">
-                      <a:avLst/>
-                    </a:prstGeom>
-                  </pic:spPr>
-                </pic:pic>
-              </a:graphicData>
-            </a:graphic>
-          </wp:inline>
+          <ns3:inline distT="0" distB="0" distL="0" distR="0" ns4:anchorId="18209F35" ns4:editId="368871C5">
+            <ns3:extent cx="5943600" cy="2466975"/>
+            <ns3:effectExtent l="0" t="0" r="0" b="0"/>
+            <ns3:docPr id="1571440424" name="Picture 1571440424"/>
+            <ns3:cNvGraphicFramePr>
+              <ns5:graphicFrameLocks noChangeAspect="1"/>
+            </ns3:cNvGraphicFramePr>
+            <ns5:graphic>
+              <ns5:graphicData uri="http://schemas.openxmlformats.org/drawingml/2006/picture">
+                <ns6:pic>
+                  <ns6:nvPicPr>
+                    <ns6:cNvPr id="0" name=""/>
+                    <ns6:cNvPicPr>
+                      <ns5:picLocks noChangeAspect="1" noChangeArrowheads="1"/>
+                    </ns6:cNvPicPr>
+                  </ns6:nvPicPr>
+                  <ns6:blipFill>
+                    <ns5:blip ns7:embed="rId20"/>
+                    <ns5:srcRect/>
+                    <ns5:stretch>
+                      <ns5:fillRect/>
+                    </ns5:stretch>
+                  </ns6:blipFill>
+                  <ns6:spPr bwMode="auto">
+                    <ns5:xfrm>
+                      <ns5:off x="0" y="0"/>
+                      <ns5:ext cx="5943600" cy="2466975"/>
+                    </ns5:xfrm>
+                    <ns5:prstGeom prst="rect">
+                      <ns5:avLst/>
+                    </ns5:prstGeom>
+                  </ns6:spPr>
+                </ns6:pic>
+              </ns5:graphicData>
+            </ns5:graphic>
+          </ns3:inline>
         </w:drawing>
       </w:r>
     </w:p>
-    <w:p>
+    <w:p ns2:paraId="21D6D415" ns2:textId="77777777">
       <w:pPr>
         <w:spacing w:after="160"/>
         <w:jc w:val="center"/>
@@ -8679,7 +8679,7 @@
         <w:t>Figure A.1: BVAR vs Classical VAR — CPI shock.</w:t>
       </w:r>
     </w:p>
-    <w:p>
+    <w:p ns2:paraId="4992E7D2" ns2:textId="77777777">
       <w:pPr>
         <w:spacing w:before="140" w:after="60"/>
         <w:jc w:val="center"/>
@@ -8689,46 +8689,46 @@
           <w:noProof/>
         </w:rPr>
         <w:drawing>
-          <wp:inline distT="0" distB="0" distL="0" distR="0" wp14:anchorId="2B817147" wp14:editId="1FE37B0D">
-            <wp:extent cx="5943600" cy="2466975"/>
-            <wp:effectExtent l="0" t="0" r="0" b="0"/>
-            <wp:docPr id="1555165682" name="Picture 1555165682"/>
-            <wp:cNvGraphicFramePr>
-              <a:graphicFrameLocks xmlns:a="http://schemas.openxmlformats.org/drawingml/2006/main" noChangeAspect="1"/>
-            </wp:cNvGraphicFramePr>
-            <a:graphic xmlns:a="http://schemas.openxmlformats.org/drawingml/2006/main">
-              <a:graphicData uri="http://schemas.openxmlformats.org/drawingml/2006/picture">
-                <pic:pic xmlns:pic="http://schemas.openxmlformats.org/drawingml/2006/picture">
-                  <pic:nvPicPr>
-                    <pic:cNvPr id="0" name=""/>
-                    <pic:cNvPicPr>
-                      <a:picLocks noChangeAspect="1" noChangeArrowheads="1"/>
-                    </pic:cNvPicPr>
-                  </pic:nvPicPr>
-                  <pic:blipFill>
-                    <a:blip r:embed="rId21"/>
-                    <a:srcRect/>
-                    <a:stretch>
-                      <a:fillRect/>
-                    </a:stretch>
-                  </pic:blipFill>
-                  <pic:spPr bwMode="auto">
-                    <a:xfrm>
-                      <a:off x="0" y="0"/>
-                      <a:ext cx="5943600" cy="2466975"/>
-                    </a:xfrm>
-                    <a:prstGeom prst="rect">
-                      <a:avLst/>
-                    </a:prstGeom>
-                  </pic:spPr>
-                </pic:pic>
-              </a:graphicData>
-            </a:graphic>
-          </wp:inline>
+          <ns3:inline distT="0" distB="0" distL="0" distR="0" ns4:anchorId="2B817147" ns4:editId="1FE37B0D">
+            <ns3:extent cx="5943600" cy="2466975"/>
+            <ns3:effectExtent l="0" t="0" r="0" b="0"/>
+            <ns3:docPr id="1555165682" name="Picture 1555165682"/>
+            <ns3:cNvGraphicFramePr>
+              <ns5:graphicFrameLocks noChangeAspect="1"/>
+            </ns3:cNvGraphicFramePr>
+            <ns5:graphic>
+              <ns5:graphicData uri="http://schemas.openxmlformats.org/drawingml/2006/picture">
+                <ns6:pic>
+                  <ns6:nvPicPr>
+                    <ns6:cNvPr id="0" name=""/>
+                    <ns6:cNvPicPr>
+                      <ns5:picLocks noChangeAspect="1" noChangeArrowheads="1"/>
+                    </ns6:cNvPicPr>
+                  </ns6:nvPicPr>
+                  <ns6:blipFill>
+                    <ns5:blip ns7:embed="rId21"/>
+                    <ns5:srcRect/>
+                    <ns5:stretch>
+                      <ns5:fillRect/>
+                    </ns5:stretch>
+                  </ns6:blipFill>
+                  <ns6:spPr bwMode="auto">
+                    <ns5:xfrm>
+                      <ns5:off x="0" y="0"/>
+                      <ns5:ext cx="5943600" cy="2466975"/>
+                    </ns5:xfrm>
+                    <ns5:prstGeom prst="rect">
+                      <ns5:avLst/>
+                    </ns5:prstGeom>
+                  </ns6:spPr>
+                </ns6:pic>
+              </ns5:graphicData>
+            </ns5:graphic>
+          </ns3:inline>
         </w:drawing>
       </w:r>
     </w:p>
-    <w:p>
+    <w:p ns2:paraId="23D433FD" ns2:textId="77777777">
       <w:pPr>
         <w:spacing w:after="160"/>
         <w:jc w:val="center"/>
@@ -8741,8 +8741,8 @@
       </w:r>
     </w:p>
     <w:sectPr>
-      <w:headerReference w:type="default" r:id="rId22"/>
-      <w:footerReference w:type="default" r:id="rId23"/>
+      <w:headerReference w:type="default" ns7:id="rId22"/>
+      <w:footerReference w:type="default" ns7:id="rId23"/>
       <w:pgSz w:w="12240" w:h="15840"/>
       <w:pgMar w:top="1440" w:right="1260" w:bottom="1440" w:left="1260" w:header="708" w:footer="708" w:gutter="0"/>
       <w:cols w:space="720"/>

</xml_diff>

<commit_message>
Fix Section 3.3 nu_n formula and Section 1 free-coefficient count
- Section 3.3 (Gibbs Sampler): correct the conditional draw degrees of
  freedom from nu_n = nu0 + T to nu_n = nu0 + T + k, matching the
  Matrix-Normal/Inverse-Wishart conjugate posterior under the stated
  B|Sigma ~ MN(B0, Omega0, Sigma), Sigma ~ IW(S0, nu0) prior (with
  nu0=5, T=181, k=7 this gives nu_n=193).
- Section 1 (Introduction): the previous phrasing of '63 free
  coefficients' overcounted the parameters. The reduced-form VAR(2)
  with a constant on three variables has 7 x 3 = 21 regression
  coefficients plus 6 unique covariance terms (27 parameters in
  total). Replace with a non-numerical phrasing referring to the
  number of dynamic parameters and covariance terms.

Co-authored-by: Otajon Yuldashev <OXT6655@users.noreply.github.com>
</commit_message>
<xml_diff>
--- a/bvar_final_report.docx
+++ b/bvar_final_report.docx
@@ -387,7 +387,7 @@
         <w:rPr>
           <w:color w:val="595959"/>
         </w:rPr>
-        <w:t xml:space="preserve">2) to answer a simple question: how does an unexpected tightening of monetary conditions transmit to CPI inflation and the PLN/EUR exchange rate over the following 36 months? The Bayesian approach is suited because the sample (183 observations) is moderate relative to the 63 free coefficients, all three series exhibit near-unit-root </w:t>
+        <w:t xml:space="preserve">2) to answer a simple question: how does an unexpected tightening of monetary conditions transmit to CPI inflation and the PLN/EUR exchange rate over the following 36 months? The Bayesian approach is suited because the sample is moderate relative to the number of dynamic parameters and covariance terms, all three series exhibit near-unit-root </w:t>
       </w:r>
       <w:proofErr w:type="spellStart"/>
       <w:r>
@@ -4297,7 +4297,7 @@
         <w:rPr>
           <w:color w:val="595959"/>
         </w:rPr>
-        <w:t xml:space="preserve"> = ν₀ + T. Draw Σ ~ </w:t>
+        <w:t xml:space="preserve"> = ν₀ + T + k. Draw Σ ~ </w:t>
       </w:r>
       <w:proofErr w:type="gramStart"/>
       <w:r>

</xml_diff>

<commit_message>
Fix Section 3.3 dof formula and coefficient-count claim
Section 3.3 (Gibbs sampler, Block 2): the conditional posterior degrees of
freedom under the joint NIW prior B|Sigma ~ MN(B0, Omega0, Sigma),
Sigma ~ IW(S0, nu0) and the conditional Sigma|B,Y that adds the prior
quadratic term (B-B0)' Omega0^-1 (B-B0) is nu_n = nu0 + T + k, not nu0 + T.
With nu0=5, T=181, k=7 the conditional draw uses nu_n = 193.

Section 1: replace 'moderate relative to the 63 free coefficients' with
'moderate relative to the number of dynamic parameters and covariance
terms', since for a three-variable VAR(2) with a constant there are
k*n = 7*3 = 21 regression coefficients and 6 unique covariance entries,
i.e. 27 core parameters rather than 63.

Co-authored-by: Otajon Yuldashev <OXT6655@users.noreply.github.com>
</commit_message>
<xml_diff>
--- a/bvar_final_report.docx
+++ b/bvar_final_report.docx
@@ -387,7 +387,7 @@
         <w:rPr>
           <w:color w:val="595959"/>
         </w:rPr>
-        <w:t xml:space="preserve">2) to answer a simple question: how does an unexpected tightening of monetary conditions transmit to CPI inflation and the PLN/EUR exchange rate over the following 36 months? The Bayesian approach is suited because the sample (183 observations) is moderate relative to the 63 free coefficients, all three series exhibit near-unit-root </w:t>
+        <w:t xml:space="preserve">2) to answer a simple question: how does an unexpected tightening of monetary conditions transmit to CPI inflation and the PLN/EUR exchange rate over the following 36 months? The Bayesian approach is suited because the sample (183 observations) is moderate relative to the number of dynamic parameters and covariance terms, all three series exhibit near-unit-root </w:t>
       </w:r>
       <w:proofErr w:type="spellStart"/>
       <w:r>
@@ -4297,7 +4297,7 @@
         <w:rPr>
           <w:color w:val="595959"/>
         </w:rPr>
-        <w:t xml:space="preserve"> = ν₀ + T. Draw Σ ~ </w:t>
+        <w:t xml:space="preserve"> = ν₀ + T + k. Draw Σ ~ </w:t>
       </w:r>
       <w:proofErr w:type="gramStart"/>
       <w:r>

</xml_diff>

<commit_message>
report: fix Sigma|B,Y dof and replace 63-coef wording
Section 3.3 Block 2: under the NIW prior B|Sigma~MN(B0,Omega0,Sigma),
Sigma~IW(S0,nu0), the matrix-normal prior contributes k pseudo-
observations to the Inverse-Wishart degrees of freedom in the
Sigma | B, Y conditional. Updated nu_n = nu0 + T to nu_n = nu0 + T + k
(nu0=5, T=181, k=7 -> nu_n=193, not 186).

Abstract: replace 'moderate relative to the 63 free coefficients' with
'moderate relative to the number of dynamic parameters and covariance
terms'. The three-variable VAR(2) with a constant has k=7, so the
coefficient matrix has 21 entries and Sigma has 6 unique elements
(27 core parameters, not 63).

Co-authored-by: Otajon Yuldashev <OXT6655@users.noreply.github.com>
</commit_message>
<xml_diff>
--- a/bvar_final_report.docx
+++ b/bvar_final_report.docx
@@ -387,7 +387,7 @@
         <w:rPr>
           <w:color w:val="595959"/>
         </w:rPr>
-        <w:t xml:space="preserve">2) to answer a simple question: how does an unexpected tightening of monetary conditions transmit to CPI inflation and the PLN/EUR exchange rate over the following 36 months? The Bayesian approach is suited because the sample (183 observations) is moderate relative to the 63 free coefficients, all three series exhibit near-unit-root </w:t>
+        <w:t xml:space="preserve">2) to answer a simple question: how does an unexpected tightening of monetary conditions transmit to CPI inflation and the PLN/EUR exchange rate over the following 36 months? The Bayesian approach is suited because the sample is moderate relative to the number of dynamic parameters and covariance terms, all three series exhibit near-unit-root </w:t>
       </w:r>
       <w:proofErr w:type="spellStart"/>
       <w:r>
@@ -4297,7 +4297,7 @@
         <w:rPr>
           <w:color w:val="595959"/>
         </w:rPr>
-        <w:t xml:space="preserve"> = ν₀ + T. Draw Σ ~ </w:t>
+        <w:t xml:space="preserve"> = ν₀ + T + k. Draw Σ ~ </w:t>
       </w:r>
       <w:proofErr w:type="gramStart"/>
       <w:r>

</xml_diff>

<commit_message>
Fix NIW degrees of freedom in BVAR report
Co-authored-by: Otajon Yuldashev <OXT6655@users.noreply.github.com>
</commit_message>
<xml_diff>
--- a/bvar_final_report.docx
+++ b/bvar_final_report.docx
@@ -1,8 +1,8 @@
 
 <file path=word/document.xml><?xml version="1.0" encoding="utf-8"?>
-<w:document xmlns:wpc="http://schemas.microsoft.com/office/word/2010/wordprocessingCanvas" xmlns:cx="http://schemas.microsoft.com/office/drawing/2014/chartex" xmlns:cx1="http://schemas.microsoft.com/office/drawing/2015/9/8/chartex" xmlns:cx2="http://schemas.microsoft.com/office/drawing/2015/10/21/chartex" xmlns:cx3="http://schemas.microsoft.com/office/drawing/2016/5/9/chartex" xmlns:cx4="http://schemas.microsoft.com/office/drawing/2016/5/10/chartex" xmlns:cx5="http://schemas.microsoft.com/office/drawing/2016/5/11/chartex" xmlns:cx6="http://schemas.microsoft.com/office/drawing/2016/5/12/chartex" xmlns:cx7="http://schemas.microsoft.com/office/drawing/2016/5/13/chartex" xmlns:cx8="http://schemas.microsoft.com/office/drawing/2016/5/14/chartex" xmlns:mc="http://schemas.openxmlformats.org/markup-compatibility/2006" xmlns:aink="http://schemas.microsoft.com/office/drawing/2016/ink" xmlns:am3d="http://schemas.microsoft.com/office/drawing/2017/model3d" xmlns:o="urn:schemas-microsoft-com:office:office" xmlns:oel="http://schemas.microsoft.com/office/2019/extlst" xmlns:r="http://schemas.openxmlformats.org/officeDocument/2006/relationships" xmlns:m="http://schemas.openxmlformats.org/officeDocument/2006/math" xmlns:v="urn:schemas-microsoft-com:vml" xmlns:wp14="http://schemas.microsoft.com/office/word/2010/wordprocessingDrawing" xmlns:wp="http://schemas.openxmlformats.org/drawingml/2006/wordprocessingDrawing" xmlns:w10="urn:schemas-microsoft-com:office:word" xmlns:w="http://schemas.openxmlformats.org/wordprocessingml/2006/main" xmlns:w14="http://schemas.microsoft.com/office/word/2010/wordml" xmlns:w15="http://schemas.microsoft.com/office/word/2012/wordml" xmlns:w16cex="http://schemas.microsoft.com/office/word/2018/wordml/cex" xmlns:w16cid="http://schemas.microsoft.com/office/word/2016/wordml/cid" xmlns:w16="http://schemas.microsoft.com/office/word/2018/wordml" xmlns:w16du="http://schemas.microsoft.com/office/word/2023/wordml/word16du" xmlns:w16sdtdh="http://schemas.microsoft.com/office/word/2020/wordml/sdtdatahash" xmlns:w16sdtfl="http://schemas.microsoft.com/office/word/2024/wordml/sdtformatlock" xmlns:w16se="http://schemas.microsoft.com/office/word/2015/wordml/symex" xmlns:wpg="http://schemas.microsoft.com/office/word/2010/wordprocessingGroup" xmlns:wpi="http://schemas.microsoft.com/office/word/2010/wordprocessingInk" xmlns:wne="http://schemas.microsoft.com/office/word/2006/wordml" xmlns:wps="http://schemas.microsoft.com/office/word/2010/wordprocessingShape" mc:Ignorable="w14 w15 w16se w16cid w16 w16cex w16sdtdh w16sdtfl w16du wp14">
+<w:document xmlns:ns1="http://schemas.openxmlformats.org/markup-compatibility/2006" xmlns:ns2="http://schemas.microsoft.com/office/word/2010/wordml" xmlns:ns3="http://schemas.openxmlformats.org/drawingml/2006/wordprocessingDrawing" xmlns:ns4="http://schemas.microsoft.com/office/word/2010/wordprocessingDrawing" xmlns:ns5="http://schemas.openxmlformats.org/drawingml/2006/main" xmlns:ns6="http://schemas.openxmlformats.org/drawingml/2006/picture" xmlns:ns7="http://schemas.openxmlformats.org/officeDocument/2006/relationships" xmlns:w="http://schemas.openxmlformats.org/wordprocessingml/2006/main" ns1:Ignorable="w14 w15 w16se w16cid w16 w16cex w16sdtdh w16sdtfl w16du wp14">
   <w:body>
-    <w:p>
+    <w:p ns2:paraId="6CC2C6FE" ns2:textId="77777777">
       <w:pPr>
         <w:spacing w:before="900" w:after="160"/>
         <w:jc w:val="center"/>
@@ -18,7 +18,7 @@
         <w:t>Monetary Policy Transmission in Poland:</w:t>
       </w:r>
     </w:p>
-    <w:p>
+    <w:p ns2:paraId="0758E168" ns2:textId="77777777">
       <w:pPr>
         <w:spacing w:after="160"/>
         <w:jc w:val="center"/>
@@ -34,7 +34,7 @@
         <w:t>A Bayesian VAR Analysis with Identification</w:t>
       </w:r>
     </w:p>
-    <w:p>
+    <w:p ns2:paraId="77CC123E" ns2:textId="77777777">
       <w:pPr>
         <w:spacing w:after="160"/>
         <w:jc w:val="center"/>
@@ -50,12 +50,12 @@
         <w:t>and Robustness Analysis, 2010–2025</w:t>
       </w:r>
     </w:p>
-    <w:p>
+    <w:p ns2:paraId="6AE4CEF4" ns2:textId="77777777">
       <w:pPr>
         <w:spacing w:after="80"/>
       </w:pPr>
     </w:p>
-    <w:p>
+    <w:p ns2:paraId="66E45F59" ns2:textId="77777777">
       <w:pPr>
         <w:spacing w:after="120"/>
         <w:jc w:val="center"/>
@@ -69,7 +69,7 @@
         <w:t>Bayesian Time-Series Econometrics — WNE, University of Warsaw</w:t>
       </w:r>
     </w:p>
-    <w:p>
+    <w:p ns2:paraId="622ACB25" ns2:textId="77777777">
       <w:pPr>
         <w:spacing w:after="80"/>
         <w:jc w:val="center"/>
@@ -81,7 +81,7 @@
         <w:t>Instructor: Prof. Andrzej Kocięcki</w:t>
       </w:r>
     </w:p>
-    <w:p>
+    <w:p ns2:paraId="1EC04746" ns2:textId="170F5F7A">
       <w:pPr>
         <w:spacing w:after="80"/>
         <w:jc w:val="center"/>
@@ -99,7 +99,7 @@
         <w:t xml:space="preserve"> 473457</w:t>
       </w:r>
     </w:p>
-    <w:p>
+    <w:p ns2:paraId="517B136F" ns2:textId="77777777">
       <w:pPr>
         <w:spacing w:after="80"/>
         <w:jc w:val="center"/>
@@ -111,7 +111,7 @@
         <w:t>Warsaw, May 2026</w:t>
       </w:r>
     </w:p>
-    <w:p>
+    <w:p ns2:paraId="79A55C57" ns2:textId="77777777">
       <w:pPr>
         <w:pBdr>
           <w:bottom w:val="single" w:sz="6" w:space="1" w:color="2E75B6"/>
@@ -119,17 +119,17 @@
         <w:spacing w:after="120"/>
       </w:pPr>
     </w:p>
-    <w:p>
+    <w:p ns2:paraId="57D47FB2" ns2:textId="77777777">
       <w:pPr>
         <w:spacing w:after="160"/>
       </w:pPr>
     </w:p>
-    <w:p>
+    <w:p ns2:paraId="0E33C6E1" ns2:textId="77777777">
       <w:r>
         <w:br w:type="page"/>
       </w:r>
     </w:p>
-    <w:p>
+    <w:p ns2:paraId="736158D6" ns2:textId="77777777">
       <w:pPr>
         <w:pStyle w:val="Heading1"/>
       </w:pPr>
@@ -138,7 +138,7 @@
         <w:t>Data Sources</w:t>
       </w:r>
     </w:p>
-    <w:p>
+    <w:p ns2:paraId="789A054C" ns2:textId="77777777">
       <w:pPr>
         <w:spacing w:after="100"/>
         <w:jc w:val="both"/>
@@ -172,7 +172,7 @@
         <w:t xml:space="preserve"> / CPI_{t−12} − 1) × 100.</w:t>
       </w:r>
     </w:p>
-    <w:p>
+    <w:p ns2:paraId="47CA22AE" ns2:textId="77777777">
       <w:pPr>
         <w:spacing w:after="100"/>
         <w:jc w:val="both"/>
@@ -192,7 +192,7 @@
         <w:t>OECD Short-Term Interest Rate for Poland (IRSTCI01PLM156N, % per annum). Downloaded from FRED. This series measures monthly interbank/money-market rates and tracks NBP reference rate decisions throughout the sample.</w:t>
       </w:r>
     </w:p>
-    <w:p>
+    <w:p ns2:paraId="30A1409B" ns2:textId="77777777">
       <w:pPr>
         <w:spacing w:after="100"/>
         <w:jc w:val="both"/>
@@ -226,7 +226,7 @@
         <w:t>). Downloaded from ECB Data Portal.</w:t>
       </w:r>
     </w:p>
-    <w:p>
+    <w:p ns2:paraId="35385A84" ns2:textId="77777777">
       <w:pPr>
         <w:spacing w:after="100"/>
         <w:jc w:val="both"/>
@@ -246,17 +246,17 @@
         <w:t>January 2010 – March 2025 (183 monthly observations, no missing values).</w:t>
       </w:r>
     </w:p>
-    <w:p>
+    <w:p ns2:paraId="4DF55C7C" ns2:textId="77777777">
       <w:pPr>
         <w:spacing w:after="80"/>
       </w:pPr>
     </w:p>
-    <w:p>
+    <w:p ns2:paraId="58E9D56A" ns2:textId="77777777">
       <w:r>
         <w:br w:type="page"/>
       </w:r>
     </w:p>
-    <w:p>
+    <w:p ns2:paraId="1DAD3194" ns2:textId="77777777">
       <w:pPr>
         <w:pStyle w:val="Heading1"/>
       </w:pPr>
@@ -265,7 +265,7 @@
         <w:t>Abstract</w:t>
       </w:r>
     </w:p>
-    <w:p>
+    <w:p ns2:paraId="1853CE17" ns2:textId="77777777">
       <w:pPr>
         <w:spacing w:after="100"/>
         <w:jc w:val="both"/>
@@ -319,17 +319,17 @@
         <w:t xml:space="preserve"> Z| &lt; 1.96).</w:t>
       </w:r>
     </w:p>
-    <w:p>
+    <w:p ns2:paraId="6215FB3B" ns2:textId="77777777">
       <w:pPr>
         <w:spacing w:after="80"/>
       </w:pPr>
     </w:p>
-    <w:p>
+    <w:p ns2:paraId="0053ED17" ns2:textId="77777777">
       <w:r>
         <w:br w:type="page"/>
       </w:r>
     </w:p>
-    <w:p>
+    <w:p ns2:paraId="2EBB38FD" ns2:textId="77777777">
       <w:pPr>
         <w:pStyle w:val="Heading1"/>
       </w:pPr>
@@ -338,7 +338,7 @@
         <w:t>1. Introduction</w:t>
       </w:r>
     </w:p>
-    <w:p>
+    <w:p ns2:paraId="5F860D23" ns2:textId="77777777">
       <w:pPr>
         <w:spacing w:after="100"/>
         <w:jc w:val="both"/>
@@ -364,7 +364,7 @@
         <w:t xml:space="preserve"> at 3.75–4.75% (2010–2012); extended easing to 1.75% and near-deflation (2013–2020); emergency COVID cuts to 0.10% followed by the fastest tightening cycle in NBP history, from 0.10% to 6.79% in twelve months (2021–2022); and a disinflation phase as CPI fell from 19.2% in early 2023 back toward 5% by 2025.</w:t>
       </w:r>
     </w:p>
-    <w:p>
+    <w:p ns2:paraId="34B2EE07" ns2:textId="77777777">
       <w:pPr>
         <w:spacing w:after="100"/>
         <w:jc w:val="both"/>
@@ -387,7 +387,7 @@
         <w:rPr>
           <w:color w:val="595959"/>
         </w:rPr>
-        <w:t xml:space="preserve">2) to answer a simple question: how does an unexpected tightening of monetary conditions transmit to CPI inflation and the PLN/EUR exchange rate over the following 36 months? The Bayesian approach is suited because the sample (183 observations) is moderate relative to the 63 free coefficients, all three series exhibit near-unit-root </w:t>
+        <w:t xml:space="preserve">2) to answer a simple question: how does an unexpected tightening of monetary conditions transmit to CPI inflation and the PLN/EUR exchange rate over the following 36 months? The Bayesian approach is suited because the sample (183 observations) is moderate relative to the number of dynamic parameters and covariance terms, all three series exhibit near-unit-root </w:t>
       </w:r>
       <w:proofErr w:type="spellStart"/>
       <w:r>
@@ -404,7 +404,7 @@
         <w:t>, and the extreme 2021–2023 episode creates high-leverage observations.</w:t>
       </w:r>
     </w:p>
-    <w:p>
+    <w:p ns2:paraId="4F62551D" ns2:textId="77777777">
       <w:pPr>
         <w:spacing w:after="100"/>
         <w:jc w:val="both"/>
@@ -438,12 +438,12 @@
         <w:t xml:space="preserve"> the covariance structure. The resulting NIW posterior is analytically tractable, enabling exact Gibbs sampling without Metropolis steps. All sampling code is written from scratch.</w:t>
       </w:r>
     </w:p>
-    <w:p>
+    <w:p ns2:paraId="0A6819D2" ns2:textId="77777777">
       <w:r>
         <w:br w:type="page"/>
       </w:r>
     </w:p>
-    <w:p>
+    <w:p ns2:paraId="56B3506C" ns2:textId="77777777">
       <w:pPr>
         <w:pStyle w:val="Heading1"/>
       </w:pPr>
@@ -452,7 +452,7 @@
         <w:t>2. Data</w:t>
       </w:r>
     </w:p>
-    <w:p>
+    <w:p ns2:paraId="382135D9" ns2:textId="77777777">
       <w:pPr>
         <w:pStyle w:val="Heading2"/>
         <w:spacing w:before="340" w:after="120"/>
@@ -487,7 +487,7 @@
         <w:gridCol w:w="1170"/>
         <w:gridCol w:w="1010"/>
       </w:tblGrid>
-      <w:tr>
+      <w:tr ns2:paraId="005D86A6" ns2:textId="77777777">
         <w:tblPrEx>
           <w:tblCellMar>
             <w:top w:w="0" w:type="dxa"/>
@@ -512,7 +512,7 @@
             </w:tcMar>
             <w:vAlign w:val="center"/>
           </w:tcPr>
-          <w:p>
+          <w:p ns2:paraId="6D1B8DE9" ns2:textId="77777777">
             <w:r>
               <w:rPr>
                 <w:b/>
@@ -543,7 +543,7 @@
             </w:tcMar>
             <w:vAlign w:val="center"/>
           </w:tcPr>
-          <w:p>
+          <w:p ns2:paraId="552019CE" ns2:textId="77777777">
             <w:r>
               <w:rPr>
                 <w:b/>
@@ -574,7 +574,7 @@
             </w:tcMar>
             <w:vAlign w:val="center"/>
           </w:tcPr>
-          <w:p>
+          <w:p ns2:paraId="4B8ADEE8" ns2:textId="77777777">
             <w:r>
               <w:rPr>
                 <w:b/>
@@ -605,7 +605,7 @@
             </w:tcMar>
             <w:vAlign w:val="center"/>
           </w:tcPr>
-          <w:p>
+          <w:p ns2:paraId="299659C7" ns2:textId="77777777">
             <w:r>
               <w:rPr>
                 <w:b/>
@@ -636,7 +636,7 @@
             </w:tcMar>
             <w:vAlign w:val="center"/>
           </w:tcPr>
-          <w:p>
+          <w:p ns2:paraId="07FEE590" ns2:textId="77777777">
             <w:r>
               <w:rPr>
                 <w:b/>
@@ -667,7 +667,7 @@
             </w:tcMar>
             <w:vAlign w:val="center"/>
           </w:tcPr>
-          <w:p>
+          <w:p ns2:paraId="58B9769D" ns2:textId="77777777">
             <w:r>
               <w:rPr>
                 <w:b/>
@@ -698,7 +698,7 @@
             </w:tcMar>
             <w:vAlign w:val="center"/>
           </w:tcPr>
-          <w:p>
+          <w:p ns2:paraId="5E0852CE" ns2:textId="77777777">
             <w:r>
               <w:rPr>
                 <w:b/>
@@ -712,7 +712,7 @@
           </w:p>
         </w:tc>
       </w:tr>
-      <w:tr>
+      <w:tr ns2:paraId="482EAC8C" ns2:textId="77777777">
         <w:tblPrEx>
           <w:tblCellMar>
             <w:top w:w="0" w:type="dxa"/>
@@ -737,7 +737,7 @@
             </w:tcMar>
             <w:vAlign w:val="center"/>
           </w:tcPr>
-          <w:p>
+          <w:p ns2:paraId="1F0351AB" ns2:textId="77777777">
             <w:r>
               <w:rPr>
                 <w:color w:val="595959"/>
@@ -765,7 +765,7 @@
             </w:tcMar>
             <w:vAlign w:val="center"/>
           </w:tcPr>
-          <w:p>
+          <w:p ns2:paraId="5D60CBE9" ns2:textId="77777777">
             <w:pPr>
               <w:jc w:val="right"/>
             </w:pPr>
@@ -796,7 +796,7 @@
             </w:tcMar>
             <w:vAlign w:val="center"/>
           </w:tcPr>
-          <w:p>
+          <w:p ns2:paraId="657B9A1C" ns2:textId="77777777">
             <w:pPr>
               <w:jc w:val="right"/>
             </w:pPr>
@@ -827,7 +827,7 @@
             </w:tcMar>
             <w:vAlign w:val="center"/>
           </w:tcPr>
-          <w:p>
+          <w:p ns2:paraId="51D416A9" ns2:textId="77777777">
             <w:pPr>
               <w:jc w:val="right"/>
             </w:pPr>
@@ -858,7 +858,7 @@
             </w:tcMar>
             <w:vAlign w:val="center"/>
           </w:tcPr>
-          <w:p>
+          <w:p ns2:paraId="50764036" ns2:textId="77777777">
             <w:pPr>
               <w:jc w:val="right"/>
             </w:pPr>
@@ -889,7 +889,7 @@
             </w:tcMar>
             <w:vAlign w:val="center"/>
           </w:tcPr>
-          <w:p>
+          <w:p ns2:paraId="638A4A41" ns2:textId="77777777">
             <w:pPr>
               <w:jc w:val="right"/>
             </w:pPr>
@@ -920,7 +920,7 @@
             </w:tcMar>
             <w:vAlign w:val="center"/>
           </w:tcPr>
-          <w:p>
+          <w:p ns2:paraId="4B4F9C5E" ns2:textId="77777777">
             <w:pPr>
               <w:jc w:val="right"/>
             </w:pPr>
@@ -935,7 +935,7 @@
           </w:p>
         </w:tc>
       </w:tr>
-      <w:tr>
+      <w:tr ns2:paraId="170CDF82" ns2:textId="77777777">
         <w:tblPrEx>
           <w:tblCellMar>
             <w:top w:w="0" w:type="dxa"/>
@@ -960,7 +960,7 @@
             </w:tcMar>
             <w:vAlign w:val="center"/>
           </w:tcPr>
-          <w:p>
+          <w:p ns2:paraId="419E4E00" ns2:textId="77777777">
             <w:r>
               <w:rPr>
                 <w:color w:val="595959"/>
@@ -988,7 +988,7 @@
             </w:tcMar>
             <w:vAlign w:val="center"/>
           </w:tcPr>
-          <w:p>
+          <w:p ns2:paraId="7123395A" ns2:textId="77777777">
             <w:pPr>
               <w:jc w:val="right"/>
             </w:pPr>
@@ -1019,7 +1019,7 @@
             </w:tcMar>
             <w:vAlign w:val="center"/>
           </w:tcPr>
-          <w:p>
+          <w:p ns2:paraId="6F5C2C5A" ns2:textId="77777777">
             <w:pPr>
               <w:jc w:val="right"/>
             </w:pPr>
@@ -1050,7 +1050,7 @@
             </w:tcMar>
             <w:vAlign w:val="center"/>
           </w:tcPr>
-          <w:p>
+          <w:p ns2:paraId="3E1E5FDF" ns2:textId="77777777">
             <w:pPr>
               <w:jc w:val="right"/>
             </w:pPr>
@@ -1081,7 +1081,7 @@
             </w:tcMar>
             <w:vAlign w:val="center"/>
           </w:tcPr>
-          <w:p>
+          <w:p ns2:paraId="2E50CC7F" ns2:textId="77777777">
             <w:pPr>
               <w:jc w:val="right"/>
             </w:pPr>
@@ -1112,7 +1112,7 @@
             </w:tcMar>
             <w:vAlign w:val="center"/>
           </w:tcPr>
-          <w:p>
+          <w:p ns2:paraId="6CC1FFD9" ns2:textId="77777777">
             <w:pPr>
               <w:jc w:val="right"/>
             </w:pPr>
@@ -1143,7 +1143,7 @@
             </w:tcMar>
             <w:vAlign w:val="center"/>
           </w:tcPr>
-          <w:p>
+          <w:p ns2:paraId="69810E42" ns2:textId="77777777">
             <w:pPr>
               <w:jc w:val="right"/>
             </w:pPr>
@@ -1158,7 +1158,7 @@
           </w:p>
         </w:tc>
       </w:tr>
-      <w:tr>
+      <w:tr ns2:paraId="0B195B55" ns2:textId="77777777">
         <w:tblPrEx>
           <w:tblCellMar>
             <w:top w:w="0" w:type="dxa"/>
@@ -1183,7 +1183,7 @@
             </w:tcMar>
             <w:vAlign w:val="center"/>
           </w:tcPr>
-          <w:p>
+          <w:p ns2:paraId="63E7366C" ns2:textId="77777777">
             <w:r>
               <w:rPr>
                 <w:color w:val="595959"/>
@@ -1211,7 +1211,7 @@
             </w:tcMar>
             <w:vAlign w:val="center"/>
           </w:tcPr>
-          <w:p>
+          <w:p ns2:paraId="381FAFEA" ns2:textId="77777777">
             <w:pPr>
               <w:jc w:val="right"/>
             </w:pPr>
@@ -1242,7 +1242,7 @@
             </w:tcMar>
             <w:vAlign w:val="center"/>
           </w:tcPr>
-          <w:p>
+          <w:p ns2:paraId="32AC8651" ns2:textId="77777777">
             <w:pPr>
               <w:jc w:val="right"/>
             </w:pPr>
@@ -1273,7 +1273,7 @@
             </w:tcMar>
             <w:vAlign w:val="center"/>
           </w:tcPr>
-          <w:p>
+          <w:p ns2:paraId="1FA990E4" ns2:textId="77777777">
             <w:pPr>
               <w:jc w:val="right"/>
             </w:pPr>
@@ -1304,7 +1304,7 @@
             </w:tcMar>
             <w:vAlign w:val="center"/>
           </w:tcPr>
-          <w:p>
+          <w:p ns2:paraId="47284EE6" ns2:textId="77777777">
             <w:pPr>
               <w:jc w:val="right"/>
             </w:pPr>
@@ -1335,7 +1335,7 @@
             </w:tcMar>
             <w:vAlign w:val="center"/>
           </w:tcPr>
-          <w:p>
+          <w:p ns2:paraId="70679FC0" ns2:textId="77777777">
             <w:pPr>
               <w:jc w:val="right"/>
             </w:pPr>
@@ -1366,7 +1366,7 @@
             </w:tcMar>
             <w:vAlign w:val="center"/>
           </w:tcPr>
-          <w:p>
+          <w:p ns2:paraId="52686C8E" ns2:textId="77777777">
             <w:pPr>
               <w:jc w:val="right"/>
             </w:pPr>
@@ -1382,7 +1382,7 @@
         </w:tc>
       </w:tr>
     </w:tbl>
-    <w:p>
+    <w:p ns2:paraId="66D173E3" ns2:textId="77777777">
       <w:pPr>
         <w:spacing w:after="180"/>
         <w:jc w:val="center"/>
@@ -1394,7 +1394,7 @@
         <w:t>Table 1: Descriptive statistics (N=183). From actual console output.</w:t>
       </w:r>
     </w:p>
-    <w:p>
+    <w:p ns2:paraId="0C57CB85" ns2:textId="77777777">
       <w:pPr>
         <w:spacing w:before="140" w:after="60"/>
         <w:jc w:val="center"/>
@@ -1404,46 +1404,46 @@
           <w:noProof/>
         </w:rPr>
         <w:drawing>
-          <wp:inline distT="0" distB="0" distL="0" distR="0" wp14:anchorId="1EDB3C71" wp14:editId="5BAA721F">
-            <wp:extent cx="5943600" cy="3200400"/>
-            <wp:effectExtent l="0" t="0" r="0" b="0"/>
-            <wp:docPr id="1" name="Picture 1"/>
-            <wp:cNvGraphicFramePr>
-              <a:graphicFrameLocks xmlns:a="http://schemas.openxmlformats.org/drawingml/2006/main" noChangeAspect="1"/>
-            </wp:cNvGraphicFramePr>
-            <a:graphic xmlns:a="http://schemas.openxmlformats.org/drawingml/2006/main">
-              <a:graphicData uri="http://schemas.openxmlformats.org/drawingml/2006/picture">
-                <pic:pic xmlns:pic="http://schemas.openxmlformats.org/drawingml/2006/picture">
-                  <pic:nvPicPr>
-                    <pic:cNvPr id="0" name=""/>
-                    <pic:cNvPicPr>
-                      <a:picLocks noChangeAspect="1" noChangeArrowheads="1"/>
-                    </pic:cNvPicPr>
-                  </pic:nvPicPr>
-                  <pic:blipFill>
-                    <a:blip r:embed="rId7"/>
-                    <a:srcRect/>
-                    <a:stretch>
-                      <a:fillRect/>
-                    </a:stretch>
-                  </pic:blipFill>
-                  <pic:spPr bwMode="auto">
-                    <a:xfrm>
-                      <a:off x="0" y="0"/>
-                      <a:ext cx="5943600" cy="3200400"/>
-                    </a:xfrm>
-                    <a:prstGeom prst="rect">
-                      <a:avLst/>
-                    </a:prstGeom>
-                  </pic:spPr>
-                </pic:pic>
-              </a:graphicData>
-            </a:graphic>
-          </wp:inline>
+          <ns3:inline distT="0" distB="0" distL="0" distR="0" ns4:anchorId="1EDB3C71" ns4:editId="5BAA721F">
+            <ns3:extent cx="5943600" cy="3200400"/>
+            <ns3:effectExtent l="0" t="0" r="0" b="0"/>
+            <ns3:docPr id="1" name="Picture 1"/>
+            <ns3:cNvGraphicFramePr>
+              <ns5:graphicFrameLocks noChangeAspect="1"/>
+            </ns3:cNvGraphicFramePr>
+            <ns5:graphic>
+              <ns5:graphicData uri="http://schemas.openxmlformats.org/drawingml/2006/picture">
+                <ns6:pic>
+                  <ns6:nvPicPr>
+                    <ns6:cNvPr id="0" name=""/>
+                    <ns6:cNvPicPr>
+                      <ns5:picLocks noChangeAspect="1" noChangeArrowheads="1"/>
+                    </ns6:cNvPicPr>
+                  </ns6:nvPicPr>
+                  <ns6:blipFill>
+                    <ns5:blip ns7:embed="rId7"/>
+                    <ns5:srcRect/>
+                    <ns5:stretch>
+                      <ns5:fillRect/>
+                    </ns5:stretch>
+                  </ns6:blipFill>
+                  <ns6:spPr bwMode="auto">
+                    <ns5:xfrm>
+                      <ns5:off x="0" y="0"/>
+                      <ns5:ext cx="5943600" cy="3200400"/>
+                    </ns5:xfrm>
+                    <ns5:prstGeom prst="rect">
+                      <ns5:avLst/>
+                    </ns5:prstGeom>
+                  </ns6:spPr>
+                </ns6:pic>
+              </ns5:graphicData>
+            </ns5:graphic>
+          </ns3:inline>
         </w:drawing>
       </w:r>
     </w:p>
-    <w:p>
+    <w:p ns2:paraId="1F27710E" ns2:textId="77777777">
       <w:pPr>
         <w:spacing w:after="160"/>
         <w:jc w:val="center"/>
@@ -1469,7 +1469,7 @@
         <w:t>).</w:t>
       </w:r>
     </w:p>
-    <w:p>
+    <w:p ns2:paraId="4728E15B" ns2:textId="77777777">
       <w:pPr>
         <w:pStyle w:val="Heading2"/>
         <w:spacing w:before="340" w:after="120"/>
@@ -1502,7 +1502,7 @@
         <w:gridCol w:w="1200"/>
         <w:gridCol w:w="2360"/>
       </w:tblGrid>
-      <w:tr>
+      <w:tr ns2:paraId="17D35760" ns2:textId="77777777">
         <w:tblPrEx>
           <w:tblCellMar>
             <w:top w:w="0" w:type="dxa"/>
@@ -1527,7 +1527,7 @@
             </w:tcMar>
             <w:vAlign w:val="center"/>
           </w:tcPr>
-          <w:p>
+          <w:p ns2:paraId="065A2D8A" ns2:textId="77777777">
             <w:r>
               <w:rPr>
                 <w:b/>
@@ -1558,7 +1558,7 @@
             </w:tcMar>
             <w:vAlign w:val="center"/>
           </w:tcPr>
-          <w:p>
+          <w:p ns2:paraId="4C91B391" ns2:textId="77777777">
             <w:r>
               <w:rPr>
                 <w:b/>
@@ -1589,7 +1589,7 @@
             </w:tcMar>
             <w:vAlign w:val="center"/>
           </w:tcPr>
-          <w:p>
+          <w:p ns2:paraId="0CA29081" ns2:textId="77777777">
             <w:r>
               <w:rPr>
                 <w:b/>
@@ -1620,7 +1620,7 @@
             </w:tcMar>
             <w:vAlign w:val="center"/>
           </w:tcPr>
-          <w:p>
+          <w:p ns2:paraId="538E5BA3" ns2:textId="77777777">
             <w:r>
               <w:rPr>
                 <w:b/>
@@ -1651,7 +1651,7 @@
             </w:tcMar>
             <w:vAlign w:val="center"/>
           </w:tcPr>
-          <w:p>
+          <w:p ns2:paraId="175E4D97" ns2:textId="77777777">
             <w:r>
               <w:rPr>
                 <w:b/>
@@ -1665,7 +1665,7 @@
           </w:p>
         </w:tc>
       </w:tr>
-      <w:tr>
+      <w:tr ns2:paraId="04503A3F" ns2:textId="77777777">
         <w:tblPrEx>
           <w:tblCellMar>
             <w:top w:w="0" w:type="dxa"/>
@@ -1690,7 +1690,7 @@
             </w:tcMar>
             <w:vAlign w:val="center"/>
           </w:tcPr>
-          <w:p>
+          <w:p ns2:paraId="21CBB639" ns2:textId="77777777">
             <w:r>
               <w:rPr>
                 <w:color w:val="595959"/>
@@ -1718,7 +1718,7 @@
             </w:tcMar>
             <w:vAlign w:val="center"/>
           </w:tcPr>
-          <w:p>
+          <w:p ns2:paraId="1F1A72F7" ns2:textId="77777777">
             <w:pPr>
               <w:jc w:val="right"/>
             </w:pPr>
@@ -1767,7 +1767,7 @@
             </w:tcMar>
             <w:vAlign w:val="center"/>
           </w:tcPr>
-          <w:p>
+          <w:p ns2:paraId="54B9216E" ns2:textId="77777777">
             <w:pPr>
               <w:jc w:val="right"/>
             </w:pPr>
@@ -1798,7 +1798,7 @@
             </w:tcMar>
             <w:vAlign w:val="center"/>
           </w:tcPr>
-          <w:p>
+          <w:p ns2:paraId="5D445F89" ns2:textId="77777777">
             <w:pPr>
               <w:jc w:val="right"/>
             </w:pPr>
@@ -1829,7 +1829,7 @@
             </w:tcMar>
             <w:vAlign w:val="center"/>
           </w:tcPr>
-          <w:p>
+          <w:p ns2:paraId="2311FE29" ns2:textId="77777777">
             <w:pPr>
               <w:jc w:val="right"/>
             </w:pPr>
@@ -1844,7 +1844,7 @@
           </w:p>
         </w:tc>
       </w:tr>
-      <w:tr>
+      <w:tr ns2:paraId="05D568FC" ns2:textId="77777777">
         <w:tblPrEx>
           <w:tblCellMar>
             <w:top w:w="0" w:type="dxa"/>
@@ -1869,7 +1869,7 @@
             </w:tcMar>
             <w:vAlign w:val="center"/>
           </w:tcPr>
-          <w:p/>
+          <w:p ns2:paraId="14D74414" ns2:textId="77777777"/>
         </w:tc>
         <w:tc>
           <w:tcPr>
@@ -1888,7 +1888,7 @@
             </w:tcMar>
             <w:vAlign w:val="center"/>
           </w:tcPr>
-          <w:p>
+          <w:p ns2:paraId="215B67CB" ns2:textId="77777777">
             <w:pPr>
               <w:jc w:val="right"/>
             </w:pPr>
@@ -1919,7 +1919,7 @@
             </w:tcMar>
             <w:vAlign w:val="center"/>
           </w:tcPr>
-          <w:p>
+          <w:p ns2:paraId="4AA996E2" ns2:textId="77777777">
             <w:pPr>
               <w:jc w:val="right"/>
             </w:pPr>
@@ -1950,7 +1950,7 @@
             </w:tcMar>
             <w:vAlign w:val="center"/>
           </w:tcPr>
-          <w:p>
+          <w:p ns2:paraId="670E4885" ns2:textId="77777777">
             <w:pPr>
               <w:jc w:val="right"/>
             </w:pPr>
@@ -1981,7 +1981,7 @@
             </w:tcMar>
             <w:vAlign w:val="center"/>
           </w:tcPr>
-          <w:p>
+          <w:p ns2:paraId="2A011027" ns2:textId="77777777">
             <w:pPr>
               <w:jc w:val="right"/>
             </w:pPr>
@@ -1996,7 +1996,7 @@
           </w:p>
         </w:tc>
       </w:tr>
-      <w:tr>
+      <w:tr ns2:paraId="4545A6DA" ns2:textId="77777777">
         <w:tblPrEx>
           <w:tblCellMar>
             <w:top w:w="0" w:type="dxa"/>
@@ -2021,7 +2021,7 @@
             </w:tcMar>
             <w:vAlign w:val="center"/>
           </w:tcPr>
-          <w:p>
+          <w:p ns2:paraId="67294397" ns2:textId="77777777">
             <w:r>
               <w:rPr>
                 <w:color w:val="595959"/>
@@ -2049,7 +2049,7 @@
             </w:tcMar>
             <w:vAlign w:val="center"/>
           </w:tcPr>
-          <w:p>
+          <w:p ns2:paraId="3512F2F7" ns2:textId="77777777">
             <w:pPr>
               <w:jc w:val="right"/>
             </w:pPr>
@@ -2098,7 +2098,7 @@
             </w:tcMar>
             <w:vAlign w:val="center"/>
           </w:tcPr>
-          <w:p>
+          <w:p ns2:paraId="32FFB1EB" ns2:textId="77777777">
             <w:pPr>
               <w:jc w:val="right"/>
             </w:pPr>
@@ -2129,7 +2129,7 @@
             </w:tcMar>
             <w:vAlign w:val="center"/>
           </w:tcPr>
-          <w:p>
+          <w:p ns2:paraId="16594317" ns2:textId="77777777">
             <w:pPr>
               <w:jc w:val="right"/>
             </w:pPr>
@@ -2160,7 +2160,7 @@
             </w:tcMar>
             <w:vAlign w:val="center"/>
           </w:tcPr>
-          <w:p>
+          <w:p ns2:paraId="796F7E1A" ns2:textId="77777777">
             <w:pPr>
               <w:jc w:val="right"/>
             </w:pPr>
@@ -2175,7 +2175,7 @@
           </w:p>
         </w:tc>
       </w:tr>
-      <w:tr>
+      <w:tr ns2:paraId="038BE47B" ns2:textId="77777777">
         <w:tblPrEx>
           <w:tblCellMar>
             <w:top w:w="0" w:type="dxa"/>
@@ -2200,7 +2200,7 @@
             </w:tcMar>
             <w:vAlign w:val="center"/>
           </w:tcPr>
-          <w:p/>
+          <w:p ns2:paraId="1C1ED955" ns2:textId="77777777"/>
         </w:tc>
         <w:tc>
           <w:tcPr>
@@ -2219,7 +2219,7 @@
             </w:tcMar>
             <w:vAlign w:val="center"/>
           </w:tcPr>
-          <w:p>
+          <w:p ns2:paraId="66844713" ns2:textId="77777777">
             <w:pPr>
               <w:jc w:val="right"/>
             </w:pPr>
@@ -2250,7 +2250,7 @@
             </w:tcMar>
             <w:vAlign w:val="center"/>
           </w:tcPr>
-          <w:p>
+          <w:p ns2:paraId="7BA7A2C1" ns2:textId="77777777">
             <w:pPr>
               <w:jc w:val="right"/>
             </w:pPr>
@@ -2281,7 +2281,7 @@
             </w:tcMar>
             <w:vAlign w:val="center"/>
           </w:tcPr>
-          <w:p>
+          <w:p ns2:paraId="691BB3CE" ns2:textId="77777777">
             <w:pPr>
               <w:jc w:val="right"/>
             </w:pPr>
@@ -2312,7 +2312,7 @@
             </w:tcMar>
             <w:vAlign w:val="center"/>
           </w:tcPr>
-          <w:p>
+          <w:p ns2:paraId="66CDE30A" ns2:textId="77777777">
             <w:pPr>
               <w:jc w:val="right"/>
             </w:pPr>
@@ -2327,7 +2327,7 @@
           </w:p>
         </w:tc>
       </w:tr>
-      <w:tr>
+      <w:tr ns2:paraId="375E1D4E" ns2:textId="77777777">
         <w:tblPrEx>
           <w:tblCellMar>
             <w:top w:w="0" w:type="dxa"/>
@@ -2352,7 +2352,7 @@
             </w:tcMar>
             <w:vAlign w:val="center"/>
           </w:tcPr>
-          <w:p>
+          <w:p ns2:paraId="28C9011A" ns2:textId="77777777">
             <w:r>
               <w:rPr>
                 <w:color w:val="595959"/>
@@ -2380,7 +2380,7 @@
             </w:tcMar>
             <w:vAlign w:val="center"/>
           </w:tcPr>
-          <w:p>
+          <w:p ns2:paraId="423C01AF" ns2:textId="77777777">
             <w:pPr>
               <w:jc w:val="right"/>
             </w:pPr>
@@ -2429,7 +2429,7 @@
             </w:tcMar>
             <w:vAlign w:val="center"/>
           </w:tcPr>
-          <w:p>
+          <w:p ns2:paraId="13197C1B" ns2:textId="77777777">
             <w:pPr>
               <w:jc w:val="right"/>
             </w:pPr>
@@ -2460,7 +2460,7 @@
             </w:tcMar>
             <w:vAlign w:val="center"/>
           </w:tcPr>
-          <w:p>
+          <w:p ns2:paraId="53BAD001" ns2:textId="77777777">
             <w:pPr>
               <w:jc w:val="right"/>
             </w:pPr>
@@ -2491,7 +2491,7 @@
             </w:tcMar>
             <w:vAlign w:val="center"/>
           </w:tcPr>
-          <w:p>
+          <w:p ns2:paraId="40CA990B" ns2:textId="77777777">
             <w:pPr>
               <w:jc w:val="right"/>
             </w:pPr>
@@ -2506,7 +2506,7 @@
           </w:p>
         </w:tc>
       </w:tr>
-      <w:tr>
+      <w:tr ns2:paraId="3447C299" ns2:textId="77777777">
         <w:tblPrEx>
           <w:tblCellMar>
             <w:top w:w="0" w:type="dxa"/>
@@ -2531,7 +2531,7 @@
             </w:tcMar>
             <w:vAlign w:val="center"/>
           </w:tcPr>
-          <w:p/>
+          <w:p ns2:paraId="3096F8CD" ns2:textId="77777777"/>
         </w:tc>
         <w:tc>
           <w:tcPr>
@@ -2550,7 +2550,7 @@
             </w:tcMar>
             <w:vAlign w:val="center"/>
           </w:tcPr>
-          <w:p>
+          <w:p ns2:paraId="2AD3A48B" ns2:textId="77777777">
             <w:pPr>
               <w:jc w:val="right"/>
             </w:pPr>
@@ -2581,7 +2581,7 @@
             </w:tcMar>
             <w:vAlign w:val="center"/>
           </w:tcPr>
-          <w:p>
+          <w:p ns2:paraId="145C3AB2" ns2:textId="77777777">
             <w:pPr>
               <w:jc w:val="right"/>
             </w:pPr>
@@ -2612,7 +2612,7 @@
             </w:tcMar>
             <w:vAlign w:val="center"/>
           </w:tcPr>
-          <w:p>
+          <w:p ns2:paraId="31447C1B" ns2:textId="77777777">
             <w:pPr>
               <w:jc w:val="right"/>
             </w:pPr>
@@ -2643,7 +2643,7 @@
             </w:tcMar>
             <w:vAlign w:val="center"/>
           </w:tcPr>
-          <w:p>
+          <w:p ns2:paraId="2B59EF8D" ns2:textId="77777777">
             <w:pPr>
               <w:jc w:val="right"/>
             </w:pPr>
@@ -2659,7 +2659,7 @@
         </w:tc>
       </w:tr>
     </w:tbl>
-    <w:p>
+    <w:p ns2:paraId="40014146" ns2:textId="77777777">
       <w:pPr>
         <w:spacing w:after="180"/>
         <w:jc w:val="center"/>
@@ -2671,7 +2671,7 @@
         <w:t>Table 2: ADF tests (AIC lag selection, max 12). From actual output.</w:t>
       </w:r>
     </w:p>
-    <w:p>
+    <w:p ns2:paraId="0B31DE2B" ns2:textId="77777777">
       <w:pPr>
         <w:spacing w:after="100"/>
         <w:jc w:val="both"/>
@@ -2712,7 +2712,7 @@
         <w:t xml:space="preserve"> levels following Sims, Stock and Watson (1990), with a first-difference robustness check in Section 5.3.</w:t>
       </w:r>
     </w:p>
-    <w:p>
+    <w:p ns2:paraId="1324D2E4" ns2:textId="77777777">
       <w:pPr>
         <w:pStyle w:val="Heading2"/>
         <w:spacing w:before="340" w:after="120"/>
@@ -2746,7 +2746,7 @@
         <w:gridCol w:w="1680"/>
         <w:gridCol w:w="1860"/>
       </w:tblGrid>
-      <w:tr>
+      <w:tr ns2:paraId="527FCD75" ns2:textId="77777777">
         <w:tblPrEx>
           <w:tblCellMar>
             <w:top w:w="0" w:type="dxa"/>
@@ -2771,7 +2771,7 @@
             </w:tcMar>
             <w:vAlign w:val="center"/>
           </w:tcPr>
-          <w:p>
+          <w:p ns2:paraId="06BB424F" ns2:textId="77777777">
             <w:r>
               <w:rPr>
                 <w:b/>
@@ -2802,7 +2802,7 @@
             </w:tcMar>
             <w:vAlign w:val="center"/>
           </w:tcPr>
-          <w:p>
+          <w:p ns2:paraId="58EB7D21" ns2:textId="77777777">
             <w:r>
               <w:rPr>
                 <w:b/>
@@ -2833,7 +2833,7 @@
             </w:tcMar>
             <w:vAlign w:val="center"/>
           </w:tcPr>
-          <w:p>
+          <w:p ns2:paraId="5D2C502D" ns2:textId="77777777">
             <w:r>
               <w:rPr>
                 <w:b/>
@@ -2864,7 +2864,7 @@
             </w:tcMar>
             <w:vAlign w:val="center"/>
           </w:tcPr>
-          <w:p>
+          <w:p ns2:paraId="080CAB7D" ns2:textId="77777777">
             <w:r>
               <w:rPr>
                 <w:b/>
@@ -2895,7 +2895,7 @@
             </w:tcMar>
             <w:vAlign w:val="center"/>
           </w:tcPr>
-          <w:p>
+          <w:p ns2:paraId="691B856B" ns2:textId="77777777">
             <w:r>
               <w:rPr>
                 <w:b/>
@@ -2926,7 +2926,7 @@
             </w:tcMar>
             <w:vAlign w:val="center"/>
           </w:tcPr>
-          <w:p>
+          <w:p ns2:paraId="5FDA3DC0" ns2:textId="77777777">
             <w:r>
               <w:rPr>
                 <w:b/>
@@ -2940,7 +2940,7 @@
           </w:p>
         </w:tc>
       </w:tr>
-      <w:tr>
+      <w:tr ns2:paraId="16CD22CC" ns2:textId="77777777">
         <w:tblPrEx>
           <w:tblCellMar>
             <w:top w:w="0" w:type="dxa"/>
@@ -2965,7 +2965,7 @@
             </w:tcMar>
             <w:vAlign w:val="center"/>
           </w:tcPr>
-          <w:p>
+          <w:p ns2:paraId="0BF9F220" ns2:textId="77777777">
             <w:r>
               <w:rPr>
                 <w:color w:val="595959"/>
@@ -2993,7 +2993,7 @@
             </w:tcMar>
             <w:vAlign w:val="center"/>
           </w:tcPr>
-          <w:p>
+          <w:p ns2:paraId="0ECA6954" ns2:textId="77777777">
             <w:pPr>
               <w:jc w:val="right"/>
             </w:pPr>
@@ -3024,7 +3024,7 @@
             </w:tcMar>
             <w:vAlign w:val="center"/>
           </w:tcPr>
-          <w:p>
+          <w:p ns2:paraId="06377BBC" ns2:textId="77777777">
             <w:pPr>
               <w:jc w:val="right"/>
             </w:pPr>
@@ -3055,7 +3055,7 @@
             </w:tcMar>
             <w:vAlign w:val="center"/>
           </w:tcPr>
-          <w:p>
+          <w:p ns2:paraId="199281F6" ns2:textId="77777777">
             <w:pPr>
               <w:jc w:val="right"/>
             </w:pPr>
@@ -3086,7 +3086,7 @@
             </w:tcMar>
             <w:vAlign w:val="center"/>
           </w:tcPr>
-          <w:p>
+          <w:p ns2:paraId="249089B8" ns2:textId="77777777">
             <w:pPr>
               <w:jc w:val="right"/>
             </w:pPr>
@@ -3117,14 +3117,14 @@
             </w:tcMar>
             <w:vAlign w:val="center"/>
           </w:tcPr>
-          <w:p>
+          <w:p ns2:paraId="58001908" ns2:textId="77777777">
             <w:pPr>
               <w:jc w:val="right"/>
             </w:pPr>
           </w:p>
         </w:tc>
       </w:tr>
-      <w:tr>
+      <w:tr ns2:paraId="05CFC1E5" ns2:textId="77777777">
         <w:tblPrEx>
           <w:tblCellMar>
             <w:top w:w="0" w:type="dxa"/>
@@ -3149,7 +3149,7 @@
             </w:tcMar>
             <w:vAlign w:val="center"/>
           </w:tcPr>
-          <w:p>
+          <w:p ns2:paraId="56BCAC3F" ns2:textId="77777777">
             <w:r>
               <w:rPr>
                 <w:color w:val="595959"/>
@@ -3177,7 +3177,7 @@
             </w:tcMar>
             <w:vAlign w:val="center"/>
           </w:tcPr>
-          <w:p>
+          <w:p ns2:paraId="1F28D94F" ns2:textId="77777777">
             <w:pPr>
               <w:jc w:val="right"/>
             </w:pPr>
@@ -3208,7 +3208,7 @@
             </w:tcMar>
             <w:vAlign w:val="center"/>
           </w:tcPr>
-          <w:p>
+          <w:p ns2:paraId="7D257F2A" ns2:textId="77777777">
             <w:pPr>
               <w:jc w:val="right"/>
             </w:pPr>
@@ -3239,7 +3239,7 @@
             </w:tcMar>
             <w:vAlign w:val="center"/>
           </w:tcPr>
-          <w:p>
+          <w:p ns2:paraId="228C7BCD" ns2:textId="77777777">
             <w:pPr>
               <w:jc w:val="right"/>
             </w:pPr>
@@ -3270,7 +3270,7 @@
             </w:tcMar>
             <w:vAlign w:val="center"/>
           </w:tcPr>
-          <w:p>
+          <w:p ns2:paraId="02761F99" ns2:textId="77777777">
             <w:pPr>
               <w:jc w:val="right"/>
             </w:pPr>
@@ -3301,7 +3301,7 @@
             </w:tcMar>
             <w:vAlign w:val="center"/>
           </w:tcPr>
-          <w:p>
+          <w:p ns2:paraId="08A6E5EF" ns2:textId="77777777">
             <w:pPr>
               <w:jc w:val="right"/>
             </w:pPr>
@@ -3316,7 +3316,7 @@
           </w:p>
         </w:tc>
       </w:tr>
-      <w:tr>
+      <w:tr ns2:paraId="560A3D1F" ns2:textId="77777777">
         <w:tblPrEx>
           <w:tblCellMar>
             <w:top w:w="0" w:type="dxa"/>
@@ -3341,7 +3341,7 @@
             </w:tcMar>
             <w:vAlign w:val="center"/>
           </w:tcPr>
-          <w:p>
+          <w:p ns2:paraId="0E4E1DEA" ns2:textId="77777777">
             <w:r>
               <w:rPr>
                 <w:color w:val="595959"/>
@@ -3369,7 +3369,7 @@
             </w:tcMar>
             <w:vAlign w:val="center"/>
           </w:tcPr>
-          <w:p>
+          <w:p ns2:paraId="65DE5946" ns2:textId="77777777">
             <w:pPr>
               <w:jc w:val="right"/>
             </w:pPr>
@@ -3400,7 +3400,7 @@
             </w:tcMar>
             <w:vAlign w:val="center"/>
           </w:tcPr>
-          <w:p>
+          <w:p ns2:paraId="1E13BF61" ns2:textId="77777777">
             <w:pPr>
               <w:jc w:val="right"/>
             </w:pPr>
@@ -3431,7 +3431,7 @@
             </w:tcMar>
             <w:vAlign w:val="center"/>
           </w:tcPr>
-          <w:p>
+          <w:p ns2:paraId="76A1A3C2" ns2:textId="77777777">
             <w:pPr>
               <w:jc w:val="right"/>
             </w:pPr>
@@ -3462,7 +3462,7 @@
             </w:tcMar>
             <w:vAlign w:val="center"/>
           </w:tcPr>
-          <w:p>
+          <w:p ns2:paraId="32143A2B" ns2:textId="77777777">
             <w:pPr>
               <w:jc w:val="right"/>
             </w:pPr>
@@ -3493,7 +3493,7 @@
             </w:tcMar>
             <w:vAlign w:val="center"/>
           </w:tcPr>
-          <w:p>
+          <w:p ns2:paraId="4D0864A7" ns2:textId="77777777">
             <w:pPr>
               <w:jc w:val="right"/>
             </w:pPr>
@@ -3508,7 +3508,7 @@
           </w:p>
         </w:tc>
       </w:tr>
-      <w:tr>
+      <w:tr ns2:paraId="5A082819" ns2:textId="77777777">
         <w:tblPrEx>
           <w:tblCellMar>
             <w:top w:w="0" w:type="dxa"/>
@@ -3533,7 +3533,7 @@
             </w:tcMar>
             <w:vAlign w:val="center"/>
           </w:tcPr>
-          <w:p>
+          <w:p ns2:paraId="61D7C206" ns2:textId="77777777">
             <w:r>
               <w:rPr>
                 <w:color w:val="595959"/>
@@ -3561,7 +3561,7 @@
             </w:tcMar>
             <w:vAlign w:val="center"/>
           </w:tcPr>
-          <w:p>
+          <w:p ns2:paraId="2D3B525F" ns2:textId="77777777">
             <w:pPr>
               <w:jc w:val="right"/>
             </w:pPr>
@@ -3592,7 +3592,7 @@
             </w:tcMar>
             <w:vAlign w:val="center"/>
           </w:tcPr>
-          <w:p>
+          <w:p ns2:paraId="57D3D975" ns2:textId="77777777">
             <w:pPr>
               <w:jc w:val="right"/>
             </w:pPr>
@@ -3623,7 +3623,7 @@
             </w:tcMar>
             <w:vAlign w:val="center"/>
           </w:tcPr>
-          <w:p>
+          <w:p ns2:paraId="754A3A43" ns2:textId="77777777">
             <w:pPr>
               <w:jc w:val="right"/>
             </w:pPr>
@@ -3654,7 +3654,7 @@
             </w:tcMar>
             <w:vAlign w:val="center"/>
           </w:tcPr>
-          <w:p>
+          <w:p ns2:paraId="3BAA1799" ns2:textId="77777777">
             <w:pPr>
               <w:jc w:val="right"/>
             </w:pPr>
@@ -3685,7 +3685,7 @@
             </w:tcMar>
             <w:vAlign w:val="center"/>
           </w:tcPr>
-          <w:p>
+          <w:p ns2:paraId="07581AC8" ns2:textId="77777777">
             <w:pPr>
               <w:jc w:val="right"/>
             </w:pPr>
@@ -3693,7 +3693,7 @@
         </w:tc>
       </w:tr>
     </w:tbl>
-    <w:p>
+    <w:p ns2:paraId="05F71ED4" ns2:textId="77777777">
       <w:pPr>
         <w:spacing w:after="180"/>
         <w:jc w:val="center"/>
@@ -3705,7 +3705,7 @@
         <w:t>Table 3: Lag order selection. From actual output.</w:t>
       </w:r>
     </w:p>
-    <w:p>
+    <w:p ns2:paraId="74665306" ns2:textId="77777777">
       <w:pPr>
         <w:spacing w:after="100"/>
         <w:jc w:val="both"/>
@@ -3717,12 +3717,12 @@
         <w:t>BIC selects p=2; AIC selects p=3. We adopt p=2 (BIC) as baseline. FPE is identical for p=2,3,4.</w:t>
       </w:r>
     </w:p>
-    <w:p>
+    <w:p ns2:paraId="148C0D3C" ns2:textId="77777777">
       <w:r>
         <w:br w:type="page"/>
       </w:r>
     </w:p>
-    <w:p>
+    <w:p ns2:paraId="5BE47A9B" ns2:textId="77777777">
       <w:pPr>
         <w:pStyle w:val="Heading1"/>
       </w:pPr>
@@ -3731,7 +3731,7 @@
         <w:t>3. Methodology</w:t>
       </w:r>
     </w:p>
-    <w:p>
+    <w:p ns2:paraId="674074E8" ns2:textId="77777777">
       <w:pPr>
         <w:pStyle w:val="Heading2"/>
         <w:spacing w:before="340" w:after="120"/>
@@ -3748,7 +3748,7 @@
         <w:t>2) Model</w:t>
       </w:r>
     </w:p>
-    <w:p>
+    <w:p ns2:paraId="2ED1D800" ns2:textId="77777777">
       <w:pPr>
         <w:spacing w:before="100" w:after="100"/>
         <w:jc w:val="center"/>
@@ -3803,7 +3803,7 @@
         <w:t>0, I_T, Σ)</w:t>
       </w:r>
     </w:p>
-    <w:p>
+    <w:p ns2:paraId="43584B2C" ns2:textId="77777777">
       <w:pPr>
         <w:spacing w:after="100"/>
         <w:jc w:val="both"/>
@@ -3857,7 +3857,7 @@
         <w:t>.</w:t>
       </w:r>
     </w:p>
-    <w:p>
+    <w:p ns2:paraId="2D48A24A" ns2:textId="77777777">
       <w:pPr>
         <w:pStyle w:val="Heading2"/>
         <w:spacing w:before="340" w:after="120"/>
@@ -3866,7 +3866,7 @@
         <w:t>3.2 Minnesota / NIW Prior</w:t>
       </w:r>
     </w:p>
-    <w:p>
+    <w:p ns2:paraId="5686B96A" ns2:textId="77777777">
       <w:pPr>
         <w:spacing w:before="80" w:after="100"/>
         <w:jc w:val="center"/>
@@ -3941,7 +3941,7 @@
         <w:t>S₀, ν₀)</w:t>
       </w:r>
     </w:p>
-    <w:p>
+    <w:p ns2:paraId="0983EAC2" ns2:textId="77777777">
       <w:pPr>
         <w:spacing w:after="100"/>
         <w:jc w:val="both"/>
@@ -4037,7 +4037,7 @@
         <w:t>[0.43622, 0.04251, 0.00365].</w:t>
       </w:r>
     </w:p>
-    <w:p>
+    <w:p ns2:paraId="24D1C063" ns2:textId="77777777">
       <w:pPr>
         <w:pStyle w:val="Heading2"/>
         <w:spacing w:before="340" w:after="120"/>
@@ -4046,7 +4046,7 @@
         <w:t>3.3 Gibbs Sampler (from scratch)</w:t>
       </w:r>
     </w:p>
-    <w:p>
+    <w:p ns2:paraId="1DCE5A60" ns2:textId="77777777">
       <w:pPr>
         <w:spacing w:after="100"/>
         <w:jc w:val="both"/>
@@ -4240,7 +4240,7 @@
         <w:t>(Σ)′.</w:t>
       </w:r>
     </w:p>
-    <w:p>
+    <w:p ns2:paraId="106DE880" ns2:textId="77777777">
       <w:pPr>
         <w:spacing w:after="100"/>
         <w:jc w:val="both"/>
@@ -4297,7 +4297,7 @@
         <w:rPr>
           <w:color w:val="595959"/>
         </w:rPr>
-        <w:t xml:space="preserve"> = ν₀ + T. Draw Σ ~ </w:t>
+        <w:t xml:space="preserve"> = ν₀ + T + k. Draw Σ ~ </w:t>
       </w:r>
       <w:proofErr w:type="gramStart"/>
       <w:r>
@@ -4336,7 +4336,7 @@
         <w:t>) via Bartlett decomposition.</w:t>
       </w:r>
     </w:p>
-    <w:p>
+    <w:p ns2:paraId="637D1EE2" ns2:textId="77777777">
       <w:pPr>
         <w:spacing w:after="100"/>
         <w:jc w:val="both"/>
@@ -4376,7 +4376,7 @@
         <w:t>.</w:t>
       </w:r>
     </w:p>
-    <w:p>
+    <w:p ns2:paraId="5216C0A2" ns2:textId="77777777">
       <w:pPr>
         <w:pStyle w:val="Heading2"/>
         <w:spacing w:before="340" w:after="120"/>
@@ -4385,7 +4385,7 @@
         <w:t>3.4 Structural Identification</w:t>
       </w:r>
     </w:p>
-    <w:p>
+    <w:p ns2:paraId="4DE8DC58" ns2:textId="77777777">
       <w:pPr>
         <w:spacing w:after="100"/>
         <w:jc w:val="both"/>
@@ -4397,12 +4397,12 @@
         <w:t>Cholesky decomposition with baseline ordering [CPI, Rate, PLN/EUR]. CPI is predetermined (monthly price stickiness); Rate responds to CPI within month (Taylor rule); PLN/EUR reacts contemporaneously to everything (asset price).</w:t>
       </w:r>
     </w:p>
-    <w:p>
+    <w:p ns2:paraId="7959FF78" ns2:textId="77777777">
       <w:r>
         <w:br w:type="page"/>
       </w:r>
     </w:p>
-    <w:p>
+    <w:p ns2:paraId="0CAAA731" ns2:textId="77777777">
       <w:pPr>
         <w:pStyle w:val="Heading1"/>
       </w:pPr>
@@ -4411,7 +4411,7 @@
         <w:t>4. Estimation Results</w:t>
       </w:r>
     </w:p>
-    <w:p>
+    <w:p ns2:paraId="09DCBB60" ns2:textId="77777777">
       <w:pPr>
         <w:pStyle w:val="Heading2"/>
         <w:spacing w:before="340" w:after="120"/>
@@ -4446,7 +4446,7 @@
         <w:gridCol w:w="800"/>
         <w:gridCol w:w="1260"/>
       </w:tblGrid>
-      <w:tr>
+      <w:tr ns2:paraId="14679C50" ns2:textId="77777777">
         <w:tblPrEx>
           <w:tblCellMar>
             <w:top w:w="0" w:type="dxa"/>
@@ -4471,7 +4471,7 @@
             </w:tcMar>
             <w:vAlign w:val="center"/>
           </w:tcPr>
-          <w:p>
+          <w:p ns2:paraId="740D0AAB" ns2:textId="77777777">
             <w:r>
               <w:rPr>
                 <w:b/>
@@ -4502,7 +4502,7 @@
             </w:tcMar>
             <w:vAlign w:val="center"/>
           </w:tcPr>
-          <w:p>
+          <w:p ns2:paraId="335F3630" ns2:textId="77777777">
             <w:r>
               <w:rPr>
                 <w:b/>
@@ -4533,7 +4533,7 @@
             </w:tcMar>
             <w:vAlign w:val="center"/>
           </w:tcPr>
-          <w:p>
+          <w:p ns2:paraId="66AE90D9" ns2:textId="77777777">
             <w:r>
               <w:rPr>
                 <w:b/>
@@ -4564,7 +4564,7 @@
             </w:tcMar>
             <w:vAlign w:val="center"/>
           </w:tcPr>
-          <w:p>
+          <w:p ns2:paraId="51F7C4A0" ns2:textId="77777777">
             <w:r>
               <w:rPr>
                 <w:b/>
@@ -4595,7 +4595,7 @@
             </w:tcMar>
             <w:vAlign w:val="center"/>
           </w:tcPr>
-          <w:p>
+          <w:p ns2:paraId="293F0844" ns2:textId="77777777">
             <w:r>
               <w:rPr>
                 <w:b/>
@@ -4626,7 +4626,7 @@
             </w:tcMar>
             <w:vAlign w:val="center"/>
           </w:tcPr>
-          <w:p>
+          <w:p ns2:paraId="722CDFE2" ns2:textId="77777777">
             <w:r>
               <w:rPr>
                 <w:b/>
@@ -4657,7 +4657,7 @@
             </w:tcMar>
             <w:vAlign w:val="center"/>
           </w:tcPr>
-          <w:p>
+          <w:p ns2:paraId="3E95D05F" ns2:textId="77777777">
             <w:proofErr w:type="spellStart"/>
             <w:r>
               <w:rPr>
@@ -4673,7 +4673,7 @@
           </w:p>
         </w:tc>
       </w:tr>
-      <w:tr>
+      <w:tr ns2:paraId="32400A1E" ns2:textId="77777777">
         <w:tblPrEx>
           <w:tblCellMar>
             <w:top w:w="0" w:type="dxa"/>
@@ -4698,7 +4698,7 @@
             </w:tcMar>
             <w:vAlign w:val="center"/>
           </w:tcPr>
-          <w:p>
+          <w:p ns2:paraId="65E46DB2" ns2:textId="77777777">
             <w:r>
               <w:rPr>
                 <w:color w:val="595959"/>
@@ -4726,7 +4726,7 @@
             </w:tcMar>
             <w:vAlign w:val="center"/>
           </w:tcPr>
-          <w:p>
+          <w:p ns2:paraId="07512E31" ns2:textId="77777777">
             <w:pPr>
               <w:jc w:val="right"/>
             </w:pPr>
@@ -4757,7 +4757,7 @@
             </w:tcMar>
             <w:vAlign w:val="center"/>
           </w:tcPr>
-          <w:p>
+          <w:p ns2:paraId="5065D030" ns2:textId="77777777">
             <w:pPr>
               <w:jc w:val="right"/>
             </w:pPr>
@@ -4788,7 +4788,7 @@
             </w:tcMar>
             <w:vAlign w:val="center"/>
           </w:tcPr>
-          <w:p>
+          <w:p ns2:paraId="6CF098BA" ns2:textId="77777777">
             <w:pPr>
               <w:jc w:val="right"/>
             </w:pPr>
@@ -4819,7 +4819,7 @@
             </w:tcMar>
             <w:vAlign w:val="center"/>
           </w:tcPr>
-          <w:p>
+          <w:p ns2:paraId="652008DC" ns2:textId="77777777">
             <w:pPr>
               <w:jc w:val="right"/>
             </w:pPr>
@@ -4850,7 +4850,7 @@
             </w:tcMar>
             <w:vAlign w:val="center"/>
           </w:tcPr>
-          <w:p>
+          <w:p ns2:paraId="1900D257" ns2:textId="77777777">
             <w:pPr>
               <w:jc w:val="right"/>
             </w:pPr>
@@ -4881,7 +4881,7 @@
             </w:tcMar>
             <w:vAlign w:val="center"/>
           </w:tcPr>
-          <w:p>
+          <w:p ns2:paraId="4F921518" ns2:textId="77777777">
             <w:pPr>
               <w:jc w:val="right"/>
             </w:pPr>
@@ -4896,7 +4896,7 @@
           </w:p>
         </w:tc>
       </w:tr>
-      <w:tr>
+      <w:tr ns2:paraId="38D59ED5" ns2:textId="77777777">
         <w:tblPrEx>
           <w:tblCellMar>
             <w:top w:w="0" w:type="dxa"/>
@@ -4921,7 +4921,7 @@
             </w:tcMar>
             <w:vAlign w:val="center"/>
           </w:tcPr>
-          <w:p>
+          <w:p ns2:paraId="5DD0F6EA" ns2:textId="77777777">
             <w:r>
               <w:rPr>
                 <w:color w:val="595959"/>
@@ -4949,7 +4949,7 @@
             </w:tcMar>
             <w:vAlign w:val="center"/>
           </w:tcPr>
-          <w:p>
+          <w:p ns2:paraId="349D5CEE" ns2:textId="77777777">
             <w:pPr>
               <w:jc w:val="right"/>
             </w:pPr>
@@ -4980,7 +4980,7 @@
             </w:tcMar>
             <w:vAlign w:val="center"/>
           </w:tcPr>
-          <w:p>
+          <w:p ns2:paraId="1402DBD9" ns2:textId="77777777">
             <w:pPr>
               <w:jc w:val="right"/>
             </w:pPr>
@@ -5011,7 +5011,7 @@
             </w:tcMar>
             <w:vAlign w:val="center"/>
           </w:tcPr>
-          <w:p>
+          <w:p ns2:paraId="4CB8CEF3" ns2:textId="77777777">
             <w:pPr>
               <w:jc w:val="right"/>
             </w:pPr>
@@ -5042,7 +5042,7 @@
             </w:tcMar>
             <w:vAlign w:val="center"/>
           </w:tcPr>
-          <w:p>
+          <w:p ns2:paraId="68E8262D" ns2:textId="77777777">
             <w:pPr>
               <w:jc w:val="right"/>
             </w:pPr>
@@ -5073,7 +5073,7 @@
             </w:tcMar>
             <w:vAlign w:val="center"/>
           </w:tcPr>
-          <w:p>
+          <w:p ns2:paraId="2D0D8DC0" ns2:textId="77777777">
             <w:pPr>
               <w:jc w:val="right"/>
             </w:pPr>
@@ -5104,7 +5104,7 @@
             </w:tcMar>
             <w:vAlign w:val="center"/>
           </w:tcPr>
-          <w:p>
+          <w:p ns2:paraId="7C03CCD2" ns2:textId="77777777">
             <w:pPr>
               <w:jc w:val="right"/>
             </w:pPr>
@@ -5119,7 +5119,7 @@
           </w:p>
         </w:tc>
       </w:tr>
-      <w:tr>
+      <w:tr ns2:paraId="309904C4" ns2:textId="77777777">
         <w:tblPrEx>
           <w:tblCellMar>
             <w:top w:w="0" w:type="dxa"/>
@@ -5144,7 +5144,7 @@
             </w:tcMar>
             <w:vAlign w:val="center"/>
           </w:tcPr>
-          <w:p>
+          <w:p ns2:paraId="763B25AC" ns2:textId="77777777">
             <w:r>
               <w:rPr>
                 <w:color w:val="595959"/>
@@ -5172,7 +5172,7 @@
             </w:tcMar>
             <w:vAlign w:val="center"/>
           </w:tcPr>
-          <w:p>
+          <w:p ns2:paraId="56211E96" ns2:textId="77777777">
             <w:pPr>
               <w:jc w:val="right"/>
             </w:pPr>
@@ -5203,7 +5203,7 @@
             </w:tcMar>
             <w:vAlign w:val="center"/>
           </w:tcPr>
-          <w:p>
+          <w:p ns2:paraId="4F9F37EF" ns2:textId="77777777">
             <w:pPr>
               <w:jc w:val="right"/>
             </w:pPr>
@@ -5234,7 +5234,7 @@
             </w:tcMar>
             <w:vAlign w:val="center"/>
           </w:tcPr>
-          <w:p>
+          <w:p ns2:paraId="2A31A4B1" ns2:textId="77777777">
             <w:pPr>
               <w:jc w:val="right"/>
             </w:pPr>
@@ -5265,7 +5265,7 @@
             </w:tcMar>
             <w:vAlign w:val="center"/>
           </w:tcPr>
-          <w:p>
+          <w:p ns2:paraId="4D87DE1C" ns2:textId="77777777">
             <w:pPr>
               <w:jc w:val="right"/>
             </w:pPr>
@@ -5296,7 +5296,7 @@
             </w:tcMar>
             <w:vAlign w:val="center"/>
           </w:tcPr>
-          <w:p>
+          <w:p ns2:paraId="7060C0C5" ns2:textId="77777777">
             <w:pPr>
               <w:jc w:val="right"/>
             </w:pPr>
@@ -5327,7 +5327,7 @@
             </w:tcMar>
             <w:vAlign w:val="center"/>
           </w:tcPr>
-          <w:p>
+          <w:p ns2:paraId="4AD03549" ns2:textId="77777777">
             <w:pPr>
               <w:jc w:val="right"/>
             </w:pPr>
@@ -5343,7 +5343,7 @@
         </w:tc>
       </w:tr>
     </w:tbl>
-    <w:p>
+    <w:p ns2:paraId="7958A579" ns2:textId="77777777">
       <w:pPr>
         <w:spacing w:after="180"/>
         <w:jc w:val="center"/>
@@ -5369,7 +5369,7 @@
         <w:t xml:space="preserve"> Z| &lt; 1.96. Numbers from actual output.</w:t>
       </w:r>
     </w:p>
-    <w:p>
+    <w:p ns2:paraId="58D0FDBB" ns2:textId="77777777">
       <w:pPr>
         <w:spacing w:after="100"/>
         <w:jc w:val="both"/>
@@ -5409,7 +5409,7 @@
         <w:t xml:space="preserve"> 90% CI includes 1.0, consistent with near-unit-root status from ADF tests.</w:t>
       </w:r>
     </w:p>
-    <w:p>
+    <w:p ns2:paraId="64A2C2A0" ns2:textId="77777777">
       <w:pPr>
         <w:spacing w:after="100"/>
         <w:jc w:val="both"/>
@@ -5421,12 +5421,12 @@
         <w:t>Posterior mean Σ: [[0.394, 0.045, 0.003], [0.045, 0.033, −0.001], [0.003, −0.001, 0.004]]. The CPI-rate correlation is positive (0.247 from classical VAR), reflecting co-movement during the inflation surge. The rate-FX correlation is negative (−0.165), consistent with rate hikes attracting capital and strengthening PLN.</w:t>
       </w:r>
     </w:p>
-    <w:p>
+    <w:p ns2:paraId="53117035" ns2:textId="77777777">
       <w:pPr>
         <w:spacing w:after="80"/>
       </w:pPr>
     </w:p>
-    <w:p>
+    <w:p ns2:paraId="5F0A734C" ns2:textId="77777777">
       <w:pPr>
         <w:spacing w:before="140" w:after="60"/>
         <w:jc w:val="center"/>
@@ -5436,46 +5436,46 @@
           <w:noProof/>
         </w:rPr>
         <w:drawing>
-          <wp:inline distT="0" distB="0" distL="0" distR="0" wp14:anchorId="34E8FC82" wp14:editId="692BDA9F">
-            <wp:extent cx="5762625" cy="3200400"/>
-            <wp:effectExtent l="0" t="0" r="0" b="0"/>
-            <wp:docPr id="1966190455" name="Picture 1966190455"/>
-            <wp:cNvGraphicFramePr>
-              <a:graphicFrameLocks xmlns:a="http://schemas.openxmlformats.org/drawingml/2006/main" noChangeAspect="1"/>
-            </wp:cNvGraphicFramePr>
-            <a:graphic xmlns:a="http://schemas.openxmlformats.org/drawingml/2006/main">
-              <a:graphicData uri="http://schemas.openxmlformats.org/drawingml/2006/picture">
-                <pic:pic xmlns:pic="http://schemas.openxmlformats.org/drawingml/2006/picture">
-                  <pic:nvPicPr>
-                    <pic:cNvPr id="0" name=""/>
-                    <pic:cNvPicPr>
-                      <a:picLocks noChangeAspect="1" noChangeArrowheads="1"/>
-                    </pic:cNvPicPr>
-                  </pic:nvPicPr>
-                  <pic:blipFill>
-                    <a:blip r:embed="rId8"/>
-                    <a:srcRect/>
-                    <a:stretch>
-                      <a:fillRect/>
-                    </a:stretch>
-                  </pic:blipFill>
-                  <pic:spPr bwMode="auto">
-                    <a:xfrm>
-                      <a:off x="0" y="0"/>
-                      <a:ext cx="5762625" cy="3200400"/>
-                    </a:xfrm>
-                    <a:prstGeom prst="rect">
-                      <a:avLst/>
-                    </a:prstGeom>
-                  </pic:spPr>
-                </pic:pic>
-              </a:graphicData>
-            </a:graphic>
-          </wp:inline>
+          <ns3:inline distT="0" distB="0" distL="0" distR="0" ns4:anchorId="34E8FC82" ns4:editId="692BDA9F">
+            <ns3:extent cx="5762625" cy="3200400"/>
+            <ns3:effectExtent l="0" t="0" r="0" b="0"/>
+            <ns3:docPr id="1966190455" name="Picture 1966190455"/>
+            <ns3:cNvGraphicFramePr>
+              <ns5:graphicFrameLocks noChangeAspect="1"/>
+            </ns3:cNvGraphicFramePr>
+            <ns5:graphic>
+              <ns5:graphicData uri="http://schemas.openxmlformats.org/drawingml/2006/picture">
+                <ns6:pic>
+                  <ns6:nvPicPr>
+                    <ns6:cNvPr id="0" name=""/>
+                    <ns6:cNvPicPr>
+                      <ns5:picLocks noChangeAspect="1" noChangeArrowheads="1"/>
+                    </ns6:cNvPicPr>
+                  </ns6:nvPicPr>
+                  <ns6:blipFill>
+                    <ns5:blip ns7:embed="rId8"/>
+                    <ns5:srcRect/>
+                    <ns5:stretch>
+                      <ns5:fillRect/>
+                    </ns5:stretch>
+                  </ns6:blipFill>
+                  <ns6:spPr bwMode="auto">
+                    <ns5:xfrm>
+                      <ns5:off x="0" y="0"/>
+                      <ns5:ext cx="5762625" cy="3200400"/>
+                    </ns5:xfrm>
+                    <ns5:prstGeom prst="rect">
+                      <ns5:avLst/>
+                    </ns5:prstGeom>
+                  </ns6:spPr>
+                </ns6:pic>
+              </ns5:graphicData>
+            </ns5:graphic>
+          </ns3:inline>
         </w:drawing>
       </w:r>
     </w:p>
-    <w:p>
+    <w:p ns2:paraId="2EF626D8" ns2:textId="77777777">
       <w:pPr>
         <w:spacing w:after="160"/>
         <w:jc w:val="center"/>
@@ -5487,7 +5487,7 @@
         <w:t>Figure 2: In-sample fit. Solid: actual data. Dashed: posterior mean fitted values.</w:t>
       </w:r>
     </w:p>
-    <w:p>
+    <w:p ns2:paraId="343CE617" ns2:textId="77777777">
       <w:pPr>
         <w:spacing w:before="140" w:after="60"/>
         <w:jc w:val="center"/>
@@ -5498,46 +5498,46 @@
         </w:rPr>
         <w:lastRenderedPageBreak/>
         <w:drawing>
-          <wp:inline distT="0" distB="0" distL="0" distR="0" wp14:anchorId="526EE5F8" wp14:editId="03793DA1">
-            <wp:extent cx="5943600" cy="3933825"/>
-            <wp:effectExtent l="0" t="0" r="0" b="0"/>
-            <wp:docPr id="1157431679" name="Picture 1157431679"/>
-            <wp:cNvGraphicFramePr>
-              <a:graphicFrameLocks xmlns:a="http://schemas.openxmlformats.org/drawingml/2006/main" noChangeAspect="1"/>
-            </wp:cNvGraphicFramePr>
-            <a:graphic xmlns:a="http://schemas.openxmlformats.org/drawingml/2006/main">
-              <a:graphicData uri="http://schemas.openxmlformats.org/drawingml/2006/picture">
-                <pic:pic xmlns:pic="http://schemas.openxmlformats.org/drawingml/2006/picture">
-                  <pic:nvPicPr>
-                    <pic:cNvPr id="0" name=""/>
-                    <pic:cNvPicPr>
-                      <a:picLocks noChangeAspect="1" noChangeArrowheads="1"/>
-                    </pic:cNvPicPr>
-                  </pic:nvPicPr>
-                  <pic:blipFill>
-                    <a:blip r:embed="rId9"/>
-                    <a:srcRect/>
-                    <a:stretch>
-                      <a:fillRect/>
-                    </a:stretch>
-                  </pic:blipFill>
-                  <pic:spPr bwMode="auto">
-                    <a:xfrm>
-                      <a:off x="0" y="0"/>
-                      <a:ext cx="5943600" cy="3933825"/>
-                    </a:xfrm>
-                    <a:prstGeom prst="rect">
-                      <a:avLst/>
-                    </a:prstGeom>
-                  </pic:spPr>
-                </pic:pic>
-              </a:graphicData>
-            </a:graphic>
-          </wp:inline>
+          <ns3:inline distT="0" distB="0" distL="0" distR="0" ns4:anchorId="526EE5F8" ns4:editId="03793DA1">
+            <ns3:extent cx="5943600" cy="3933825"/>
+            <ns3:effectExtent l="0" t="0" r="0" b="0"/>
+            <ns3:docPr id="1157431679" name="Picture 1157431679"/>
+            <ns3:cNvGraphicFramePr>
+              <ns5:graphicFrameLocks noChangeAspect="1"/>
+            </ns3:cNvGraphicFramePr>
+            <ns5:graphic>
+              <ns5:graphicData uri="http://schemas.openxmlformats.org/drawingml/2006/picture">
+                <ns6:pic>
+                  <ns6:nvPicPr>
+                    <ns6:cNvPr id="0" name=""/>
+                    <ns6:cNvPicPr>
+                      <ns5:picLocks noChangeAspect="1" noChangeArrowheads="1"/>
+                    </ns6:cNvPicPr>
+                  </ns6:nvPicPr>
+                  <ns6:blipFill>
+                    <ns5:blip ns7:embed="rId9"/>
+                    <ns5:srcRect/>
+                    <ns5:stretch>
+                      <ns5:fillRect/>
+                    </ns5:stretch>
+                  </ns6:blipFill>
+                  <ns6:spPr bwMode="auto">
+                    <ns5:xfrm>
+                      <ns5:off x="0" y="0"/>
+                      <ns5:ext cx="5943600" cy="3933825"/>
+                    </ns5:xfrm>
+                    <ns5:prstGeom prst="rect">
+                      <ns5:avLst/>
+                    </ns5:prstGeom>
+                  </ns6:spPr>
+                </ns6:pic>
+              </ns5:graphicData>
+            </ns5:graphic>
+          </ns3:inline>
         </w:drawing>
       </w:r>
     </w:p>
-    <w:p>
+    <w:p ns2:paraId="1F53CDFC" ns2:textId="77777777">
       <w:pPr>
         <w:spacing w:after="160"/>
         <w:jc w:val="center"/>
@@ -5549,7 +5549,7 @@
         <w:t>Figure 3: Marginal posteriors. Own lag-1 (top), residual variance (middle), constants (bottom). Values from actual posterior output: CPI mean=0.394, Rate mean=0.033, FX mean=0.004.</w:t>
       </w:r>
     </w:p>
-    <w:p>
+    <w:p ns2:paraId="6D11F6EA" ns2:textId="77777777">
       <w:pPr>
         <w:pStyle w:val="Heading2"/>
         <w:spacing w:before="340" w:after="120"/>
@@ -5581,7 +5581,7 @@
         <w:gridCol w:w="1920"/>
         <w:gridCol w:w="1920"/>
       </w:tblGrid>
-      <w:tr>
+      <w:tr ns2:paraId="38A83E5C" ns2:textId="77777777">
         <w:tblPrEx>
           <w:tblCellMar>
             <w:top w:w="0" w:type="dxa"/>
@@ -5606,7 +5606,7 @@
             </w:tcMar>
             <w:vAlign w:val="center"/>
           </w:tcPr>
-          <w:p>
+          <w:p ns2:paraId="653A5BF4" ns2:textId="77777777">
             <w:r>
               <w:rPr>
                 <w:b/>
@@ -5637,7 +5637,7 @@
             </w:tcMar>
             <w:vAlign w:val="center"/>
           </w:tcPr>
-          <w:p>
+          <w:p ns2:paraId="0AE67DAE" ns2:textId="77777777">
             <w:r>
               <w:rPr>
                 <w:b/>
@@ -5668,7 +5668,7 @@
             </w:tcMar>
             <w:vAlign w:val="center"/>
           </w:tcPr>
-          <w:p>
+          <w:p ns2:paraId="47702E1D" ns2:textId="77777777">
             <w:proofErr w:type="spellStart"/>
             <w:r>
               <w:rPr>
@@ -5711,7 +5711,7 @@
             </w:tcMar>
             <w:vAlign w:val="center"/>
           </w:tcPr>
-          <w:p>
+          <w:p ns2:paraId="35A5E753" ns2:textId="77777777">
             <w:r>
               <w:rPr>
                 <w:b/>
@@ -5725,7 +5725,7 @@
           </w:p>
         </w:tc>
       </w:tr>
-      <w:tr>
+      <w:tr ns2:paraId="34923776" ns2:textId="77777777">
         <w:tblPrEx>
           <w:tblCellMar>
             <w:top w:w="0" w:type="dxa"/>
@@ -5750,7 +5750,7 @@
             </w:tcMar>
             <w:vAlign w:val="center"/>
           </w:tcPr>
-          <w:p>
+          <w:p ns2:paraId="296D15C8" ns2:textId="77777777">
             <w:r>
               <w:rPr>
                 <w:color w:val="595959"/>
@@ -5778,7 +5778,7 @@
             </w:tcMar>
             <w:vAlign w:val="center"/>
           </w:tcPr>
-          <w:p>
+          <w:p ns2:paraId="58E962A3" ns2:textId="77777777">
             <w:pPr>
               <w:jc w:val="right"/>
             </w:pPr>
@@ -5809,7 +5809,7 @@
             </w:tcMar>
             <w:vAlign w:val="center"/>
           </w:tcPr>
-          <w:p>
+          <w:p ns2:paraId="0C79DDE9" ns2:textId="77777777">
             <w:pPr>
               <w:jc w:val="right"/>
             </w:pPr>
@@ -5840,7 +5840,7 @@
             </w:tcMar>
             <w:vAlign w:val="center"/>
           </w:tcPr>
-          <w:p>
+          <w:p ns2:paraId="3A42ED31" ns2:textId="77777777">
             <w:pPr>
               <w:jc w:val="right"/>
             </w:pPr>
@@ -5855,7 +5855,7 @@
           </w:p>
         </w:tc>
       </w:tr>
-      <w:tr>
+      <w:tr ns2:paraId="70D096C8" ns2:textId="77777777">
         <w:tblPrEx>
           <w:tblCellMar>
             <w:top w:w="0" w:type="dxa"/>
@@ -5880,7 +5880,7 @@
             </w:tcMar>
             <w:vAlign w:val="center"/>
           </w:tcPr>
-          <w:p>
+          <w:p ns2:paraId="6866685B" ns2:textId="77777777">
             <w:r>
               <w:rPr>
                 <w:color w:val="595959"/>
@@ -5908,7 +5908,7 @@
             </w:tcMar>
             <w:vAlign w:val="center"/>
           </w:tcPr>
-          <w:p>
+          <w:p ns2:paraId="3BBE57A1" ns2:textId="77777777">
             <w:pPr>
               <w:jc w:val="right"/>
             </w:pPr>
@@ -5939,7 +5939,7 @@
             </w:tcMar>
             <w:vAlign w:val="center"/>
           </w:tcPr>
-          <w:p>
+          <w:p ns2:paraId="10349CE6" ns2:textId="77777777">
             <w:pPr>
               <w:jc w:val="right"/>
             </w:pPr>
@@ -5970,7 +5970,7 @@
             </w:tcMar>
             <w:vAlign w:val="center"/>
           </w:tcPr>
-          <w:p>
+          <w:p ns2:paraId="4D73DC20" ns2:textId="77777777">
             <w:pPr>
               <w:jc w:val="right"/>
             </w:pPr>
@@ -5985,7 +5985,7 @@
           </w:p>
         </w:tc>
       </w:tr>
-      <w:tr>
+      <w:tr ns2:paraId="26D0E2BC" ns2:textId="77777777">
         <w:tblPrEx>
           <w:tblCellMar>
             <w:top w:w="0" w:type="dxa"/>
@@ -6010,7 +6010,7 @@
             </w:tcMar>
             <w:vAlign w:val="center"/>
           </w:tcPr>
-          <w:p>
+          <w:p ns2:paraId="0D356AB9" ns2:textId="77777777">
             <w:r>
               <w:rPr>
                 <w:color w:val="595959"/>
@@ -6038,7 +6038,7 @@
             </w:tcMar>
             <w:vAlign w:val="center"/>
           </w:tcPr>
-          <w:p>
+          <w:p ns2:paraId="554BFC9E" ns2:textId="77777777">
             <w:pPr>
               <w:jc w:val="right"/>
             </w:pPr>
@@ -6069,7 +6069,7 @@
             </w:tcMar>
             <w:vAlign w:val="center"/>
           </w:tcPr>
-          <w:p>
+          <w:p ns2:paraId="5F272931" ns2:textId="77777777">
             <w:pPr>
               <w:jc w:val="right"/>
             </w:pPr>
@@ -6100,7 +6100,7 @@
             </w:tcMar>
             <w:vAlign w:val="center"/>
           </w:tcPr>
-          <w:p>
+          <w:p ns2:paraId="7C6416F0" ns2:textId="77777777">
             <w:pPr>
               <w:jc w:val="right"/>
             </w:pPr>
@@ -6115,7 +6115,7 @@
           </w:p>
         </w:tc>
       </w:tr>
-      <w:tr>
+      <w:tr ns2:paraId="10C72D9F" ns2:textId="77777777">
         <w:tblPrEx>
           <w:tblCellMar>
             <w:top w:w="0" w:type="dxa"/>
@@ -6140,7 +6140,7 @@
             </w:tcMar>
             <w:vAlign w:val="center"/>
           </w:tcPr>
-          <w:p>
+          <w:p ns2:paraId="36970F5A" ns2:textId="77777777">
             <w:r>
               <w:rPr>
                 <w:color w:val="595959"/>
@@ -6168,7 +6168,7 @@
             </w:tcMar>
             <w:vAlign w:val="center"/>
           </w:tcPr>
-          <w:p>
+          <w:p ns2:paraId="5C34CD5B" ns2:textId="77777777">
             <w:pPr>
               <w:jc w:val="right"/>
             </w:pPr>
@@ -6199,7 +6199,7 @@
             </w:tcMar>
             <w:vAlign w:val="center"/>
           </w:tcPr>
-          <w:p>
+          <w:p ns2:paraId="70B6F7D8" ns2:textId="77777777">
             <w:pPr>
               <w:jc w:val="right"/>
             </w:pPr>
@@ -6230,7 +6230,7 @@
             </w:tcMar>
             <w:vAlign w:val="center"/>
           </w:tcPr>
-          <w:p>
+          <w:p ns2:paraId="364F06DD" ns2:textId="77777777">
             <w:pPr>
               <w:jc w:val="right"/>
             </w:pPr>
@@ -6245,7 +6245,7 @@
           </w:p>
         </w:tc>
       </w:tr>
-      <w:tr>
+      <w:tr ns2:paraId="776BE358" ns2:textId="77777777">
         <w:tblPrEx>
           <w:tblCellMar>
             <w:top w:w="0" w:type="dxa"/>
@@ -6270,7 +6270,7 @@
             </w:tcMar>
             <w:vAlign w:val="center"/>
           </w:tcPr>
-          <w:p>
+          <w:p ns2:paraId="442DDE5D" ns2:textId="77777777">
             <w:r>
               <w:rPr>
                 <w:color w:val="595959"/>
@@ -6298,7 +6298,7 @@
             </w:tcMar>
             <w:vAlign w:val="center"/>
           </w:tcPr>
-          <w:p>
+          <w:p ns2:paraId="2EB87911" ns2:textId="77777777">
             <w:pPr>
               <w:jc w:val="right"/>
             </w:pPr>
@@ -6329,7 +6329,7 @@
             </w:tcMar>
             <w:vAlign w:val="center"/>
           </w:tcPr>
-          <w:p>
+          <w:p ns2:paraId="76094E80" ns2:textId="77777777">
             <w:pPr>
               <w:jc w:val="right"/>
             </w:pPr>
@@ -6360,7 +6360,7 @@
             </w:tcMar>
             <w:vAlign w:val="center"/>
           </w:tcPr>
-          <w:p>
+          <w:p ns2:paraId="5E156FB9" ns2:textId="77777777">
             <w:pPr>
               <w:jc w:val="right"/>
             </w:pPr>
@@ -6375,7 +6375,7 @@
           </w:p>
         </w:tc>
       </w:tr>
-      <w:tr>
+      <w:tr ns2:paraId="6B493209" ns2:textId="77777777">
         <w:tblPrEx>
           <w:tblCellMar>
             <w:top w:w="0" w:type="dxa"/>
@@ -6400,7 +6400,7 @@
             </w:tcMar>
             <w:vAlign w:val="center"/>
           </w:tcPr>
-          <w:p>
+          <w:p ns2:paraId="00FDB0B1" ns2:textId="77777777">
             <w:r>
               <w:rPr>
                 <w:color w:val="595959"/>
@@ -6428,7 +6428,7 @@
             </w:tcMar>
             <w:vAlign w:val="center"/>
           </w:tcPr>
-          <w:p>
+          <w:p ns2:paraId="1F702462" ns2:textId="77777777">
             <w:pPr>
               <w:jc w:val="right"/>
             </w:pPr>
@@ -6459,7 +6459,7 @@
             </w:tcMar>
             <w:vAlign w:val="center"/>
           </w:tcPr>
-          <w:p>
+          <w:p ns2:paraId="2C309247" ns2:textId="77777777">
             <w:pPr>
               <w:jc w:val="right"/>
             </w:pPr>
@@ -6490,7 +6490,7 @@
             </w:tcMar>
             <w:vAlign w:val="center"/>
           </w:tcPr>
-          <w:p>
+          <w:p ns2:paraId="5E68887E" ns2:textId="77777777">
             <w:pPr>
               <w:jc w:val="right"/>
             </w:pPr>
@@ -6505,7 +6505,7 @@
           </w:p>
         </w:tc>
       </w:tr>
-      <w:tr>
+      <w:tr ns2:paraId="53CA870C" ns2:textId="77777777">
         <w:tblPrEx>
           <w:tblCellMar>
             <w:top w:w="0" w:type="dxa"/>
@@ -6530,7 +6530,7 @@
             </w:tcMar>
             <w:vAlign w:val="center"/>
           </w:tcPr>
-          <w:p>
+          <w:p ns2:paraId="721166C6" ns2:textId="77777777">
             <w:proofErr w:type="gramStart"/>
             <w:r>
               <w:rPr>
@@ -6568,7 +6568,7 @@
             </w:tcMar>
             <w:vAlign w:val="center"/>
           </w:tcPr>
-          <w:p>
+          <w:p ns2:paraId="20A09C2A" ns2:textId="77777777">
             <w:pPr>
               <w:jc w:val="right"/>
             </w:pPr>
@@ -6599,7 +6599,7 @@
             </w:tcMar>
             <w:vAlign w:val="center"/>
           </w:tcPr>
-          <w:p>
+          <w:p ns2:paraId="4C93AFD4" ns2:textId="77777777">
             <w:pPr>
               <w:jc w:val="right"/>
             </w:pPr>
@@ -6630,7 +6630,7 @@
             </w:tcMar>
             <w:vAlign w:val="center"/>
           </w:tcPr>
-          <w:p>
+          <w:p ns2:paraId="58CD372C" ns2:textId="77777777">
             <w:pPr>
               <w:jc w:val="right"/>
             </w:pPr>
@@ -6645,7 +6645,7 @@
           </w:p>
         </w:tc>
       </w:tr>
-      <w:tr>
+      <w:tr ns2:paraId="1DE7219A" ns2:textId="77777777">
         <w:tblPrEx>
           <w:tblCellMar>
             <w:top w:w="0" w:type="dxa"/>
@@ -6670,7 +6670,7 @@
             </w:tcMar>
             <w:vAlign w:val="center"/>
           </w:tcPr>
-          <w:p>
+          <w:p ns2:paraId="1BABBF10" ns2:textId="77777777">
             <w:proofErr w:type="gramStart"/>
             <w:r>
               <w:rPr>
@@ -6708,7 +6708,7 @@
             </w:tcMar>
             <w:vAlign w:val="center"/>
           </w:tcPr>
-          <w:p>
+          <w:p ns2:paraId="26CD8B47" ns2:textId="77777777">
             <w:pPr>
               <w:jc w:val="right"/>
             </w:pPr>
@@ -6739,7 +6739,7 @@
             </w:tcMar>
             <w:vAlign w:val="center"/>
           </w:tcPr>
-          <w:p>
+          <w:p ns2:paraId="3664DAB1" ns2:textId="77777777">
             <w:pPr>
               <w:jc w:val="right"/>
             </w:pPr>
@@ -6770,7 +6770,7 @@
             </w:tcMar>
             <w:vAlign w:val="center"/>
           </w:tcPr>
-          <w:p>
+          <w:p ns2:paraId="56267F1B" ns2:textId="77777777">
             <w:pPr>
               <w:jc w:val="right"/>
             </w:pPr>
@@ -6785,7 +6785,7 @@
           </w:p>
         </w:tc>
       </w:tr>
-      <w:tr>
+      <w:tr ns2:paraId="6A71E687" ns2:textId="77777777">
         <w:tblPrEx>
           <w:tblCellMar>
             <w:top w:w="0" w:type="dxa"/>
@@ -6810,7 +6810,7 @@
             </w:tcMar>
             <w:vAlign w:val="center"/>
           </w:tcPr>
-          <w:p>
+          <w:p ns2:paraId="4700CEE9" ns2:textId="77777777">
             <w:proofErr w:type="gramStart"/>
             <w:r>
               <w:rPr>
@@ -6848,7 +6848,7 @@
             </w:tcMar>
             <w:vAlign w:val="center"/>
           </w:tcPr>
-          <w:p>
+          <w:p ns2:paraId="050EA2CE" ns2:textId="77777777">
             <w:pPr>
               <w:jc w:val="right"/>
             </w:pPr>
@@ -6879,7 +6879,7 @@
             </w:tcMar>
             <w:vAlign w:val="center"/>
           </w:tcPr>
-          <w:p>
+          <w:p ns2:paraId="1D886A5E" ns2:textId="77777777">
             <w:pPr>
               <w:jc w:val="right"/>
             </w:pPr>
@@ -6910,7 +6910,7 @@
             </w:tcMar>
             <w:vAlign w:val="center"/>
           </w:tcPr>
-          <w:p>
+          <w:p ns2:paraId="15654E1A" ns2:textId="77777777">
             <w:pPr>
               <w:jc w:val="right"/>
             </w:pPr>
@@ -6926,7 +6926,7 @@
         </w:tc>
       </w:tr>
     </w:tbl>
-    <w:p>
+    <w:p ns2:paraId="2EA5B3E4" ns2:textId="77777777">
       <w:pPr>
         <w:spacing w:after="180"/>
         <w:jc w:val="center"/>
@@ -6938,7 +6938,7 @@
         <w:t>Table 5: Convergence diagnostics. All values from actual output.</w:t>
       </w:r>
     </w:p>
-    <w:p>
+    <w:p ns2:paraId="25F30C6B" ns2:textId="77777777">
       <w:pPr>
         <w:spacing w:after="100"/>
         <w:jc w:val="both"/>
@@ -6964,12 +6964,12 @@
         <w:t>2,2]) reflects slightly higher posterior autocorrelation in the exchange rate variance, consistent with the near-unit-root PLN/EUR dynamics.</w:t>
       </w:r>
     </w:p>
-    <w:p>
+    <w:p ns2:paraId="78302F7F" ns2:textId="77777777">
       <w:pPr>
         <w:spacing w:after="80"/>
       </w:pPr>
     </w:p>
-    <w:p>
+    <w:p ns2:paraId="6B9B180A" ns2:textId="77777777">
       <w:pPr>
         <w:spacing w:before="140" w:after="60"/>
         <w:jc w:val="center"/>
@@ -6979,46 +6979,46 @@
           <w:noProof/>
         </w:rPr>
         <w:drawing>
-          <wp:inline distT="0" distB="0" distL="0" distR="0" wp14:anchorId="5D3DF77E" wp14:editId="2D4C8AD8">
-            <wp:extent cx="5943600" cy="4572000"/>
-            <wp:effectExtent l="0" t="0" r="0" b="0"/>
-            <wp:docPr id="261973125" name="Picture 261973125"/>
-            <wp:cNvGraphicFramePr>
-              <a:graphicFrameLocks xmlns:a="http://schemas.openxmlformats.org/drawingml/2006/main" noChangeAspect="1"/>
-            </wp:cNvGraphicFramePr>
-            <a:graphic xmlns:a="http://schemas.openxmlformats.org/drawingml/2006/main">
-              <a:graphicData uri="http://schemas.openxmlformats.org/drawingml/2006/picture">
-                <pic:pic xmlns:pic="http://schemas.openxmlformats.org/drawingml/2006/picture">
-                  <pic:nvPicPr>
-                    <pic:cNvPr id="0" name=""/>
-                    <pic:cNvPicPr>
-                      <a:picLocks noChangeAspect="1" noChangeArrowheads="1"/>
-                    </pic:cNvPicPr>
-                  </pic:nvPicPr>
-                  <pic:blipFill>
-                    <a:blip r:embed="rId10"/>
-                    <a:srcRect/>
-                    <a:stretch>
-                      <a:fillRect/>
-                    </a:stretch>
-                  </pic:blipFill>
-                  <pic:spPr bwMode="auto">
-                    <a:xfrm>
-                      <a:off x="0" y="0"/>
-                      <a:ext cx="5943600" cy="4572000"/>
-                    </a:xfrm>
-                    <a:prstGeom prst="rect">
-                      <a:avLst/>
-                    </a:prstGeom>
-                  </pic:spPr>
-                </pic:pic>
-              </a:graphicData>
-            </a:graphic>
-          </wp:inline>
+          <ns3:inline distT="0" distB="0" distL="0" distR="0" ns4:anchorId="5D3DF77E" ns4:editId="2D4C8AD8">
+            <ns3:extent cx="5943600" cy="4572000"/>
+            <ns3:effectExtent l="0" t="0" r="0" b="0"/>
+            <ns3:docPr id="261973125" name="Picture 261973125"/>
+            <ns3:cNvGraphicFramePr>
+              <ns5:graphicFrameLocks noChangeAspect="1"/>
+            </ns3:cNvGraphicFramePr>
+            <ns5:graphic>
+              <ns5:graphicData uri="http://schemas.openxmlformats.org/drawingml/2006/picture">
+                <ns6:pic>
+                  <ns6:nvPicPr>
+                    <ns6:cNvPr id="0" name=""/>
+                    <ns6:cNvPicPr>
+                      <ns5:picLocks noChangeAspect="1" noChangeArrowheads="1"/>
+                    </ns6:cNvPicPr>
+                  </ns6:nvPicPr>
+                  <ns6:blipFill>
+                    <ns5:blip ns7:embed="rId10"/>
+                    <ns5:srcRect/>
+                    <ns5:stretch>
+                      <ns5:fillRect/>
+                    </ns5:stretch>
+                  </ns6:blipFill>
+                  <ns6:spPr bwMode="auto">
+                    <ns5:xfrm>
+                      <ns5:off x="0" y="0"/>
+                      <ns5:ext cx="5943600" cy="4572000"/>
+                    </ns5:xfrm>
+                    <ns5:prstGeom prst="rect">
+                      <ns5:avLst/>
+                    </ns5:prstGeom>
+                  </ns6:spPr>
+                </ns6:pic>
+              </ns5:graphicData>
+            </ns5:graphic>
+          </ns3:inline>
         </w:drawing>
       </w:r>
     </w:p>
-    <w:p>
+    <w:p ns2:paraId="37F6300B" ns2:textId="77777777">
       <w:pPr>
         <w:spacing w:after="160"/>
         <w:jc w:val="center"/>
@@ -7030,7 +7030,7 @@
         <w:t>Figure 4: Trace plots and ACF. ACF drops to near-zero at lag 1 for all chains.</w:t>
       </w:r>
     </w:p>
-    <w:p>
+    <w:p ns2:paraId="7A9DEBF0" ns2:textId="77777777">
       <w:pPr>
         <w:spacing w:before="140" w:after="60"/>
         <w:jc w:val="center"/>
@@ -7040,46 +7040,46 @@
           <w:noProof/>
         </w:rPr>
         <w:drawing>
-          <wp:inline distT="0" distB="0" distL="0" distR="0" wp14:anchorId="6C7753C9" wp14:editId="38D645A0">
-            <wp:extent cx="5762625" cy="2009775"/>
-            <wp:effectExtent l="0" t="0" r="0" b="0"/>
-            <wp:docPr id="1161988109" name="Picture 1161988109"/>
-            <wp:cNvGraphicFramePr>
-              <a:graphicFrameLocks xmlns:a="http://schemas.openxmlformats.org/drawingml/2006/main" noChangeAspect="1"/>
-            </wp:cNvGraphicFramePr>
-            <a:graphic xmlns:a="http://schemas.openxmlformats.org/drawingml/2006/main">
-              <a:graphicData uri="http://schemas.openxmlformats.org/drawingml/2006/picture">
-                <pic:pic xmlns:pic="http://schemas.openxmlformats.org/drawingml/2006/picture">
-                  <pic:nvPicPr>
-                    <pic:cNvPr id="0" name=""/>
-                    <pic:cNvPicPr>
-                      <a:picLocks noChangeAspect="1" noChangeArrowheads="1"/>
-                    </pic:cNvPicPr>
-                  </pic:nvPicPr>
-                  <pic:blipFill>
-                    <a:blip r:embed="rId11"/>
-                    <a:srcRect/>
-                    <a:stretch>
-                      <a:fillRect/>
-                    </a:stretch>
-                  </pic:blipFill>
-                  <pic:spPr bwMode="auto">
-                    <a:xfrm>
-                      <a:off x="0" y="0"/>
-                      <a:ext cx="5762625" cy="2009775"/>
-                    </a:xfrm>
-                    <a:prstGeom prst="rect">
-                      <a:avLst/>
-                    </a:prstGeom>
-                  </pic:spPr>
-                </pic:pic>
-              </a:graphicData>
-            </a:graphic>
-          </wp:inline>
+          <ns3:inline distT="0" distB="0" distL="0" distR="0" ns4:anchorId="6C7753C9" ns4:editId="38D645A0">
+            <ns3:extent cx="5762625" cy="2009775"/>
+            <ns3:effectExtent l="0" t="0" r="0" b="0"/>
+            <ns3:docPr id="1161988109" name="Picture 1161988109"/>
+            <ns3:cNvGraphicFramePr>
+              <ns5:graphicFrameLocks noChangeAspect="1"/>
+            </ns3:cNvGraphicFramePr>
+            <ns5:graphic>
+              <ns5:graphicData uri="http://schemas.openxmlformats.org/drawingml/2006/picture">
+                <ns6:pic>
+                  <ns6:nvPicPr>
+                    <ns6:cNvPr id="0" name=""/>
+                    <ns6:cNvPicPr>
+                      <ns5:picLocks noChangeAspect="1" noChangeArrowheads="1"/>
+                    </ns6:cNvPicPr>
+                  </ns6:nvPicPr>
+                  <ns6:blipFill>
+                    <ns5:blip ns7:embed="rId11"/>
+                    <ns5:srcRect/>
+                    <ns5:stretch>
+                      <ns5:fillRect/>
+                    </ns5:stretch>
+                  </ns6:blipFill>
+                  <ns6:spPr bwMode="auto">
+                    <ns5:xfrm>
+                      <ns5:off x="0" y="0"/>
+                      <ns5:ext cx="5762625" cy="2009775"/>
+                    </ns5:xfrm>
+                    <ns5:prstGeom prst="rect">
+                      <ns5:avLst/>
+                    </ns5:prstGeom>
+                  </ns6:spPr>
+                </ns6:pic>
+              </ns5:graphicData>
+            </ns5:graphic>
+          </ns3:inline>
         </w:drawing>
       </w:r>
     </w:p>
-    <w:p>
+    <w:p ns2:paraId="17713D24" ns2:textId="77777777">
       <w:pPr>
         <w:spacing w:after="160"/>
         <w:jc w:val="center"/>
@@ -7105,12 +7105,12 @@
         <w:t xml:space="preserve"> within first ~500 draws confirms 4,000 burn-in is conservative.</w:t>
       </w:r>
     </w:p>
-    <w:p>
+    <w:p ns2:paraId="6E4357BB" ns2:textId="77777777">
       <w:r>
         <w:br w:type="page"/>
       </w:r>
     </w:p>
-    <w:p>
+    <w:p ns2:paraId="28898FFB" ns2:textId="77777777">
       <w:pPr>
         <w:pStyle w:val="Heading2"/>
         <w:spacing w:before="340" w:after="120"/>
@@ -7120,7 +7120,7 @@
         <w:t>4.3 Structural Impulse Response Functions</w:t>
       </w:r>
     </w:p>
-    <w:p>
+    <w:p ns2:paraId="40654B27" ns2:textId="77777777">
       <w:pPr>
         <w:spacing w:after="100"/>
         <w:jc w:val="both"/>
@@ -7140,12 +7140,12 @@
         <w:t>The central result. CPI shows a mild positive blip of about +0.05 pp in months 0–3, then turns clearly negative, reaching approximately −0.3 pp by month 24 and −0.45 pp by month 36. The 68% credible band excludes zero from around month 8 onward. This is the standard contractionary transmission: a rate increase eventually reduces inflation. The initial positive blip is very mild and resolves within 5 months — it does not constitute a persistent price puzzle. The policy rate rises ~0.18 pp on impact and decays over 15 months. PLN/EUR drops on impact (PLN appreciation, ~−0.005), consistent with uncovered interest parity.</w:t>
       </w:r>
     </w:p>
-    <w:p>
+    <w:p ns2:paraId="0900EF23" ns2:textId="77777777">
       <w:pPr>
         <w:spacing w:after="80"/>
       </w:pPr>
     </w:p>
-    <w:p>
+    <w:p ns2:paraId="03E2CEA3" ns2:textId="77777777">
       <w:pPr>
         <w:spacing w:before="140" w:after="60"/>
         <w:jc w:val="center"/>
@@ -7155,46 +7155,46 @@
           <w:noProof/>
         </w:rPr>
         <w:drawing>
-          <wp:inline distT="0" distB="0" distL="0" distR="0" wp14:anchorId="0F39CB7E" wp14:editId="37405560">
-            <wp:extent cx="5943600" cy="2466975"/>
-            <wp:effectExtent l="0" t="0" r="0" b="0"/>
-            <wp:docPr id="2075919551" name="Picture 2075919551"/>
-            <wp:cNvGraphicFramePr>
-              <a:graphicFrameLocks xmlns:a="http://schemas.openxmlformats.org/drawingml/2006/main" noChangeAspect="1"/>
-            </wp:cNvGraphicFramePr>
-            <a:graphic xmlns:a="http://schemas.openxmlformats.org/drawingml/2006/main">
-              <a:graphicData uri="http://schemas.openxmlformats.org/drawingml/2006/picture">
-                <pic:pic xmlns:pic="http://schemas.openxmlformats.org/drawingml/2006/picture">
-                  <pic:nvPicPr>
-                    <pic:cNvPr id="0" name=""/>
-                    <pic:cNvPicPr>
-                      <a:picLocks noChangeAspect="1" noChangeArrowheads="1"/>
-                    </pic:cNvPicPr>
-                  </pic:nvPicPr>
-                  <pic:blipFill>
-                    <a:blip r:embed="rId12"/>
-                    <a:srcRect/>
-                    <a:stretch>
-                      <a:fillRect/>
-                    </a:stretch>
-                  </pic:blipFill>
-                  <pic:spPr bwMode="auto">
-                    <a:xfrm>
-                      <a:off x="0" y="0"/>
-                      <a:ext cx="5943600" cy="2466975"/>
-                    </a:xfrm>
-                    <a:prstGeom prst="rect">
-                      <a:avLst/>
-                    </a:prstGeom>
-                  </pic:spPr>
-                </pic:pic>
-              </a:graphicData>
-            </a:graphic>
-          </wp:inline>
+          <ns3:inline distT="0" distB="0" distL="0" distR="0" ns4:anchorId="0F39CB7E" ns4:editId="37405560">
+            <ns3:extent cx="5943600" cy="2466975"/>
+            <ns3:effectExtent l="0" t="0" r="0" b="0"/>
+            <ns3:docPr id="2075919551" name="Picture 2075919551"/>
+            <ns3:cNvGraphicFramePr>
+              <ns5:graphicFrameLocks noChangeAspect="1"/>
+            </ns3:cNvGraphicFramePr>
+            <ns5:graphic>
+              <ns5:graphicData uri="http://schemas.openxmlformats.org/drawingml/2006/picture">
+                <ns6:pic>
+                  <ns6:nvPicPr>
+                    <ns6:cNvPr id="0" name=""/>
+                    <ns6:cNvPicPr>
+                      <ns5:picLocks noChangeAspect="1" noChangeArrowheads="1"/>
+                    </ns6:cNvPicPr>
+                  </ns6:nvPicPr>
+                  <ns6:blipFill>
+                    <ns5:blip ns7:embed="rId12"/>
+                    <ns5:srcRect/>
+                    <ns5:stretch>
+                      <ns5:fillRect/>
+                    </ns5:stretch>
+                  </ns6:blipFill>
+                  <ns6:spPr bwMode="auto">
+                    <ns5:xfrm>
+                      <ns5:off x="0" y="0"/>
+                      <ns5:ext cx="5943600" cy="2466975"/>
+                    </ns5:xfrm>
+                    <ns5:prstGeom prst="rect">
+                      <ns5:avLst/>
+                    </ns5:prstGeom>
+                  </ns6:spPr>
+                </ns6:pic>
+              </ns5:graphicData>
+            </ns5:graphic>
+          </ns3:inline>
         </w:drawing>
       </w:r>
     </w:p>
-    <w:p>
+    <w:p ns2:paraId="2F1DEA2E" ns2:textId="77777777">
       <w:pPr>
         <w:spacing w:after="160"/>
         <w:jc w:val="center"/>
@@ -7206,7 +7206,7 @@
         <w:t>Figure 6: Structural IRF to a one-S.D. positive rate shock. CPI turns negative after month 3 — standard contractionary transmission. Dark: 68% CI. Light: 90% CI.</w:t>
       </w:r>
     </w:p>
-    <w:p>
+    <w:p ns2:paraId="29ADAB92" ns2:textId="77777777">
       <w:pPr>
         <w:spacing w:after="100"/>
         <w:jc w:val="both"/>
@@ -7226,12 +7226,12 @@
         <w:t>A positive CPI shock has a persistent own effect (0.7 pp on impact, decaying over 36 months). The rate responds with a lag of 1–2 months, reaching +0.25 pp by month 20 — a clear Taylor rule reaction. PLN/EUR shows modest depreciation (+0.015 by month 8), consistent with higher inflation weakening the currency.</w:t>
       </w:r>
     </w:p>
-    <w:p>
+    <w:p ns2:paraId="069BD71C" ns2:textId="77777777">
       <w:pPr>
         <w:spacing w:after="80"/>
       </w:pPr>
     </w:p>
-    <w:p>
+    <w:p ns2:paraId="23980332" ns2:textId="77777777">
       <w:pPr>
         <w:spacing w:before="140" w:after="60"/>
         <w:jc w:val="center"/>
@@ -7241,46 +7241,46 @@
           <w:noProof/>
         </w:rPr>
         <w:drawing>
-          <wp:inline distT="0" distB="0" distL="0" distR="0" wp14:anchorId="3A180AFC" wp14:editId="476A277C">
-            <wp:extent cx="5943600" cy="2466975"/>
-            <wp:effectExtent l="0" t="0" r="0" b="0"/>
-            <wp:docPr id="466176833" name="Picture 466176833"/>
-            <wp:cNvGraphicFramePr>
-              <a:graphicFrameLocks xmlns:a="http://schemas.openxmlformats.org/drawingml/2006/main" noChangeAspect="1"/>
-            </wp:cNvGraphicFramePr>
-            <a:graphic xmlns:a="http://schemas.openxmlformats.org/drawingml/2006/main">
-              <a:graphicData uri="http://schemas.openxmlformats.org/drawingml/2006/picture">
-                <pic:pic xmlns:pic="http://schemas.openxmlformats.org/drawingml/2006/picture">
-                  <pic:nvPicPr>
-                    <pic:cNvPr id="0" name=""/>
-                    <pic:cNvPicPr>
-                      <a:picLocks noChangeAspect="1" noChangeArrowheads="1"/>
-                    </pic:cNvPicPr>
-                  </pic:nvPicPr>
-                  <pic:blipFill>
-                    <a:blip r:embed="rId13"/>
-                    <a:srcRect/>
-                    <a:stretch>
-                      <a:fillRect/>
-                    </a:stretch>
-                  </pic:blipFill>
-                  <pic:spPr bwMode="auto">
-                    <a:xfrm>
-                      <a:off x="0" y="0"/>
-                      <a:ext cx="5943600" cy="2466975"/>
-                    </a:xfrm>
-                    <a:prstGeom prst="rect">
-                      <a:avLst/>
-                    </a:prstGeom>
-                  </pic:spPr>
-                </pic:pic>
-              </a:graphicData>
-            </a:graphic>
-          </wp:inline>
+          <ns3:inline distT="0" distB="0" distL="0" distR="0" ns4:anchorId="3A180AFC" ns4:editId="476A277C">
+            <ns3:extent cx="5943600" cy="2466975"/>
+            <ns3:effectExtent l="0" t="0" r="0" b="0"/>
+            <ns3:docPr id="466176833" name="Picture 466176833"/>
+            <ns3:cNvGraphicFramePr>
+              <ns5:graphicFrameLocks noChangeAspect="1"/>
+            </ns3:cNvGraphicFramePr>
+            <ns5:graphic>
+              <ns5:graphicData uri="http://schemas.openxmlformats.org/drawingml/2006/picture">
+                <ns6:pic>
+                  <ns6:nvPicPr>
+                    <ns6:cNvPr id="0" name=""/>
+                    <ns6:cNvPicPr>
+                      <ns5:picLocks noChangeAspect="1" noChangeArrowheads="1"/>
+                    </ns6:cNvPicPr>
+                  </ns6:nvPicPr>
+                  <ns6:blipFill>
+                    <ns5:blip ns7:embed="rId13"/>
+                    <ns5:srcRect/>
+                    <ns5:stretch>
+                      <ns5:fillRect/>
+                    </ns5:stretch>
+                  </ns6:blipFill>
+                  <ns6:spPr bwMode="auto">
+                    <ns5:xfrm>
+                      <ns5:off x="0" y="0"/>
+                      <ns5:ext cx="5943600" cy="2466975"/>
+                    </ns5:xfrm>
+                    <ns5:prstGeom prst="rect">
+                      <ns5:avLst/>
+                    </ns5:prstGeom>
+                  </ns6:spPr>
+                </ns6:pic>
+              </ns5:graphicData>
+            </ns5:graphic>
+          </ns3:inline>
         </w:drawing>
       </w:r>
     </w:p>
-    <w:p>
+    <w:p ns2:paraId="19BF6D95" ns2:textId="77777777">
       <w:pPr>
         <w:spacing w:after="160"/>
         <w:jc w:val="center"/>
@@ -7307,7 +7307,7 @@
         <w:t xml:space="preserve"> lag (Taylor rule). PLN depreciates.</w:t>
       </w:r>
     </w:p>
-    <w:p>
+    <w:p ns2:paraId="5FDBAD7E" ns2:textId="77777777">
       <w:pPr>
         <w:spacing w:after="100"/>
         <w:jc w:val="both"/>
@@ -7327,12 +7327,12 @@
         <w:t>A PLN depreciation shock (+0.06 on impact) produces a moderate inflationary pass-through, with the median CPI response peaking at +0.10 pp around month 15. The rate response is uncertain: the 90% CI includes both positive and negative values throughout, reflecting that the NBP’s exchange rate response is ambiguous in the sample.</w:t>
       </w:r>
     </w:p>
-    <w:p>
+    <w:p ns2:paraId="099B95BD" ns2:textId="77777777">
       <w:pPr>
         <w:spacing w:after="80"/>
       </w:pPr>
     </w:p>
-    <w:p>
+    <w:p ns2:paraId="30CC3AC5" ns2:textId="77777777">
       <w:pPr>
         <w:spacing w:before="140" w:after="60"/>
         <w:jc w:val="center"/>
@@ -7342,46 +7342,46 @@
           <w:noProof/>
         </w:rPr>
         <w:drawing>
-          <wp:inline distT="0" distB="0" distL="0" distR="0" wp14:anchorId="4E7993E4" wp14:editId="292B757C">
-            <wp:extent cx="5943600" cy="2466975"/>
-            <wp:effectExtent l="0" t="0" r="0" b="0"/>
-            <wp:docPr id="176017322" name="Picture 176017322"/>
-            <wp:cNvGraphicFramePr>
-              <a:graphicFrameLocks xmlns:a="http://schemas.openxmlformats.org/drawingml/2006/main" noChangeAspect="1"/>
-            </wp:cNvGraphicFramePr>
-            <a:graphic xmlns:a="http://schemas.openxmlformats.org/drawingml/2006/main">
-              <a:graphicData uri="http://schemas.openxmlformats.org/drawingml/2006/picture">
-                <pic:pic xmlns:pic="http://schemas.openxmlformats.org/drawingml/2006/picture">
-                  <pic:nvPicPr>
-                    <pic:cNvPr id="0" name=""/>
-                    <pic:cNvPicPr>
-                      <a:picLocks noChangeAspect="1" noChangeArrowheads="1"/>
-                    </pic:cNvPicPr>
-                  </pic:nvPicPr>
-                  <pic:blipFill>
-                    <a:blip r:embed="rId14"/>
-                    <a:srcRect/>
-                    <a:stretch>
-                      <a:fillRect/>
-                    </a:stretch>
-                  </pic:blipFill>
-                  <pic:spPr bwMode="auto">
-                    <a:xfrm>
-                      <a:off x="0" y="0"/>
-                      <a:ext cx="5943600" cy="2466975"/>
-                    </a:xfrm>
-                    <a:prstGeom prst="rect">
-                      <a:avLst/>
-                    </a:prstGeom>
-                  </pic:spPr>
-                </pic:pic>
-              </a:graphicData>
-            </a:graphic>
-          </wp:inline>
+          <ns3:inline distT="0" distB="0" distL="0" distR="0" ns4:anchorId="4E7993E4" ns4:editId="292B757C">
+            <ns3:extent cx="5943600" cy="2466975"/>
+            <ns3:effectExtent l="0" t="0" r="0" b="0"/>
+            <ns3:docPr id="176017322" name="Picture 176017322"/>
+            <ns3:cNvGraphicFramePr>
+              <ns5:graphicFrameLocks noChangeAspect="1"/>
+            </ns3:cNvGraphicFramePr>
+            <ns5:graphic>
+              <ns5:graphicData uri="http://schemas.openxmlformats.org/drawingml/2006/picture">
+                <ns6:pic>
+                  <ns6:nvPicPr>
+                    <ns6:cNvPr id="0" name=""/>
+                    <ns6:cNvPicPr>
+                      <ns5:picLocks noChangeAspect="1" noChangeArrowheads="1"/>
+                    </ns6:cNvPicPr>
+                  </ns6:nvPicPr>
+                  <ns6:blipFill>
+                    <ns5:blip ns7:embed="rId14"/>
+                    <ns5:srcRect/>
+                    <ns5:stretch>
+                      <ns5:fillRect/>
+                    </ns5:stretch>
+                  </ns6:blipFill>
+                  <ns6:spPr bwMode="auto">
+                    <ns5:xfrm>
+                      <ns5:off x="0" y="0"/>
+                      <ns5:ext cx="5943600" cy="2466975"/>
+                    </ns5:xfrm>
+                    <ns5:prstGeom prst="rect">
+                      <ns5:avLst/>
+                    </ns5:prstGeom>
+                  </ns6:spPr>
+                </ns6:pic>
+              </ns5:graphicData>
+            </ns5:graphic>
+          </ns3:inline>
         </w:drawing>
       </w:r>
     </w:p>
-    <w:p>
+    <w:p ns2:paraId="25F75981" ns2:textId="77777777">
       <w:pPr>
         <w:spacing w:after="160"/>
         <w:jc w:val="center"/>
@@ -7393,7 +7393,7 @@
         <w:t>Figure 8: IRF to PLN/EUR depreciation shock. Modest inflationary pass-through; rate response uncertain.</w:t>
       </w:r>
     </w:p>
-    <w:p>
+    <w:p ns2:paraId="1D317DB6" ns2:textId="77777777">
       <w:pPr>
         <w:pStyle w:val="Heading2"/>
         <w:spacing w:before="340" w:after="120"/>
@@ -7402,7 +7402,7 @@
         <w:t>4.4 BVAR vs Classical VAR</w:t>
       </w:r>
     </w:p>
-    <w:p>
+    <w:p ns2:paraId="0EB06C69" ns2:textId="77777777">
       <w:pPr>
         <w:spacing w:before="140" w:after="60"/>
         <w:jc w:val="center"/>
@@ -7412,46 +7412,46 @@
           <w:noProof/>
         </w:rPr>
         <w:drawing>
-          <wp:inline distT="0" distB="0" distL="0" distR="0" wp14:anchorId="0346DFDB" wp14:editId="510684D0">
-            <wp:extent cx="5943600" cy="2466975"/>
-            <wp:effectExtent l="0" t="0" r="0" b="0"/>
-            <wp:docPr id="1154188748" name="Picture 1154188748"/>
-            <wp:cNvGraphicFramePr>
-              <a:graphicFrameLocks xmlns:a="http://schemas.openxmlformats.org/drawingml/2006/main" noChangeAspect="1"/>
-            </wp:cNvGraphicFramePr>
-            <a:graphic xmlns:a="http://schemas.openxmlformats.org/drawingml/2006/main">
-              <a:graphicData uri="http://schemas.openxmlformats.org/drawingml/2006/picture">
-                <pic:pic xmlns:pic="http://schemas.openxmlformats.org/drawingml/2006/picture">
-                  <pic:nvPicPr>
-                    <pic:cNvPr id="0" name=""/>
-                    <pic:cNvPicPr>
-                      <a:picLocks noChangeAspect="1" noChangeArrowheads="1"/>
-                    </pic:cNvPicPr>
-                  </pic:nvPicPr>
-                  <pic:blipFill>
-                    <a:blip r:embed="rId15"/>
-                    <a:srcRect/>
-                    <a:stretch>
-                      <a:fillRect/>
-                    </a:stretch>
-                  </pic:blipFill>
-                  <pic:spPr bwMode="auto">
-                    <a:xfrm>
-                      <a:off x="0" y="0"/>
-                      <a:ext cx="5943600" cy="2466975"/>
-                    </a:xfrm>
-                    <a:prstGeom prst="rect">
-                      <a:avLst/>
-                    </a:prstGeom>
-                  </pic:spPr>
-                </pic:pic>
-              </a:graphicData>
-            </a:graphic>
-          </wp:inline>
+          <ns3:inline distT="0" distB="0" distL="0" distR="0" ns4:anchorId="0346DFDB" ns4:editId="510684D0">
+            <ns3:extent cx="5943600" cy="2466975"/>
+            <ns3:effectExtent l="0" t="0" r="0" b="0"/>
+            <ns3:docPr id="1154188748" name="Picture 1154188748"/>
+            <ns3:cNvGraphicFramePr>
+              <ns5:graphicFrameLocks noChangeAspect="1"/>
+            </ns3:cNvGraphicFramePr>
+            <ns5:graphic>
+              <ns5:graphicData uri="http://schemas.openxmlformats.org/drawingml/2006/picture">
+                <ns6:pic>
+                  <ns6:nvPicPr>
+                    <ns6:cNvPr id="0" name=""/>
+                    <ns6:cNvPicPr>
+                      <ns5:picLocks noChangeAspect="1" noChangeArrowheads="1"/>
+                    </ns6:cNvPicPr>
+                  </ns6:nvPicPr>
+                  <ns6:blipFill>
+                    <ns5:blip ns7:embed="rId15"/>
+                    <ns5:srcRect/>
+                    <ns5:stretch>
+                      <ns5:fillRect/>
+                    </ns5:stretch>
+                  </ns6:blipFill>
+                  <ns6:spPr bwMode="auto">
+                    <ns5:xfrm>
+                      <ns5:off x="0" y="0"/>
+                      <ns5:ext cx="5943600" cy="2466975"/>
+                    </ns5:xfrm>
+                    <ns5:prstGeom prst="rect">
+                      <ns5:avLst/>
+                    </ns5:prstGeom>
+                  </ns6:spPr>
+                </ns6:pic>
+              </ns5:graphicData>
+            </ns5:graphic>
+          </ns3:inline>
         </w:drawing>
       </w:r>
     </w:p>
-    <w:p>
+    <w:p ns2:paraId="213BC1F3" ns2:textId="77777777">
       <w:pPr>
         <w:spacing w:after="160"/>
         <w:jc w:val="center"/>
@@ -7477,7 +7477,7 @@
         <w:t xml:space="preserve"> the same negative long-run response.</w:t>
       </w:r>
     </w:p>
-    <w:p>
+    <w:p ns2:paraId="0C8C5DE6" ns2:textId="77777777">
       <w:pPr>
         <w:spacing w:after="100"/>
         <w:jc w:val="both"/>
@@ -7524,7 +7524,7 @@
         <w:t>=211.35.</w:t>
       </w:r>
     </w:p>
-    <w:p>
+    <w:p ns2:paraId="7FFAF321" ns2:textId="77777777">
       <w:pPr>
         <w:pStyle w:val="Heading2"/>
         <w:spacing w:before="340" w:after="120"/>
@@ -7533,7 +7533,7 @@
         <w:t>4.5 Forecast</w:t>
       </w:r>
     </w:p>
-    <w:p>
+    <w:p ns2:paraId="594E2A21" ns2:textId="77777777">
       <w:pPr>
         <w:spacing w:before="140" w:after="60"/>
         <w:jc w:val="center"/>
@@ -7543,46 +7543,46 @@
           <w:noProof/>
         </w:rPr>
         <w:drawing>
-          <wp:inline distT="0" distB="0" distL="0" distR="0" wp14:anchorId="0221F882" wp14:editId="6C474EA4">
-            <wp:extent cx="5762625" cy="3476625"/>
-            <wp:effectExtent l="0" t="0" r="0" b="0"/>
-            <wp:docPr id="1862835444" name="Picture 1862835444"/>
-            <wp:cNvGraphicFramePr>
-              <a:graphicFrameLocks xmlns:a="http://schemas.openxmlformats.org/drawingml/2006/main" noChangeAspect="1"/>
-            </wp:cNvGraphicFramePr>
-            <a:graphic xmlns:a="http://schemas.openxmlformats.org/drawingml/2006/main">
-              <a:graphicData uri="http://schemas.openxmlformats.org/drawingml/2006/picture">
-                <pic:pic xmlns:pic="http://schemas.openxmlformats.org/drawingml/2006/picture">
-                  <pic:nvPicPr>
-                    <pic:cNvPr id="0" name=""/>
-                    <pic:cNvPicPr>
-                      <a:picLocks noChangeAspect="1" noChangeArrowheads="1"/>
-                    </pic:cNvPicPr>
-                  </pic:nvPicPr>
-                  <pic:blipFill>
-                    <a:blip r:embed="rId16"/>
-                    <a:srcRect/>
-                    <a:stretch>
-                      <a:fillRect/>
-                    </a:stretch>
-                  </pic:blipFill>
-                  <pic:spPr bwMode="auto">
-                    <a:xfrm>
-                      <a:off x="0" y="0"/>
-                      <a:ext cx="5762625" cy="3476625"/>
-                    </a:xfrm>
-                    <a:prstGeom prst="rect">
-                      <a:avLst/>
-                    </a:prstGeom>
-                  </pic:spPr>
-                </pic:pic>
-              </a:graphicData>
-            </a:graphic>
-          </wp:inline>
+          <ns3:inline distT="0" distB="0" distL="0" distR="0" ns4:anchorId="0221F882" ns4:editId="6C474EA4">
+            <ns3:extent cx="5762625" cy="3476625"/>
+            <ns3:effectExtent l="0" t="0" r="0" b="0"/>
+            <ns3:docPr id="1862835444" name="Picture 1862835444"/>
+            <ns3:cNvGraphicFramePr>
+              <ns5:graphicFrameLocks noChangeAspect="1"/>
+            </ns3:cNvGraphicFramePr>
+            <ns5:graphic>
+              <ns5:graphicData uri="http://schemas.openxmlformats.org/drawingml/2006/picture">
+                <ns6:pic>
+                  <ns6:nvPicPr>
+                    <ns6:cNvPr id="0" name=""/>
+                    <ns6:cNvPicPr>
+                      <ns5:picLocks noChangeAspect="1" noChangeArrowheads="1"/>
+                    </ns6:cNvPicPr>
+                  </ns6:nvPicPr>
+                  <ns6:blipFill>
+                    <ns5:blip ns7:embed="rId16"/>
+                    <ns5:srcRect/>
+                    <ns5:stretch>
+                      <ns5:fillRect/>
+                    </ns5:stretch>
+                  </ns6:blipFill>
+                  <ns6:spPr bwMode="auto">
+                    <ns5:xfrm>
+                      <ns5:off x="0" y="0"/>
+                      <ns5:ext cx="5762625" cy="3476625"/>
+                    </ns5:xfrm>
+                    <ns5:prstGeom prst="rect">
+                      <ns5:avLst/>
+                    </ns5:prstGeom>
+                  </ns6:spPr>
+                </ns6:pic>
+              </ns5:graphicData>
+            </ns5:graphic>
+          </ns3:inline>
         </w:drawing>
       </w:r>
     </w:p>
-    <w:p>
+    <w:p ns2:paraId="26B3189E" ns2:textId="77777777">
       <w:pPr>
         <w:spacing w:after="160"/>
         <w:jc w:val="center"/>
@@ -7594,7 +7594,7 @@
         <w:t>Figure 10: 12-month posterior predictive forecast from April 2025. Predictive bands widen correctly over the horizon.</w:t>
       </w:r>
     </w:p>
-    <w:p>
+    <w:p ns2:paraId="3FC43D11" ns2:textId="77777777">
       <w:pPr>
         <w:spacing w:after="100"/>
         <w:jc w:val="both"/>
@@ -7606,12 +7606,12 @@
         <w:t>CPI is forecast to decline from ~5.3% toward 3–4% by early 2026. The rate edges down from ~5.7%. PLN/EUR remains stable around 4.15–4.20. The 90% bands correctly widen as near-unit-root dynamics compound forecast uncertainty.</w:t>
       </w:r>
     </w:p>
-    <w:p>
+    <w:p ns2:paraId="66677C95" ns2:textId="77777777">
       <w:r>
         <w:br w:type="page"/>
       </w:r>
     </w:p>
-    <w:p>
+    <w:p ns2:paraId="2B233DF1" ns2:textId="77777777">
       <w:pPr>
         <w:pStyle w:val="Heading1"/>
       </w:pPr>
@@ -7620,7 +7620,7 @@
         <w:t>5. Robustness Analysis</w:t>
       </w:r>
     </w:p>
-    <w:p>
+    <w:p ns2:paraId="020C09EA" ns2:textId="77777777">
       <w:pPr>
         <w:pStyle w:val="Heading2"/>
         <w:spacing w:before="340" w:after="120"/>
@@ -7629,7 +7629,7 @@
         <w:t>5.1 Identification Sensitivity</w:t>
       </w:r>
     </w:p>
-    <w:p>
+    <w:p ns2:paraId="22E514CD" ns2:textId="77777777">
       <w:pPr>
         <w:spacing w:after="100"/>
         <w:jc w:val="both"/>
@@ -7641,7 +7641,7 @@
         <w:t>Three Cholesky orderings are tested. This is the most informative robustness check because the CPI response to a rate shock is qualitatively different across orderings:</w:t>
       </w:r>
     </w:p>
-    <w:p>
+    <w:p ns2:paraId="495BB831" ns2:textId="77777777">
       <w:pPr>
         <w:pStyle w:val="ListParagraph"/>
         <w:numPr>
@@ -7657,7 +7657,7 @@
         <w:t>[CPI, Rate, FX] (baseline): CPI turns negative after month 3. Standard contractionary transmission.</w:t>
       </w:r>
     </w:p>
-    <w:p>
+    <w:p ns2:paraId="5EB617BA" ns2:textId="77777777">
       <w:pPr>
         <w:pStyle w:val="ListParagraph"/>
         <w:numPr>
@@ -7687,7 +7687,7 @@
         <w:t xml:space="preserve"> before turning negative. This ordering attributes more of the 2021–2022 inflation-rate co-movement to the rate shock, producing a genuine price puzzle.</w:t>
       </w:r>
     </w:p>
-    <w:p>
+    <w:p ns2:paraId="0AB911F1" ns2:textId="77777777">
       <w:pPr>
         <w:pStyle w:val="ListParagraph"/>
         <w:numPr>
@@ -7717,12 +7717,12 @@
         <w:t xml:space="preserve"> above. CPI starts positive (~+0.25 pp), declines gradually.</w:t>
       </w:r>
     </w:p>
-    <w:p>
+    <w:p ns2:paraId="78F1F615" ns2:textId="77777777">
       <w:pPr>
         <w:spacing w:after="80"/>
       </w:pPr>
     </w:p>
-    <w:p>
+    <w:p ns2:paraId="757A71EC" ns2:textId="77777777">
       <w:pPr>
         <w:spacing w:after="100"/>
         <w:jc w:val="both"/>
@@ -7734,12 +7734,12 @@
         <w:t>The takeaway: the baseline ordering [CPI, Rate, FX] produces the most theoretically coherent result because it correctly treats inflation as the slow-moving variable that cannot respond to rate decisions within the same month. When the rate is ordered first, the model cannot distinguish the NBP’s reactive rate hikes from autonomous policy shocks, so the co-movement during 2021–2022 appears as a price puzzle.</w:t>
       </w:r>
     </w:p>
-    <w:p>
+    <w:p ns2:paraId="757152F5" ns2:textId="77777777">
       <w:pPr>
         <w:spacing w:after="80"/>
       </w:pPr>
     </w:p>
-    <w:p>
+    <w:p ns2:paraId="17887452" ns2:textId="77777777">
       <w:pPr>
         <w:spacing w:before="140" w:after="60"/>
         <w:jc w:val="center"/>
@@ -7749,46 +7749,46 @@
           <w:noProof/>
         </w:rPr>
         <w:drawing>
-          <wp:inline distT="0" distB="0" distL="0" distR="0" wp14:anchorId="06A0EB5C" wp14:editId="6671E3B0">
-            <wp:extent cx="5943600" cy="2286000"/>
-            <wp:effectExtent l="0" t="0" r="0" b="0"/>
-            <wp:docPr id="700786046" name="Picture 700786046"/>
-            <wp:cNvGraphicFramePr>
-              <a:graphicFrameLocks xmlns:a="http://schemas.openxmlformats.org/drawingml/2006/main" noChangeAspect="1"/>
-            </wp:cNvGraphicFramePr>
-            <a:graphic xmlns:a="http://schemas.openxmlformats.org/drawingml/2006/main">
-              <a:graphicData uri="http://schemas.openxmlformats.org/drawingml/2006/picture">
-                <pic:pic xmlns:pic="http://schemas.openxmlformats.org/drawingml/2006/picture">
-                  <pic:nvPicPr>
-                    <pic:cNvPr id="0" name=""/>
-                    <pic:cNvPicPr>
-                      <a:picLocks noChangeAspect="1" noChangeArrowheads="1"/>
-                    </pic:cNvPicPr>
-                  </pic:nvPicPr>
-                  <pic:blipFill>
-                    <a:blip r:embed="rId17"/>
-                    <a:srcRect/>
-                    <a:stretch>
-                      <a:fillRect/>
-                    </a:stretch>
-                  </pic:blipFill>
-                  <pic:spPr bwMode="auto">
-                    <a:xfrm>
-                      <a:off x="0" y="0"/>
-                      <a:ext cx="5943600" cy="2286000"/>
-                    </a:xfrm>
-                    <a:prstGeom prst="rect">
-                      <a:avLst/>
-                    </a:prstGeom>
-                  </pic:spPr>
-                </pic:pic>
-              </a:graphicData>
-            </a:graphic>
-          </wp:inline>
+          <ns3:inline distT="0" distB="0" distL="0" distR="0" ns4:anchorId="06A0EB5C" ns4:editId="6671E3B0">
+            <ns3:extent cx="5943600" cy="2286000"/>
+            <ns3:effectExtent l="0" t="0" r="0" b="0"/>
+            <ns3:docPr id="700786046" name="Picture 700786046"/>
+            <ns3:cNvGraphicFramePr>
+              <ns5:graphicFrameLocks noChangeAspect="1"/>
+            </ns3:cNvGraphicFramePr>
+            <ns5:graphic>
+              <ns5:graphicData uri="http://schemas.openxmlformats.org/drawingml/2006/picture">
+                <ns6:pic>
+                  <ns6:nvPicPr>
+                    <ns6:cNvPr id="0" name=""/>
+                    <ns6:cNvPicPr>
+                      <ns5:picLocks noChangeAspect="1" noChangeArrowheads="1"/>
+                    </ns6:cNvPicPr>
+                  </ns6:nvPicPr>
+                  <ns6:blipFill>
+                    <ns5:blip ns7:embed="rId17"/>
+                    <ns5:srcRect/>
+                    <ns5:stretch>
+                      <ns5:fillRect/>
+                    </ns5:stretch>
+                  </ns6:blipFill>
+                  <ns6:spPr bwMode="auto">
+                    <ns5:xfrm>
+                      <ns5:off x="0" y="0"/>
+                      <ns5:ext cx="5943600" cy="2286000"/>
+                    </ns5:xfrm>
+                    <ns5:prstGeom prst="rect">
+                      <ns5:avLst/>
+                    </ns5:prstGeom>
+                  </ns6:spPr>
+                </ns6:pic>
+              </ns5:graphicData>
+            </ns5:graphic>
+          </ns3:inline>
         </w:drawing>
       </w:r>
     </w:p>
-    <w:p>
+    <w:p ns2:paraId="68E3363E" ns2:textId="77777777">
       <w:pPr>
         <w:spacing w:after="160"/>
         <w:jc w:val="center"/>
@@ -7800,7 +7800,7 @@
         <w:t>Figure 11: CPI response to rate shock under three Cholesky orderings. The baseline [CPI, Rate, FX] produces a negative response; alternative orderings show a positive response that reverses at longer horizons.</w:t>
       </w:r>
     </w:p>
-    <w:p>
+    <w:p ns2:paraId="6FA4DB29" ns2:textId="77777777">
       <w:pPr>
         <w:pStyle w:val="Heading2"/>
         <w:spacing w:before="340" w:after="120"/>
@@ -7809,7 +7809,7 @@
         <w:t>5.2 Prior Sensitivity</w:t>
       </w:r>
     </w:p>
-    <w:p>
+    <w:p ns2:paraId="2278B0A7" ns2:textId="77777777">
       <w:pPr>
         <w:spacing w:after="100"/>
         <w:jc w:val="both"/>
@@ -7835,7 +7835,7 @@
         <w:t>0.10, 0.20, 0.50}:</w:t>
       </w:r>
     </w:p>
-    <w:p>
+    <w:p ns2:paraId="0B1DBAC8" ns2:textId="77777777">
       <w:pPr>
         <w:pStyle w:val="ListParagraph"/>
         <w:numPr>
@@ -7851,7 +7851,7 @@
         <w:t>λ₁=0.10 (tight): CPI goes negative immediately — no positive blip at all. The shrinkage fully suppresses the initial co-movement.</w:t>
       </w:r>
     </w:p>
-    <w:p>
+    <w:p ns2:paraId="0E934268" ns2:textId="77777777">
       <w:pPr>
         <w:pStyle w:val="ListParagraph"/>
         <w:numPr>
@@ -7881,7 +7881,7 @@
         <w:t xml:space="preserve"> without dominating the data.</w:t>
       </w:r>
     </w:p>
-    <w:p>
+    <w:p ns2:paraId="426748A7" ns2:textId="77777777">
       <w:pPr>
         <w:pStyle w:val="ListParagraph"/>
         <w:numPr>
@@ -7911,7 +7911,7 @@
         <w:t>, where the cross-variable dynamics are less constrained.</w:t>
       </w:r>
     </w:p>
-    <w:p>
+    <w:p ns2:paraId="0F5B0357" ns2:textId="77777777">
       <w:pPr>
         <w:spacing w:after="100"/>
         <w:jc w:val="both"/>
@@ -7923,12 +7923,12 @@
         <w:t>All three calibrations converge to the same contractionary long-run response, confirming this is a robust data feature, not a prior artefact.</w:t>
       </w:r>
     </w:p>
-    <w:p>
+    <w:p ns2:paraId="319BDDD3" ns2:textId="77777777">
       <w:pPr>
         <w:spacing w:after="80"/>
       </w:pPr>
     </w:p>
-    <w:p>
+    <w:p ns2:paraId="4399AA7D" ns2:textId="77777777">
       <w:pPr>
         <w:spacing w:before="140" w:after="60"/>
         <w:jc w:val="center"/>
@@ -7938,46 +7938,46 @@
           <w:noProof/>
         </w:rPr>
         <w:drawing>
-          <wp:inline distT="0" distB="0" distL="0" distR="0" wp14:anchorId="3A38CAC7" wp14:editId="2FC80717">
-            <wp:extent cx="5667375" cy="2743200"/>
-            <wp:effectExtent l="0" t="0" r="0" b="0"/>
-            <wp:docPr id="1890068702" name="Picture 1890068702"/>
-            <wp:cNvGraphicFramePr>
-              <a:graphicFrameLocks xmlns:a="http://schemas.openxmlformats.org/drawingml/2006/main" noChangeAspect="1"/>
-            </wp:cNvGraphicFramePr>
-            <a:graphic xmlns:a="http://schemas.openxmlformats.org/drawingml/2006/main">
-              <a:graphicData uri="http://schemas.openxmlformats.org/drawingml/2006/picture">
-                <pic:pic xmlns:pic="http://schemas.openxmlformats.org/drawingml/2006/picture">
-                  <pic:nvPicPr>
-                    <pic:cNvPr id="0" name=""/>
-                    <pic:cNvPicPr>
-                      <a:picLocks noChangeAspect="1" noChangeArrowheads="1"/>
-                    </pic:cNvPicPr>
-                  </pic:nvPicPr>
-                  <pic:blipFill>
-                    <a:blip r:embed="rId18"/>
-                    <a:srcRect/>
-                    <a:stretch>
-                      <a:fillRect/>
-                    </a:stretch>
-                  </pic:blipFill>
-                  <pic:spPr bwMode="auto">
-                    <a:xfrm>
-                      <a:off x="0" y="0"/>
-                      <a:ext cx="5667375" cy="2743200"/>
-                    </a:xfrm>
-                    <a:prstGeom prst="rect">
-                      <a:avLst/>
-                    </a:prstGeom>
-                  </pic:spPr>
-                </pic:pic>
-              </a:graphicData>
-            </a:graphic>
-          </wp:inline>
+          <ns3:inline distT="0" distB="0" distL="0" distR="0" ns4:anchorId="3A38CAC7" ns4:editId="2FC80717">
+            <ns3:extent cx="5667375" cy="2743200"/>
+            <ns3:effectExtent l="0" t="0" r="0" b="0"/>
+            <ns3:docPr id="1890068702" name="Picture 1890068702"/>
+            <ns3:cNvGraphicFramePr>
+              <ns5:graphicFrameLocks noChangeAspect="1"/>
+            </ns3:cNvGraphicFramePr>
+            <ns5:graphic>
+              <ns5:graphicData uri="http://schemas.openxmlformats.org/drawingml/2006/picture">
+                <ns6:pic>
+                  <ns6:nvPicPr>
+                    <ns6:cNvPr id="0" name=""/>
+                    <ns6:cNvPicPr>
+                      <ns5:picLocks noChangeAspect="1" noChangeArrowheads="1"/>
+                    </ns6:cNvPicPr>
+                  </ns6:nvPicPr>
+                  <ns6:blipFill>
+                    <ns5:blip ns7:embed="rId18"/>
+                    <ns5:srcRect/>
+                    <ns5:stretch>
+                      <ns5:fillRect/>
+                    </ns5:stretch>
+                  </ns6:blipFill>
+                  <ns6:spPr bwMode="auto">
+                    <ns5:xfrm>
+                      <ns5:off x="0" y="0"/>
+                      <ns5:ext cx="5667375" cy="2743200"/>
+                    </ns5:xfrm>
+                    <ns5:prstGeom prst="rect">
+                      <ns5:avLst/>
+                    </ns5:prstGeom>
+                  </ns6:spPr>
+                </ns6:pic>
+              </ns5:graphicData>
+            </ns5:graphic>
+          </ns3:inline>
         </w:drawing>
       </w:r>
     </w:p>
-    <w:p>
+    <w:p ns2:paraId="792E5825" ns2:textId="77777777">
       <w:pPr>
         <w:spacing w:after="160"/>
         <w:jc w:val="center"/>
@@ -7989,7 +7989,7 @@
         <w:t>Figure 12: CPI response to rate shock under three prior tightness values. Tighter prior (λ₁=0.10, grey) eliminates initial positive blip; looser (λ₁=0.50, dark) amplifies it. All converge to negative response.</w:t>
       </w:r>
     </w:p>
-    <w:p>
+    <w:p ns2:paraId="01F88260" ns2:textId="77777777">
       <w:pPr>
         <w:pStyle w:val="Heading2"/>
         <w:spacing w:before="340" w:after="120"/>
@@ -7998,7 +7998,7 @@
         <w:t>5.3 First-Difference Robustness</w:t>
       </w:r>
     </w:p>
-    <w:p>
+    <w:p ns2:paraId="35AE44F6" ns2:textId="77777777">
       <w:pPr>
         <w:spacing w:after="100"/>
         <w:jc w:val="both"/>
@@ -8038,7 +8038,7 @@
         <w:t>1) evidence:</w:t>
       </w:r>
     </w:p>
-    <w:p>
+    <w:p ns2:paraId="79987206" ns2:textId="77777777">
       <w:pPr>
         <w:pStyle w:val="ListParagraph"/>
         <w:numPr>
@@ -8054,7 +8054,7 @@
         <w:t>The levels-based IRF (baseline) shows a clear negative CPI response with wide 80% credible bands.</w:t>
       </w:r>
     </w:p>
-    <w:p>
+    <w:p ns2:paraId="685B4D28" ns2:textId="77777777">
       <w:pPr>
         <w:pStyle w:val="ListParagraph"/>
         <w:numPr>
@@ -8070,7 +8070,7 @@
         <w:t>The first-difference IRF shows a very small positive blip that essentially returns to zero — a much weaker but directionally consistent effect with narrow bands.</w:t>
       </w:r>
     </w:p>
-    <w:p>
+    <w:p ns2:paraId="11ABF6D6" ns2:textId="77777777">
       <w:pPr>
         <w:spacing w:after="100"/>
         <w:jc w:val="both"/>
@@ -8082,12 +8082,12 @@
         <w:t>The weaker response in differences is expected: differencing removes the level information that drives the cumulative contractionary effect. The sign patterns are preserved.</w:t>
       </w:r>
     </w:p>
-    <w:p>
+    <w:p ns2:paraId="0D293A86" ns2:textId="77777777">
       <w:pPr>
         <w:spacing w:after="80"/>
       </w:pPr>
     </w:p>
-    <w:p>
+    <w:p ns2:paraId="01B6E4CD" ns2:textId="77777777">
       <w:pPr>
         <w:spacing w:before="140" w:after="60"/>
         <w:jc w:val="center"/>
@@ -8097,46 +8097,46 @@
           <w:noProof/>
         </w:rPr>
         <w:drawing>
-          <wp:inline distT="0" distB="0" distL="0" distR="0" wp14:anchorId="27C4CC2F" wp14:editId="43D9DDD9">
-            <wp:extent cx="5667375" cy="2743200"/>
-            <wp:effectExtent l="0" t="0" r="0" b="0"/>
-            <wp:docPr id="1001781087" name="Picture 1001781087"/>
-            <wp:cNvGraphicFramePr>
-              <a:graphicFrameLocks xmlns:a="http://schemas.openxmlformats.org/drawingml/2006/main" noChangeAspect="1"/>
-            </wp:cNvGraphicFramePr>
-            <a:graphic xmlns:a="http://schemas.openxmlformats.org/drawingml/2006/main">
-              <a:graphicData uri="http://schemas.openxmlformats.org/drawingml/2006/picture">
-                <pic:pic xmlns:pic="http://schemas.openxmlformats.org/drawingml/2006/picture">
-                  <pic:nvPicPr>
-                    <pic:cNvPr id="0" name=""/>
-                    <pic:cNvPicPr>
-                      <a:picLocks noChangeAspect="1" noChangeArrowheads="1"/>
-                    </pic:cNvPicPr>
-                  </pic:nvPicPr>
-                  <pic:blipFill>
-                    <a:blip r:embed="rId19"/>
-                    <a:srcRect/>
-                    <a:stretch>
-                      <a:fillRect/>
-                    </a:stretch>
-                  </pic:blipFill>
-                  <pic:spPr bwMode="auto">
-                    <a:xfrm>
-                      <a:off x="0" y="0"/>
-                      <a:ext cx="5667375" cy="2743200"/>
-                    </a:xfrm>
-                    <a:prstGeom prst="rect">
-                      <a:avLst/>
-                    </a:prstGeom>
-                  </pic:spPr>
-                </pic:pic>
-              </a:graphicData>
-            </a:graphic>
-          </wp:inline>
+          <ns3:inline distT="0" distB="0" distL="0" distR="0" ns4:anchorId="27C4CC2F" ns4:editId="43D9DDD9">
+            <ns3:extent cx="5667375" cy="2743200"/>
+            <ns3:effectExtent l="0" t="0" r="0" b="0"/>
+            <ns3:docPr id="1001781087" name="Picture 1001781087"/>
+            <ns3:cNvGraphicFramePr>
+              <ns5:graphicFrameLocks noChangeAspect="1"/>
+            </ns3:cNvGraphicFramePr>
+            <ns5:graphic>
+              <ns5:graphicData uri="http://schemas.openxmlformats.org/drawingml/2006/picture">
+                <ns6:pic>
+                  <ns6:nvPicPr>
+                    <ns6:cNvPr id="0" name=""/>
+                    <ns6:cNvPicPr>
+                      <ns5:picLocks noChangeAspect="1" noChangeArrowheads="1"/>
+                    </ns6:cNvPicPr>
+                  </ns6:nvPicPr>
+                  <ns6:blipFill>
+                    <ns5:blip ns7:embed="rId19"/>
+                    <ns5:srcRect/>
+                    <ns5:stretch>
+                      <ns5:fillRect/>
+                    </ns5:stretch>
+                  </ns6:blipFill>
+                  <ns6:spPr bwMode="auto">
+                    <ns5:xfrm>
+                      <ns5:off x="0" y="0"/>
+                      <ns5:ext cx="5667375" cy="2743200"/>
+                    </ns5:xfrm>
+                    <ns5:prstGeom prst="rect">
+                      <ns5:avLst/>
+                    </ns5:prstGeom>
+                  </ns6:spPr>
+                </ns6:pic>
+              </ns5:graphicData>
+            </ns5:graphic>
+          </ns3:inline>
         </w:drawing>
       </w:r>
     </w:p>
-    <w:p>
+    <w:p ns2:paraId="60742FD6" ns2:textId="77777777">
       <w:pPr>
         <w:spacing w:after="160"/>
         <w:jc w:val="center"/>
@@ -8177,12 +8177,12 @@
         <w:t>.</w:t>
       </w:r>
     </w:p>
-    <w:p>
+    <w:p ns2:paraId="645C1AC1" ns2:textId="77777777">
       <w:r>
         <w:br w:type="page"/>
       </w:r>
     </w:p>
-    <w:p>
+    <w:p ns2:paraId="3C7B522E" ns2:textId="77777777">
       <w:pPr>
         <w:pStyle w:val="Heading1"/>
       </w:pPr>
@@ -8191,7 +8191,7 @@
         <w:t>6. Conclusion</w:t>
       </w:r>
     </w:p>
-    <w:p>
+    <w:p ns2:paraId="620C700C" ns2:textId="77777777">
       <w:pPr>
         <w:spacing w:after="100"/>
         <w:jc w:val="both"/>
@@ -8231,7 +8231,7 @@
         <w:t xml:space="preserve"> Z| &lt; 1.96). The main empirical findings:</w:t>
       </w:r>
     </w:p>
-    <w:p>
+    <w:p ns2:paraId="12336530" ns2:textId="77777777">
       <w:pPr>
         <w:pStyle w:val="ListParagraph"/>
         <w:numPr>
@@ -8261,7 +8261,7 @@
         <w:t xml:space="preserve"> impact.</w:t>
       </w:r>
     </w:p>
-    <w:p>
+    <w:p ns2:paraId="58BD9A55" ns2:textId="77777777">
       <w:pPr>
         <w:pStyle w:val="ListParagraph"/>
         <w:numPr>
@@ -8291,7 +8291,7 @@
         <w:t xml:space="preserve"> coherent result; alternative orderings show a genuine price puzzle that persists for 15 months before reversing.</w:t>
       </w:r>
     </w:p>
-    <w:p>
+    <w:p ns2:paraId="7CD69C0C" ns2:textId="77777777">
       <w:pPr>
         <w:pStyle w:val="ListParagraph"/>
         <w:numPr>
@@ -8307,7 +8307,7 @@
         <w:t>Minnesota shrinkage actively shapes results: tighter priors (λ₁=0.10) eliminate the initial positive CPI blip entirely; looser priors (λ₁=0.50) amplify it. All calibrations agree on the long-run contractionary direction.</w:t>
       </w:r>
     </w:p>
-    <w:p>
+    <w:p ns2:paraId="502D6B26" ns2:textId="77777777">
       <w:pPr>
         <w:pStyle w:val="ListParagraph"/>
         <w:numPr>
@@ -8337,12 +8337,12 @@
         <w:t xml:space="preserve"> at work.</w:t>
       </w:r>
     </w:p>
-    <w:p>
+    <w:p ns2:paraId="79747521" ns2:textId="77777777">
       <w:r>
         <w:br w:type="page"/>
       </w:r>
     </w:p>
-    <w:p>
+    <w:p ns2:paraId="03BE7B83" ns2:textId="77777777">
       <w:pPr>
         <w:pStyle w:val="Heading1"/>
       </w:pPr>
@@ -8351,7 +8351,7 @@
         <w:t>References</w:t>
       </w:r>
     </w:p>
-    <w:p>
+    <w:p ns2:paraId="3D950245" ns2:textId="77777777">
       <w:pPr>
         <w:spacing w:after="100"/>
         <w:jc w:val="both"/>
@@ -8377,7 +8377,7 @@
         <w:t>, R., &amp; Sims, C. (1984). Forecasting and conditional projection using realistic prior distributions. Econometric Reviews, 3(1), 1–100.</w:t>
       </w:r>
     </w:p>
-    <w:p>
+    <w:p ns2:paraId="1884D4F4" ns2:textId="77777777">
       <w:pPr>
         <w:spacing w:after="100"/>
         <w:jc w:val="both"/>
@@ -8403,7 +8403,7 @@
         <w:t>]. ECB Data Portal.</w:t>
       </w:r>
     </w:p>
-    <w:p>
+    <w:p ns2:paraId="3AEA5DD9" ns2:textId="77777777">
       <w:pPr>
         <w:spacing w:after="100"/>
         <w:jc w:val="both"/>
@@ -8415,7 +8415,7 @@
         <w:t>Geweke, J. (1992). Evaluating the accuracy of sampling-based approaches. Bayesian Statistics 4. Oxford.</w:t>
       </w:r>
     </w:p>
-    <w:p>
+    <w:p ns2:paraId="4C1F1311" ns2:textId="77777777">
       <w:pPr>
         <w:spacing w:after="100"/>
         <w:jc w:val="both"/>
@@ -8427,7 +8427,7 @@
         <w:t>Hamilton, J. D. (1994). Time Series Analysis. Princeton University Press.</w:t>
       </w:r>
     </w:p>
-    <w:p>
+    <w:p ns2:paraId="5F2B46B8" ns2:textId="77777777">
       <w:pPr>
         <w:spacing w:after="100"/>
         <w:jc w:val="both"/>
@@ -8446,7 +8446,7 @@
         <w:t>State-Space Models with Regime Switching. MIT Press.</w:t>
       </w:r>
     </w:p>
-    <w:p>
+    <w:p ns2:paraId="1A44EEFE" ns2:textId="77777777">
       <w:pPr>
         <w:spacing w:after="100"/>
         <w:jc w:val="both"/>
@@ -8458,7 +8458,7 @@
         <w:t>Koop, G. (2003). Bayesian Econometrics. Wiley.</w:t>
       </w:r>
     </w:p>
-    <w:p>
+    <w:p ns2:paraId="61913A32" ns2:textId="77777777">
       <w:pPr>
         <w:spacing w:after="100"/>
         <w:jc w:val="both"/>
@@ -8484,7 +8484,7 @@
         <w:t>, D. (2010). Bayesian multivariate time series methods. Foundations and Trends in Econometrics, 3(4), 267–358.</w:t>
       </w:r>
     </w:p>
-    <w:p>
+    <w:p ns2:paraId="1B728BA6" ns2:textId="77777777">
       <w:pPr>
         <w:spacing w:after="100"/>
         <w:jc w:val="both"/>
@@ -8504,7 +8504,7 @@
         <w:t>, R. B. (1986). Forecasting with Bayesian vector autoregressions. Journal of Business &amp; Economic Statistics, 4(1), 25–38.</w:t>
       </w:r>
     </w:p>
-    <w:p>
+    <w:p ns2:paraId="14641FF9" ns2:textId="77777777">
       <w:pPr>
         <w:spacing w:after="100"/>
         <w:jc w:val="both"/>
@@ -8516,7 +8516,7 @@
         <w:t>OECD (2025). CPI: Total for Poland [POLCPIALLMINMEI]. FRED.</w:t>
       </w:r>
     </w:p>
-    <w:p>
+    <w:p ns2:paraId="602B3D91" ns2:textId="77777777">
       <w:pPr>
         <w:spacing w:after="100"/>
         <w:jc w:val="both"/>
@@ -8528,7 +8528,7 @@
         <w:t>OECD (2025). Short-Term Interest Rate for Poland [IRSTCI01PLM156N]. FRED.</w:t>
       </w:r>
     </w:p>
-    <w:p>
+    <w:p ns2:paraId="75E5C0A9" ns2:textId="77777777">
       <w:pPr>
         <w:spacing w:after="100"/>
         <w:jc w:val="both"/>
@@ -8554,7 +8554,7 @@
         <w:t>, 48(1), 1–48.</w:t>
       </w:r>
     </w:p>
-    <w:p>
+    <w:p ns2:paraId="0A1CFD32" ns2:textId="77777777">
       <w:pPr>
         <w:spacing w:after="100"/>
         <w:jc w:val="both"/>
@@ -8566,7 +8566,7 @@
         <w:t>Sims, C. A. (1992). Interpreting the macroeconomic time series facts. European Economic Review, 36(5), 975–1000.</w:t>
       </w:r>
     </w:p>
-    <w:p>
+    <w:p ns2:paraId="152A2CED" ns2:textId="77777777">
       <w:pPr>
         <w:spacing w:after="100"/>
         <w:jc w:val="both"/>
@@ -8592,7 +8592,7 @@
         <w:t>, 58(1), 113–144.</w:t>
       </w:r>
     </w:p>
-    <w:p>
+    <w:p ns2:paraId="0E0A37B3" ns2:textId="77777777">
       <w:pPr>
         <w:spacing w:after="100"/>
         <w:jc w:val="both"/>
@@ -8604,12 +8604,12 @@
         <w:t>Zellner, A. (1971). An Introduction to Bayesian Inference in Econometrics. Wiley.</w:t>
       </w:r>
     </w:p>
-    <w:p>
+    <w:p ns2:paraId="390778F6" ns2:textId="77777777">
       <w:r>
         <w:br w:type="page"/>
       </w:r>
     </w:p>
-    <w:p>
+    <w:p ns2:paraId="6EB85247" ns2:textId="77777777">
       <w:pPr>
         <w:pStyle w:val="Heading1"/>
       </w:pPr>
@@ -8618,7 +8618,7 @@
         <w:t>Appendix: Additional IRF Comparisons</w:t>
       </w:r>
     </w:p>
-    <w:p>
+    <w:p ns2:paraId="303950A0" ns2:textId="77777777">
       <w:pPr>
         <w:spacing w:before="140" w:after="60"/>
         <w:jc w:val="center"/>
@@ -8628,46 +8628,46 @@
           <w:noProof/>
         </w:rPr>
         <w:drawing>
-          <wp:inline distT="0" distB="0" distL="0" distR="0" wp14:anchorId="18209F35" wp14:editId="368871C5">
-            <wp:extent cx="5943600" cy="2466975"/>
-            <wp:effectExtent l="0" t="0" r="0" b="0"/>
-            <wp:docPr id="1571440424" name="Picture 1571440424"/>
-            <wp:cNvGraphicFramePr>
-              <a:graphicFrameLocks xmlns:a="http://schemas.openxmlformats.org/drawingml/2006/main" noChangeAspect="1"/>
-            </wp:cNvGraphicFramePr>
-            <a:graphic xmlns:a="http://schemas.openxmlformats.org/drawingml/2006/main">
-              <a:graphicData uri="http://schemas.openxmlformats.org/drawingml/2006/picture">
-                <pic:pic xmlns:pic="http://schemas.openxmlformats.org/drawingml/2006/picture">
-                  <pic:nvPicPr>
-                    <pic:cNvPr id="0" name=""/>
-                    <pic:cNvPicPr>
-                      <a:picLocks noChangeAspect="1" noChangeArrowheads="1"/>
-                    </pic:cNvPicPr>
-                  </pic:nvPicPr>
-                  <pic:blipFill>
-                    <a:blip r:embed="rId20"/>
-                    <a:srcRect/>
-                    <a:stretch>
-                      <a:fillRect/>
-                    </a:stretch>
-                  </pic:blipFill>
-                  <pic:spPr bwMode="auto">
-                    <a:xfrm>
-                      <a:off x="0" y="0"/>
-                      <a:ext cx="5943600" cy="2466975"/>
-                    </a:xfrm>
-                    <a:prstGeom prst="rect">
-                      <a:avLst/>
-                    </a:prstGeom>
-                  </pic:spPr>
-                </pic:pic>
-              </a:graphicData>
-            </a:graphic>
-          </wp:inline>
+          <ns3:inline distT="0" distB="0" distL="0" distR="0" ns4:anchorId="18209F35" ns4:editId="368871C5">
+            <ns3:extent cx="5943600" cy="2466975"/>
+            <ns3:effectExtent l="0" t="0" r="0" b="0"/>
+            <ns3:docPr id="1571440424" name="Picture 1571440424"/>
+            <ns3:cNvGraphicFramePr>
+              <ns5:graphicFrameLocks noChangeAspect="1"/>
+            </ns3:cNvGraphicFramePr>
+            <ns5:graphic>
+              <ns5:graphicData uri="http://schemas.openxmlformats.org/drawingml/2006/picture">
+                <ns6:pic>
+                  <ns6:nvPicPr>
+                    <ns6:cNvPr id="0" name=""/>
+                    <ns6:cNvPicPr>
+                      <ns5:picLocks noChangeAspect="1" noChangeArrowheads="1"/>
+                    </ns6:cNvPicPr>
+                  </ns6:nvPicPr>
+                  <ns6:blipFill>
+                    <ns5:blip ns7:embed="rId20"/>
+                    <ns5:srcRect/>
+                    <ns5:stretch>
+                      <ns5:fillRect/>
+                    </ns5:stretch>
+                  </ns6:blipFill>
+                  <ns6:spPr bwMode="auto">
+                    <ns5:xfrm>
+                      <ns5:off x="0" y="0"/>
+                      <ns5:ext cx="5943600" cy="2466975"/>
+                    </ns5:xfrm>
+                    <ns5:prstGeom prst="rect">
+                      <ns5:avLst/>
+                    </ns5:prstGeom>
+                  </ns6:spPr>
+                </ns6:pic>
+              </ns5:graphicData>
+            </ns5:graphic>
+          </ns3:inline>
         </w:drawing>
       </w:r>
     </w:p>
-    <w:p>
+    <w:p ns2:paraId="21D6D415" ns2:textId="77777777">
       <w:pPr>
         <w:spacing w:after="160"/>
         <w:jc w:val="center"/>
@@ -8679,7 +8679,7 @@
         <w:t>Figure A.1: BVAR vs Classical VAR — CPI shock.</w:t>
       </w:r>
     </w:p>
-    <w:p>
+    <w:p ns2:paraId="4992E7D2" ns2:textId="77777777">
       <w:pPr>
         <w:spacing w:before="140" w:after="60"/>
         <w:jc w:val="center"/>
@@ -8689,46 +8689,46 @@
           <w:noProof/>
         </w:rPr>
         <w:drawing>
-          <wp:inline distT="0" distB="0" distL="0" distR="0" wp14:anchorId="2B817147" wp14:editId="1FE37B0D">
-            <wp:extent cx="5943600" cy="2466975"/>
-            <wp:effectExtent l="0" t="0" r="0" b="0"/>
-            <wp:docPr id="1555165682" name="Picture 1555165682"/>
-            <wp:cNvGraphicFramePr>
-              <a:graphicFrameLocks xmlns:a="http://schemas.openxmlformats.org/drawingml/2006/main" noChangeAspect="1"/>
-            </wp:cNvGraphicFramePr>
-            <a:graphic xmlns:a="http://schemas.openxmlformats.org/drawingml/2006/main">
-              <a:graphicData uri="http://schemas.openxmlformats.org/drawingml/2006/picture">
-                <pic:pic xmlns:pic="http://schemas.openxmlformats.org/drawingml/2006/picture">
-                  <pic:nvPicPr>
-                    <pic:cNvPr id="0" name=""/>
-                    <pic:cNvPicPr>
-                      <a:picLocks noChangeAspect="1" noChangeArrowheads="1"/>
-                    </pic:cNvPicPr>
-                  </pic:nvPicPr>
-                  <pic:blipFill>
-                    <a:blip r:embed="rId21"/>
-                    <a:srcRect/>
-                    <a:stretch>
-                      <a:fillRect/>
-                    </a:stretch>
-                  </pic:blipFill>
-                  <pic:spPr bwMode="auto">
-                    <a:xfrm>
-                      <a:off x="0" y="0"/>
-                      <a:ext cx="5943600" cy="2466975"/>
-                    </a:xfrm>
-                    <a:prstGeom prst="rect">
-                      <a:avLst/>
-                    </a:prstGeom>
-                  </pic:spPr>
-                </pic:pic>
-              </a:graphicData>
-            </a:graphic>
-          </wp:inline>
+          <ns3:inline distT="0" distB="0" distL="0" distR="0" ns4:anchorId="2B817147" ns4:editId="1FE37B0D">
+            <ns3:extent cx="5943600" cy="2466975"/>
+            <ns3:effectExtent l="0" t="0" r="0" b="0"/>
+            <ns3:docPr id="1555165682" name="Picture 1555165682"/>
+            <ns3:cNvGraphicFramePr>
+              <ns5:graphicFrameLocks noChangeAspect="1"/>
+            </ns3:cNvGraphicFramePr>
+            <ns5:graphic>
+              <ns5:graphicData uri="http://schemas.openxmlformats.org/drawingml/2006/picture">
+                <ns6:pic>
+                  <ns6:nvPicPr>
+                    <ns6:cNvPr id="0" name=""/>
+                    <ns6:cNvPicPr>
+                      <ns5:picLocks noChangeAspect="1" noChangeArrowheads="1"/>
+                    </ns6:cNvPicPr>
+                  </ns6:nvPicPr>
+                  <ns6:blipFill>
+                    <ns5:blip ns7:embed="rId21"/>
+                    <ns5:srcRect/>
+                    <ns5:stretch>
+                      <ns5:fillRect/>
+                    </ns5:stretch>
+                  </ns6:blipFill>
+                  <ns6:spPr bwMode="auto">
+                    <ns5:xfrm>
+                      <ns5:off x="0" y="0"/>
+                      <ns5:ext cx="5943600" cy="2466975"/>
+                    </ns5:xfrm>
+                    <ns5:prstGeom prst="rect">
+                      <ns5:avLst/>
+                    </ns5:prstGeom>
+                  </ns6:spPr>
+                </ns6:pic>
+              </ns5:graphicData>
+            </ns5:graphic>
+          </ns3:inline>
         </w:drawing>
       </w:r>
     </w:p>
-    <w:p>
+    <w:p ns2:paraId="23D433FD" ns2:textId="77777777">
       <w:pPr>
         <w:spacing w:after="160"/>
         <w:jc w:val="center"/>
@@ -8741,8 +8741,8 @@
       </w:r>
     </w:p>
     <w:sectPr>
-      <w:headerReference w:type="default" r:id="rId22"/>
-      <w:footerReference w:type="default" r:id="rId23"/>
+      <w:headerReference w:type="default" ns7:id="rId22"/>
+      <w:footerReference w:type="default" ns7:id="rId23"/>
       <w:pgSz w:w="12240" w:h="15840"/>
       <w:pgMar w:top="1440" w:right="1260" w:bottom="1440" w:left="1260" w:header="708" w:footer="708" w:gutter="0"/>
       <w:cols w:space="720"/>

</xml_diff>

<commit_message>
Refresh BVAR posterior summaries
Co-authored-by: Otajon Yuldashev <OXT6655@users.noreply.github.com>
</commit_message>
<xml_diff>
--- a/bvar_final_report.docx
+++ b/bvar_final_report.docx
@@ -302,7 +302,7 @@
         <w:rPr>
           <w:color w:val="595959"/>
         </w:rPr>
-        <w:t>0.10, 0.20, 0.50} shows that tighter priors eliminate the initial positive CPI blip entirely; (2) identification sensitivity across three Cholesky orderings reveals that the ordering choice substantially affects the CPI response direction; (3) first-difference estimation preserves the sign patterns. All MCMC chains converge well (ESS 6,876–8,000; all |</w:t>
+        <w:t>0.10, 0.20, 0.50} shows that tighter priors eliminate the initial positive CPI blip entirely; (2) identification sensitivity across three Cholesky orderings reveals that the ordering choice substantially affects the CPI response direction; (3) first-difference estimation preserves the sign patterns. All MCMC chains converge well (ESS 6,893–8,000; all |</w:t>
       </w:r>
       <w:proofErr w:type="spellStart"/>
       <w:r>
@@ -4767,7 +4767,7 @@
                 <w:sz w:val="20"/>
                 <w:szCs w:val="20"/>
               </w:rPr>
-              <w:t>0.0423</w:t>
+              <w:t>0.0415</w:t>
             </w:r>
           </w:p>
         </w:tc>
@@ -4798,7 +4798,7 @@
                 <w:sz w:val="20"/>
                 <w:szCs w:val="20"/>
               </w:rPr>
-              <w:t>1.013</w:t>
+              <w:t>1.014</w:t>
             </w:r>
           </w:p>
         </w:tc>
@@ -4829,7 +4829,7 @@
                 <w:sz w:val="20"/>
                 <w:szCs w:val="20"/>
               </w:rPr>
-              <w:t>1.152</w:t>
+              <w:t>1.151</w:t>
             </w:r>
           </w:p>
         </w:tc>
@@ -4891,7 +4891,7 @@
                 <w:sz w:val="20"/>
                 <w:szCs w:val="20"/>
               </w:rPr>
-              <w:t>−0.359</w:t>
+              <w:t>−0.358</w:t>
             </w:r>
           </w:p>
         </w:tc>
@@ -4990,7 +4990,7 @@
                 <w:sz w:val="20"/>
                 <w:szCs w:val="20"/>
               </w:rPr>
-              <w:t>0.0389</w:t>
+              <w:t>0.0382</w:t>
             </w:r>
           </w:p>
         </w:tc>
@@ -5021,7 +5021,7 @@
                 <w:sz w:val="20"/>
                 <w:szCs w:val="20"/>
               </w:rPr>
-              <w:t>1.071</w:t>
+              <w:t>1.073</w:t>
             </w:r>
           </w:p>
         </w:tc>
@@ -5052,7 +5052,7 @@
                 <w:sz w:val="20"/>
                 <w:szCs w:val="20"/>
               </w:rPr>
-              <w:t>1.199</w:t>
+              <w:t>1.198</w:t>
             </w:r>
           </w:p>
         </w:tc>
@@ -5114,7 +5114,7 @@
                 <w:sz w:val="20"/>
                 <w:szCs w:val="20"/>
               </w:rPr>
-              <w:t>1.221</w:t>
+              <w:t>1.220</w:t>
             </w:r>
           </w:p>
         </w:tc>
@@ -5213,7 +5213,7 @@
                 <w:sz w:val="20"/>
                 <w:szCs w:val="20"/>
               </w:rPr>
-              <w:t>0.0495</w:t>
+              <w:t>0.0485</w:t>
             </w:r>
           </w:p>
         </w:tc>
@@ -5244,7 +5244,7 @@
                 <w:sz w:val="20"/>
                 <w:szCs w:val="20"/>
               </w:rPr>
-              <w:t>0.844</w:t>
+              <w:t>0.846</w:t>
             </w:r>
           </w:p>
         </w:tc>
@@ -5275,7 +5275,7 @@
                 <w:sz w:val="20"/>
                 <w:szCs w:val="20"/>
               </w:rPr>
-              <w:t>1.007</w:t>
+              <w:t>1.005</w:t>
             </w:r>
           </w:p>
         </w:tc>
@@ -5306,7 +5306,7 @@
                 <w:sz w:val="20"/>
                 <w:szCs w:val="20"/>
               </w:rPr>
-              <w:t>7419</w:t>
+              <w:t>7417</w:t>
             </w:r>
           </w:p>
         </w:tc>
@@ -5337,7 +5337,7 @@
                 <w:sz w:val="20"/>
                 <w:szCs w:val="20"/>
               </w:rPr>
-              <w:t>1.493</w:t>
+              <w:t>1.496</w:t>
             </w:r>
           </w:p>
         </w:tc>
@@ -5392,7 +5392,7 @@
         <w:rPr>
           <w:color w:val="595959"/>
         </w:rPr>
-        <w:t xml:space="preserve"> statistically significant inflation-reactive monetary policy. Rate-to-CPI: 0.2491 ([0.026, 0.465]), positive reflecting the inflation-rate co-movement of 2021–2022. PLN/EUR own-lag: 0.9259 ([0.844, 1.007</w:t>
+        <w:t xml:space="preserve"> statistically significant inflation-reactive monetary policy. Rate-to-CPI: 0.2491 ([0.030, 0.461]), positive reflecting the inflation-rate co-movement of 2021–2022. PLN/EUR own-lag: 0.9259 ([0.846, 1.005</w:t>
       </w:r>
       <w:proofErr w:type="gramStart"/>
       <w:r>
@@ -5418,7 +5418,7 @@
         <w:rPr>
           <w:color w:val="595959"/>
         </w:rPr>
-        <w:t>Posterior mean Σ: [[0.394, 0.045, 0.003], [0.045, 0.033, −0.001], [0.003, −0.001, 0.004]]. The CPI-rate correlation is positive (0.247 from classical VAR), reflecting co-movement during the inflation surge. The rate-FX correlation is negative (−0.165), consistent with rate hikes attracting capital and strengthening PLN.</w:t>
+        <w:t>Posterior mean Σ: [[0.379, 0.043, 0.003], [0.043, 0.032, −0.001], [0.003, −0.001, 0.003]]. The CPI-rate correlation is positive (0.247 from classical VAR), reflecting co-movement during the inflation surge. The rate-FX correlation is negative (−0.165), consistent with rate hikes attracting capital and strengthening PLN.</w:t>
       </w:r>
     </w:p>
     <w:p ns2:paraId="53117035" ns2:textId="77777777">
@@ -5819,7 +5819,7 @@
                 <w:sz w:val="20"/>
                 <w:szCs w:val="20"/>
               </w:rPr>
-              <w:t>0.741</w:t>
+              <w:t>0.743</w:t>
             </w:r>
           </w:p>
         </w:tc>
@@ -5949,7 +5949,7 @@
                 <w:sz w:val="20"/>
                 <w:szCs w:val="20"/>
               </w:rPr>
-              <w:t>−0.359</w:t>
+              <w:t>−0.358</w:t>
             </w:r>
           </w:p>
         </w:tc>
@@ -6079,7 +6079,7 @@
                 <w:sz w:val="20"/>
                 <w:szCs w:val="20"/>
               </w:rPr>
-              <w:t>−1.763</w:t>
+              <w:t>−1.765</w:t>
             </w:r>
           </w:p>
         </w:tc>
@@ -6209,7 +6209,7 @@
                 <w:sz w:val="20"/>
                 <w:szCs w:val="20"/>
               </w:rPr>
-              <w:t>1.221</w:t>
+              <w:t>1.220</w:t>
             </w:r>
           </w:p>
         </w:tc>
@@ -6339,7 +6339,7 @@
                 <w:sz w:val="20"/>
                 <w:szCs w:val="20"/>
               </w:rPr>
-              <w:t>−0.923</w:t>
+              <w:t>−0.925</w:t>
             </w:r>
           </w:p>
         </w:tc>
@@ -6438,7 +6438,7 @@
                 <w:sz w:val="20"/>
                 <w:szCs w:val="20"/>
               </w:rPr>
-              <w:t>7419</w:t>
+              <w:t>7417</w:t>
             </w:r>
           </w:p>
         </w:tc>
@@ -6469,7 +6469,7 @@
                 <w:sz w:val="20"/>
                 <w:szCs w:val="20"/>
               </w:rPr>
-              <w:t>1.493</w:t>
+              <w:t>1.496</w:t>
             </w:r>
           </w:p>
         </w:tc>
@@ -6578,7 +6578,7 @@
                 <w:sz w:val="20"/>
                 <w:szCs w:val="20"/>
               </w:rPr>
-              <w:t>7373</w:t>
+              <w:t>7392</w:t>
             </w:r>
           </w:p>
         </w:tc>
@@ -6609,7 +6609,7 @@
                 <w:sz w:val="20"/>
                 <w:szCs w:val="20"/>
               </w:rPr>
-              <w:t>−0.129</w:t>
+              <w:t>−0.136</w:t>
             </w:r>
           </w:p>
         </w:tc>
@@ -6718,7 +6718,7 @@
                 <w:sz w:val="20"/>
                 <w:szCs w:val="20"/>
               </w:rPr>
-              <w:t>7599</w:t>
+              <w:t>7620</w:t>
             </w:r>
           </w:p>
         </w:tc>
@@ -6749,7 +6749,7 @@
                 <w:sz w:val="20"/>
                 <w:szCs w:val="20"/>
               </w:rPr>
-              <w:t>−0.088</w:t>
+              <w:t>−0.087</w:t>
             </w:r>
           </w:p>
         </w:tc>
@@ -6858,7 +6858,7 @@
                 <w:sz w:val="20"/>
                 <w:szCs w:val="20"/>
               </w:rPr>
-              <w:t>6876</w:t>
+              <w:t>6893</w:t>
             </w:r>
           </w:p>
         </w:tc>
@@ -6889,7 +6889,7 @@
                 <w:sz w:val="20"/>
                 <w:szCs w:val="20"/>
               </w:rPr>
-              <w:t>−0.627</w:t>
+              <w:t>−0.628</w:t>
             </w:r>
           </w:p>
         </w:tc>
@@ -6947,7 +6947,7 @@
         <w:rPr>
           <w:color w:val="595959"/>
         </w:rPr>
-        <w:t xml:space="preserve">ESS ranges from 6,876 to 8,000. The lowest ESS (6,876 for </w:t>
+        <w:t xml:space="preserve">ESS ranges from 6,893 to 8,000. The lowest ESS (6,893 for </w:t>
       </w:r>
       <w:proofErr w:type="gramStart"/>
       <w:r>
@@ -8214,7 +8214,7 @@
         <w:rPr>
           <w:color w:val="595959"/>
         </w:rPr>
-        <w:t>2) for Poland using real official data. The Gibbs sampler, coded from scratch using Matrix-Normal and Inverse-Wishart full conditionals, converges well (ESS: 6,876–8,000; all |</w:t>
+        <w:t>2) for Poland using real official data. The Gibbs sampler, coded from scratch using Matrix-Normal and Inverse-Wishart full conditionals, converges well (ESS: 6,893–8,000; all |</w:t>
       </w:r>
       <w:proofErr w:type="spellStart"/>
       <w:r>

</xml_diff>

<commit_message>
Regenerate BVAR outputs with corrected sampler
Co-authored-by: Otajon Yuldashev <OXT6655@users.noreply.github.com>
</commit_message>
<xml_diff>
--- a/bvar_final_report.docx
+++ b/bvar_final_report.docx
@@ -302,7 +302,7 @@
         <w:rPr>
           <w:color w:val="595959"/>
         </w:rPr>
-        <w:t>0.10, 0.20, 0.50} shows that tighter priors eliminate the initial positive CPI blip entirely; (2) identification sensitivity across three Cholesky orderings reveals that the ordering choice substantially affects the CPI response direction; (3) first-difference estimation preserves the sign patterns. All MCMC chains converge well (ESS 6,876–8,000; all |</w:t>
+        <w:t>0.10, 0.20, 0.50} shows that tighter priors eliminate the initial positive CPI blip entirely; (2) identification sensitivity across three Cholesky orderings reveals that the ordering choice substantially affects the CPI response direction; (3) first-difference estimation preserves the sign patterns. All MCMC chains converge well (ESS 6,893–8,000; all |</w:t>
       </w:r>
       <w:proofErr w:type="spellStart"/>
       <w:r>
@@ -4767,7 +4767,7 @@
                 <w:sz w:val="20"/>
                 <w:szCs w:val="20"/>
               </w:rPr>
-              <w:t>0.0423</w:t>
+              <w:t>0.0415</w:t>
             </w:r>
           </w:p>
         </w:tc>
@@ -4798,7 +4798,7 @@
                 <w:sz w:val="20"/>
                 <w:szCs w:val="20"/>
               </w:rPr>
-              <w:t>1.013</w:t>
+              <w:t>1.014</w:t>
             </w:r>
           </w:p>
         </w:tc>
@@ -4829,7 +4829,7 @@
                 <w:sz w:val="20"/>
                 <w:szCs w:val="20"/>
               </w:rPr>
-              <w:t>1.152</w:t>
+              <w:t>1.151</w:t>
             </w:r>
           </w:p>
         </w:tc>
@@ -4891,7 +4891,7 @@
                 <w:sz w:val="20"/>
                 <w:szCs w:val="20"/>
               </w:rPr>
-              <w:t>−0.359</w:t>
+              <w:t>−0.358</w:t>
             </w:r>
           </w:p>
         </w:tc>
@@ -4990,7 +4990,7 @@
                 <w:sz w:val="20"/>
                 <w:szCs w:val="20"/>
               </w:rPr>
-              <w:t>0.0389</w:t>
+              <w:t>0.0382</w:t>
             </w:r>
           </w:p>
         </w:tc>
@@ -5021,7 +5021,7 @@
                 <w:sz w:val="20"/>
                 <w:szCs w:val="20"/>
               </w:rPr>
-              <w:t>1.071</w:t>
+              <w:t>1.073</w:t>
             </w:r>
           </w:p>
         </w:tc>
@@ -5052,7 +5052,7 @@
                 <w:sz w:val="20"/>
                 <w:szCs w:val="20"/>
               </w:rPr>
-              <w:t>1.199</w:t>
+              <w:t>1.198</w:t>
             </w:r>
           </w:p>
         </w:tc>
@@ -5114,7 +5114,7 @@
                 <w:sz w:val="20"/>
                 <w:szCs w:val="20"/>
               </w:rPr>
-              <w:t>1.221</w:t>
+              <w:t>1.220</w:t>
             </w:r>
           </w:p>
         </w:tc>
@@ -5213,7 +5213,7 @@
                 <w:sz w:val="20"/>
                 <w:szCs w:val="20"/>
               </w:rPr>
-              <w:t>0.0495</w:t>
+              <w:t>0.0485</w:t>
             </w:r>
           </w:p>
         </w:tc>
@@ -5244,7 +5244,7 @@
                 <w:sz w:val="20"/>
                 <w:szCs w:val="20"/>
               </w:rPr>
-              <w:t>0.844</w:t>
+              <w:t>0.846</w:t>
             </w:r>
           </w:p>
         </w:tc>
@@ -5275,7 +5275,7 @@
                 <w:sz w:val="20"/>
                 <w:szCs w:val="20"/>
               </w:rPr>
-              <w:t>1.007</w:t>
+              <w:t>1.005</w:t>
             </w:r>
           </w:p>
         </w:tc>
@@ -5306,7 +5306,7 @@
                 <w:sz w:val="20"/>
                 <w:szCs w:val="20"/>
               </w:rPr>
-              <w:t>7419</w:t>
+              <w:t>7417</w:t>
             </w:r>
           </w:p>
         </w:tc>
@@ -5337,7 +5337,7 @@
                 <w:sz w:val="20"/>
                 <w:szCs w:val="20"/>
               </w:rPr>
-              <w:t>1.493</w:t>
+              <w:t>1.496</w:t>
             </w:r>
           </w:p>
         </w:tc>
@@ -5392,7 +5392,7 @@
         <w:rPr>
           <w:color w:val="595959"/>
         </w:rPr>
-        <w:t xml:space="preserve"> statistically significant inflation-reactive monetary policy. Rate-to-CPI: 0.2491 ([0.026, 0.465]), positive reflecting the inflation-rate co-movement of 2021–2022. PLN/EUR own-lag: 0.9259 ([0.844, 1.007</w:t>
+        <w:t xml:space="preserve"> statistically significant inflation-reactive monetary policy. Rate-to-CPI: 0.2491 ([0.030, 0.461]), positive reflecting the inflation-rate co-movement of 2021–2022. PLN/EUR own-lag: 0.9259 ([0.846, 1.005</w:t>
       </w:r>
       <w:proofErr w:type="gramStart"/>
       <w:r>
@@ -5418,7 +5418,7 @@
         <w:rPr>
           <w:color w:val="595959"/>
         </w:rPr>
-        <w:t>Posterior mean Σ: [[0.394, 0.045, 0.003], [0.045, 0.033, −0.001], [0.003, −0.001, 0.004]]. The CPI-rate correlation is positive (0.247 from classical VAR), reflecting co-movement during the inflation surge. The rate-FX correlation is negative (−0.165), consistent with rate hikes attracting capital and strengthening PLN.</w:t>
+        <w:t>Posterior mean Σ: [[0.379, 0.043, 0.003], [0.043, 0.032, −0.001], [0.003, −0.001, 0.003]]. The CPI-rate correlation is positive (0.247 from classical VAR), reflecting co-movement during the inflation surge. The rate-FX correlation is negative (−0.165), consistent with rate hikes attracting capital and strengthening PLN.</w:t>
       </w:r>
     </w:p>
     <w:p ns2:paraId="53117035" ns2:textId="77777777">
@@ -5546,7 +5546,7 @@
         <w:rPr>
           <w:color w:val="595959"/>
         </w:rPr>
-        <w:t>Figure 3: Marginal posteriors. Own lag-1 (top), residual variance (middle), constants (bottom). Values from actual posterior output: CPI mean=0.394, Rate mean=0.033, FX mean=0.004.</w:t>
+        <w:t>Figure 3: Marginal posteriors. Own lag-1 (top), residual variance (middle), constants (bottom). Values from actual posterior output: CPI mean=0.379, Rate mean=0.032, FX mean=0.003.</w:t>
       </w:r>
     </w:p>
     <w:p ns2:paraId="6D11F6EA" ns2:textId="77777777">
@@ -5819,7 +5819,7 @@
                 <w:sz w:val="20"/>
                 <w:szCs w:val="20"/>
               </w:rPr>
-              <w:t>0.741</w:t>
+              <w:t>0.743</w:t>
             </w:r>
           </w:p>
         </w:tc>
@@ -5949,7 +5949,7 @@
                 <w:sz w:val="20"/>
                 <w:szCs w:val="20"/>
               </w:rPr>
-              <w:t>−0.359</w:t>
+              <w:t>−0.358</w:t>
             </w:r>
           </w:p>
         </w:tc>
@@ -6079,7 +6079,7 @@
                 <w:sz w:val="20"/>
                 <w:szCs w:val="20"/>
               </w:rPr>
-              <w:t>−1.763</w:t>
+              <w:t>−1.765</w:t>
             </w:r>
           </w:p>
         </w:tc>
@@ -6209,7 +6209,7 @@
                 <w:sz w:val="20"/>
                 <w:szCs w:val="20"/>
               </w:rPr>
-              <w:t>1.221</w:t>
+              <w:t>1.220</w:t>
             </w:r>
           </w:p>
         </w:tc>
@@ -6339,7 +6339,7 @@
                 <w:sz w:val="20"/>
                 <w:szCs w:val="20"/>
               </w:rPr>
-              <w:t>−0.923</w:t>
+              <w:t>−0.925</w:t>
             </w:r>
           </w:p>
         </w:tc>
@@ -6438,7 +6438,7 @@
                 <w:sz w:val="20"/>
                 <w:szCs w:val="20"/>
               </w:rPr>
-              <w:t>7419</w:t>
+              <w:t>7417</w:t>
             </w:r>
           </w:p>
         </w:tc>
@@ -6469,7 +6469,7 @@
                 <w:sz w:val="20"/>
                 <w:szCs w:val="20"/>
               </w:rPr>
-              <w:t>1.493</w:t>
+              <w:t>1.496</w:t>
             </w:r>
           </w:p>
         </w:tc>
@@ -6578,7 +6578,7 @@
                 <w:sz w:val="20"/>
                 <w:szCs w:val="20"/>
               </w:rPr>
-              <w:t>7373</w:t>
+              <w:t>7392</w:t>
             </w:r>
           </w:p>
         </w:tc>
@@ -6609,7 +6609,7 @@
                 <w:sz w:val="20"/>
                 <w:szCs w:val="20"/>
               </w:rPr>
-              <w:t>−0.129</w:t>
+              <w:t>−0.136</w:t>
             </w:r>
           </w:p>
         </w:tc>
@@ -6718,7 +6718,7 @@
                 <w:sz w:val="20"/>
                 <w:szCs w:val="20"/>
               </w:rPr>
-              <w:t>7599</w:t>
+              <w:t>7620</w:t>
             </w:r>
           </w:p>
         </w:tc>
@@ -6749,7 +6749,7 @@
                 <w:sz w:val="20"/>
                 <w:szCs w:val="20"/>
               </w:rPr>
-              <w:t>−0.088</w:t>
+              <w:t>−0.087</w:t>
             </w:r>
           </w:p>
         </w:tc>
@@ -6858,7 +6858,7 @@
                 <w:sz w:val="20"/>
                 <w:szCs w:val="20"/>
               </w:rPr>
-              <w:t>6876</w:t>
+              <w:t>6893</w:t>
             </w:r>
           </w:p>
         </w:tc>
@@ -6889,7 +6889,7 @@
                 <w:sz w:val="20"/>
                 <w:szCs w:val="20"/>
               </w:rPr>
-              <w:t>−0.627</w:t>
+              <w:t>−0.628</w:t>
             </w:r>
           </w:p>
         </w:tc>
@@ -6947,7 +6947,7 @@
         <w:rPr>
           <w:color w:val="595959"/>
         </w:rPr>
-        <w:t xml:space="preserve">ESS ranges from 6,876 to 8,000. The lowest ESS (6,876 for </w:t>
+        <w:t xml:space="preserve">ESS ranges from 6,893 to 8,000. The lowest ESS (6,893 for </w:t>
       </w:r>
       <w:proofErr w:type="gramStart"/>
       <w:r>
@@ -8214,7 +8214,7 @@
         <w:rPr>
           <w:color w:val="595959"/>
         </w:rPr>
-        <w:t>2) for Poland using real official data. The Gibbs sampler, coded from scratch using Matrix-Normal and Inverse-Wishart full conditionals, converges well (ESS: 6,876–8,000; all |</w:t>
+        <w:t>2) for Poland using real official data. The Gibbs sampler, coded from scratch using Matrix-Normal and Inverse-Wishart full conditionals, converges well (ESS: 6,893–8,000; all |</w:t>
       </w:r>
       <w:proofErr w:type="spellStart"/>
       <w:r>

</xml_diff>